<commit_message>
feat(f-0066): default SOP/batch templates render approval section
</commit_message>
<xml_diff>
--- a/backend/app/services/documents/templates/batch_record_default.docx
+++ b/backend/app/services/documents/templates/batch_record_default.docx
@@ -2,6 +2,21 @@
 <file path=word/document.xml><?xml version="1.0" encoding="utf-8"?>
 <w:document xmlns:wpc="http://schemas.microsoft.com/office/word/2010/wordprocessingCanvas" xmlns:mo="http://schemas.microsoft.com/office/mac/office/2008/main" xmlns:mc="http://schemas.openxmlformats.org/markup-compatibility/2006" xmlns:mv="urn:schemas-microsoft-com:mac:vml" xmlns:o="urn:schemas-microsoft-com:office:office" xmlns:r="http://schemas.openxmlformats.org/officeDocument/2006/relationships" xmlns:m="http://schemas.openxmlformats.org/officeDocument/2006/math" xmlns:v="urn:schemas-microsoft-com:vml" xmlns:wp14="http://schemas.microsoft.com/office/word/2010/wordprocessingDrawing" xmlns:wp="http://schemas.openxmlformats.org/drawingml/2006/wordprocessingDrawing" xmlns:w10="urn:schemas-microsoft-com:office:word" xmlns:w="http://schemas.openxmlformats.org/wordprocessingml/2006/main" xmlns:w14="http://schemas.microsoft.com/office/word/2010/wordml" xmlns:wpg="http://schemas.microsoft.com/office/word/2010/wordprocessingGroup" xmlns:wpi="http://schemas.microsoft.com/office/word/2010/wordprocessingInk" xmlns:wne="http://schemas.microsoft.com/office/word/2006/wordml" xmlns:wps="http://schemas.microsoft.com/office/word/2010/wordprocessingShape" mc:Ignorable="w14 wp14">
   <w:body>
+    <w:p>
+      <w:r>
+        <w:t>{%p if unapproved_warning %}</w:t>
+      </w:r>
+    </w:p>
+    <w:p>
+      <w:r>
+        <w:t>⚠ UNAPPROVED — DRAFT ONLY</w:t>
+      </w:r>
+    </w:p>
+    <w:p>
+      <w:r>
+        <w:t>{%p endif %}</w:t>
+      </w:r>
+    </w:p>
     <w:p>
       <w:pPr>
         <w:spacing w:after="240"/>
@@ -979,6 +994,96 @@
         <w:t>{%p endif %}</w:t>
       </w:r>
     </w:p>
+    <w:p>
+      <w:r>
+        <w:t>{# BR-APPROVAL-BLOCK #}</w:t>
+      </w:r>
+    </w:p>
+    <w:p>
+      <w:r>
+        <w:t>{%p if approval %}</w:t>
+      </w:r>
+    </w:p>
+    <w:p>
+      <w:r>
+        <w:t>Approval &amp; Signatures</w:t>
+      </w:r>
+    </w:p>
+    <w:p>
+      <w:r>
+        <w:t>Approver: {{ approval.approver_name }} &lt;{{ approval.approver_email }}&gt;</w:t>
+      </w:r>
+    </w:p>
+    <w:p>
+      <w:r>
+        <w:t>Approved at: {{ approval.approved_at }}    Protocol version: {{ approval.protocol_version }}</w:t>
+      </w:r>
+    </w:p>
+    <w:p>
+      <w:r>
+        <w:t>{%p if approval.signature_statement %}</w:t>
+      </w:r>
+    </w:p>
+    <w:p>
+      <w:r>
+        <w:t>Statement: {{ approval.signature_statement }}</w:t>
+      </w:r>
+    </w:p>
+    <w:p>
+      <w:r>
+        <w:t>{%p endif %}</w:t>
+      </w:r>
+    </w:p>
+    <w:p>
+      <w:r>
+        <w:t>{%p if approval.signature_image %}</w:t>
+      </w:r>
+    </w:p>
+    <w:p>
+      <w:r>
+        <w:t>Signature: {{ approval.signature_image }}</w:t>
+      </w:r>
+    </w:p>
+    <w:p>
+      <w:r>
+        <w:t>{%p endif %}</w:t>
+      </w:r>
+    </w:p>
+    <w:p>
+      <w:r>
+        <w:t>{%p endif %}</w:t>
+      </w:r>
+    </w:p>
+    <w:p>
+      <w:r>
+        <w:t>{%p if approval_history %}</w:t>
+      </w:r>
+    </w:p>
+    <w:p>
+      <w:r>
+        <w:t>Approval History</w:t>
+      </w:r>
+    </w:p>
+    <w:p>
+      <w:r>
+        <w:t>{%p for ev in approval_history %}</w:t>
+      </w:r>
+    </w:p>
+    <w:p>
+      <w:r>
+        <w:t>{{ ev.created_at }} — {{ ev.action }} by {{ ev.actor_name }}</w:t>
+      </w:r>
+    </w:p>
+    <w:p>
+      <w:r>
+        <w:t>{%p endfor %}</w:t>
+      </w:r>
+    </w:p>
+    <w:p>
+      <w:r>
+        <w:t>{%p endif %}</w:t>
+      </w:r>
+    </w:p>
     <w:sectPr>
       <w:headerReference w:type="default" r:id="rId9"/>
       <w:footerReference w:type="default" r:id="rId10"/>

</xml_diff>

<commit_message>
feat(templates): production-grade BatchRecord.docx system default (QA-0008)
- Adds `build_batch_record()` to scripts/build_default_templates.py with
  header, title block, Equipment Used (gated), Procedure Execution (9-col,
  role-based + flat branches, reviewer/time conditional cells), Deviations,
  Notes, Figures, Attachments, and Approval sections.
- Regenerates backend/app/services/documents/templates/batch_record_default.docx.
- Adds TDD smoke test: test_br_template_smoke.py verifies all section headings,
  conditional columns (Reviewer, Scheduled), Lot Number, and no leaked tokens.

Co-Authored-By: Claude Sonnet 4.6 <noreply@anthropic.com>
</commit_message>
<xml_diff>
--- a/backend/app/services/documents/templates/batch_record_default.docx
+++ b/backend/app/services/documents/templates/batch_record_default.docx
@@ -4,207 +4,124 @@
   <w:body>
     <w:p>
       <w:r>
-        <w:t>{%p if unapproved_warning %}</w:t>
+        <w:rPr>
+          <w:b/>
+          <w:sz w:val="36"/>
+        </w:rPr>
+        <w:t>{{ protocol_name }} — Batch Record</w:t>
       </w:r>
     </w:p>
     <w:p>
       <w:r>
-        <w:t>⚠ UNAPPROVED — DRAFT ONLY</w:t>
+        <w:rPr>
+          <w:b w:val="0"/>
+          <w:sz w:val="22"/>
+        </w:rPr>
+        <w:t>{% if lot_number %}Lot Number: {{ lot_number }}{% endif %}</w:t>
       </w:r>
     </w:p>
     <w:p>
       <w:r>
-        <w:t>{%p endif %}</w:t>
+        <w:rPr>
+          <w:b w:val="0"/>
+          <w:sz w:val="22"/>
+        </w:rPr>
+        <w:t>{% if batch_number %}Batch Number: {{ batch_number }}{% endif %}</w:t>
       </w:r>
     </w:p>
     <w:p>
-      <w:pPr>
-        <w:spacing w:after="240"/>
-      </w:pPr>
+      <w:r>
+        <w:rPr>
+          <w:b w:val="0"/>
+          <w:sz w:val="22"/>
+        </w:rPr>
+        <w:t>Run: {{ run_name }}  |  Status: {{ run_status }}</w:t>
+      </w:r>
+    </w:p>
+    <w:p>
+      <w:r>
+        <w:rPr>
+          <w:b w:val="0"/>
+          <w:sz w:val="22"/>
+        </w:rPr>
+        <w:t>Started: {{ started_at }}  |  Completed: {{ completed_at }}</w:t>
+      </w:r>
+    </w:p>
+    <w:p>
+      <w:r>
+        <w:rPr>
+          <w:b w:val="0"/>
+          <w:sz w:val="22"/>
+        </w:rPr>
+        <w:t>Project: {{ project_name }}  |  Organization: {{ organization_name }}</w:t>
+      </w:r>
+    </w:p>
+    <w:p>
+      <w:r>
+        <w:rPr>
+          <w:b w:val="0"/>
+          <w:sz w:val="22"/>
+        </w:rPr>
+        <w:t>SOP Reference: {{ doc_number }} v{{ version_number }} (effective {{ effective_date }})</w:t>
+      </w:r>
+    </w:p>
+    <w:p>
+      <w:r>
+        <w:rPr>
+          <w:b w:val="0"/>
+          <w:sz w:val="2"/>
+        </w:rPr>
+        <w:t>{%p if equipment_summary %}</w:t>
+      </w:r>
+    </w:p>
+    <w:p>
       <w:r>
         <w:rPr>
           <w:b/>
-          <w:color w:val="334155"/>
-          <w:sz w:val="20"/>
-        </w:rPr>
-        <w:t xml:space="preserve">Date: </w:t>
-      </w:r>
-      <w:r>
-        <w:rPr>
-          <w:color w:val="787878"/>
-          <w:sz w:val="20"/>
-        </w:rPr>
-        <w:t>_______________</w:t>
-        <w:tab/>
-        <w:tab/>
-      </w:r>
-      <w:r>
-        <w:rPr>
-          <w:b/>
-          <w:color w:val="334155"/>
-          <w:sz w:val="20"/>
-        </w:rPr>
-        <w:t xml:space="preserve">Lot/Batch #: </w:t>
-      </w:r>
-      <w:r>
-        <w:rPr>
-          <w:color w:val="787878"/>
-          <w:sz w:val="20"/>
-        </w:rPr>
-        <w:t>_______________</w:t>
-      </w:r>
-    </w:p>
-    <w:p>
-      <w:pPr>
-        <w:spacing w:after="0" w:before="0"/>
-      </w:pPr>
-      <w:r>
-        <w:rPr>
-          <w:color w:val="334155"/>
-          <w:sz w:val="2"/>
-        </w:rPr>
-        <w:t>{%p for role in roles %}</w:t>
-      </w:r>
-    </w:p>
-    <w:p>
-      <w:pPr>
-        <w:spacing w:after="120" w:before="0"/>
-      </w:pPr>
-      <w:r>
-        <w:rPr>
-          <w:b/>
-          <w:color w:val="0F172A"/>
           <w:sz w:val="28"/>
         </w:rPr>
-        <w:t>{{ role.name }}</w:t>
+        <w:t>Equipment Used</w:t>
       </w:r>
     </w:p>
     <w:tbl>
       <w:tblPr>
-        <w:tblStyle w:val="TableGrid"/>
+        <w:tblStyle w:val="LightGrid-Accent1"/>
         <w:tblW w:type="auto" w:w="0"/>
         <w:tblLook w:firstColumn="1" w:firstRow="1" w:lastColumn="0" w:lastRow="0" w:noHBand="0" w:noVBand="1" w:val="04A0"/>
-        <w:tblCellMar>
-          <w:top w:w="56" w:type="dxa"/>
-          <w:bottom w:w="56" w:type="dxa"/>
-          <w:start w:w="56" w:type="dxa"/>
-          <w:end w:w="56" w:type="dxa"/>
-        </w:tblCellMar>
-        <w:tblLayout w:type="fixed"/>
       </w:tblPr>
       <w:tblGrid>
-        <w:gridCol w:w="504"/>
-        <w:gridCol w:w="2016"/>
-        <w:gridCol w:w="4032"/>
-        <w:gridCol w:w="2016"/>
-        <w:gridCol w:w="1512"/>
+        <w:gridCol w:w="3324"/>
+        <w:gridCol w:w="3324"/>
+        <w:gridCol w:w="3324"/>
       </w:tblGrid>
       <w:tr>
-        <w:trPr>
-          <w:trHeight w:val="454" w:hRule="atLeast"/>
-        </w:trPr>
         <w:tc>
           <w:tcPr>
-            <w:tcW w:type="dxa" w:w="504"/>
-            <w:shd w:val="clear" w:color="auto" w:fill="1E293B"/>
+            <w:tcW w:type="dxa" w:w="3324"/>
           </w:tcPr>
           <w:p>
-            <w:pPr>
-              <w:spacing w:before="0" w:after="0"/>
-              <w:jc w:val="center"/>
-            </w:pPr>
-            <w:r/>
             <w:r>
-              <w:rPr>
-                <w:b/>
-                <w:color w:val="FFFFFF"/>
-                <w:sz w:val="16"/>
-              </w:rPr>
-              <w:t>#</w:t>
+              <w:t>ID</w:t>
             </w:r>
           </w:p>
         </w:tc>
         <w:tc>
           <w:tcPr>
-            <w:tcW w:type="dxa" w:w="2016"/>
-            <w:shd w:val="clear" w:color="auto" w:fill="1E293B"/>
+            <w:tcW w:type="dxa" w:w="3324"/>
           </w:tcPr>
           <w:p>
-            <w:pPr>
-              <w:spacing w:before="0" w:after="0"/>
-              <w:jc w:val="center"/>
-            </w:pPr>
-            <w:r/>
             <w:r>
-              <w:rPr>
-                <w:b/>
-                <w:color w:val="FFFFFF"/>
-                <w:sz w:val="16"/>
-              </w:rPr>
-              <w:t>Step</w:t>
+              <w:t>Name</w:t>
             </w:r>
           </w:p>
         </w:tc>
         <w:tc>
           <w:tcPr>
-            <w:tcW w:type="dxa" w:w="4032"/>
-            <w:shd w:val="clear" w:color="auto" w:fill="1E293B"/>
+            <w:tcW w:type="dxa" w:w="3324"/>
           </w:tcPr>
           <w:p>
-            <w:pPr>
-              <w:spacing w:before="0" w:after="0"/>
-              <w:jc w:val="center"/>
-            </w:pPr>
-            <w:r/>
             <w:r>
-              <w:rPr>
-                <w:b/>
-                <w:color w:val="FFFFFF"/>
-                <w:sz w:val="16"/>
-              </w:rPr>
               <w:t>Description</w:t>
-            </w:r>
-          </w:p>
-        </w:tc>
-        <w:tc>
-          <w:tcPr>
-            <w:tcW w:type="dxa" w:w="2016"/>
-            <w:shd w:val="clear" w:color="auto" w:fill="1E293B"/>
-          </w:tcPr>
-          <w:p>
-            <w:pPr>
-              <w:spacing w:before="0" w:after="0"/>
-              <w:jc w:val="center"/>
-            </w:pPr>
-            <w:r/>
-            <w:r>
-              <w:rPr>
-                <w:b/>
-                <w:color w:val="FFFFFF"/>
-                <w:sz w:val="16"/>
-              </w:rPr>
-              <w:t>Value / Result</w:t>
-            </w:r>
-          </w:p>
-        </w:tc>
-        <w:tc>
-          <w:tcPr>
-            <w:tcW w:type="dxa" w:w="1512"/>
-            <w:shd w:val="clear" w:color="auto" w:fill="1E293B"/>
-          </w:tcPr>
-          <w:p>
-            <w:pPr>
-              <w:spacing w:before="0" w:after="0"/>
-              <w:jc w:val="center"/>
-            </w:pPr>
-            <w:r/>
-            <w:r>
-              <w:rPr>
-                <w:b/>
-                <w:color w:val="FFFFFF"/>
-                <w:sz w:val="16"/>
-              </w:rPr>
-              <w:t>Initials</w:t>
             </w:r>
           </w:p>
         </w:tc>
@@ -212,7 +129,242 @@
       <w:tr>
         <w:tc>
           <w:tcPr>
-            <w:tcW w:type="dxa" w:w="504"/>
+            <w:tcW w:type="dxa" w:w="3324"/>
+          </w:tcPr>
+          <w:p>
+            <w:r>
+              <w:t>{%tr for eq in equipment_summary %}</w:t>
+            </w:r>
+          </w:p>
+        </w:tc>
+        <w:tc>
+          <w:tcPr>
+            <w:tcW w:type="dxa" w:w="3324"/>
+          </w:tcPr>
+          <w:p/>
+        </w:tc>
+        <w:tc>
+          <w:tcPr>
+            <w:tcW w:type="dxa" w:w="3324"/>
+          </w:tcPr>
+          <w:p/>
+        </w:tc>
+      </w:tr>
+      <w:tr>
+        <w:tc>
+          <w:tcPr>
+            <w:tcW w:type="dxa" w:w="3324"/>
+          </w:tcPr>
+          <w:p>
+            <w:r>
+              <w:t>{{ eq.local_id }}</w:t>
+            </w:r>
+          </w:p>
+        </w:tc>
+        <w:tc>
+          <w:tcPr>
+            <w:tcW w:type="dxa" w:w="3324"/>
+          </w:tcPr>
+          <w:p>
+            <w:r>
+              <w:t>{{ eq.name }}</w:t>
+            </w:r>
+          </w:p>
+        </w:tc>
+        <w:tc>
+          <w:tcPr>
+            <w:tcW w:type="dxa" w:w="3324"/>
+          </w:tcPr>
+          <w:p>
+            <w:r>
+              <w:t>{{ eq.description }}</w:t>
+            </w:r>
+          </w:p>
+        </w:tc>
+      </w:tr>
+      <w:tr>
+        <w:tc>
+          <w:tcPr>
+            <w:tcW w:type="dxa" w:w="3324"/>
+          </w:tcPr>
+          <w:p>
+            <w:r>
+              <w:t>{%tr endfor %}</w:t>
+            </w:r>
+          </w:p>
+        </w:tc>
+        <w:tc>
+          <w:tcPr>
+            <w:tcW w:type="dxa" w:w="3324"/>
+          </w:tcPr>
+          <w:p/>
+        </w:tc>
+        <w:tc>
+          <w:tcPr>
+            <w:tcW w:type="dxa" w:w="3324"/>
+          </w:tcPr>
+          <w:p/>
+        </w:tc>
+      </w:tr>
+    </w:tbl>
+    <w:p>
+      <w:r>
+        <w:rPr>
+          <w:b w:val="0"/>
+          <w:sz w:val="2"/>
+        </w:rPr>
+        <w:t>{%p endif %}</w:t>
+      </w:r>
+    </w:p>
+    <w:p>
+      <w:r>
+        <w:rPr>
+          <w:b/>
+          <w:sz w:val="28"/>
+        </w:rPr>
+        <w:t>Procedure Execution</w:t>
+      </w:r>
+    </w:p>
+    <w:p>
+      <w:r>
+        <w:rPr>
+          <w:b w:val="0"/>
+          <w:sz w:val="22"/>
+        </w:rPr>
+        <w:t>{%p if is_role_based %}</w:t>
+      </w:r>
+    </w:p>
+    <w:p>
+      <w:r>
+        <w:rPr>
+          <w:b w:val="0"/>
+          <w:sz w:val="22"/>
+        </w:rPr>
+        <w:t>{%p for role in roles %}</w:t>
+      </w:r>
+    </w:p>
+    <w:p>
+      <w:r>
+        <w:rPr>
+          <w:b w:val="0"/>
+          <w:sz w:val="22"/>
+        </w:rPr>
+        <w:t>{{r role.br_header }}</w:t>
+      </w:r>
+    </w:p>
+    <w:tbl>
+      <w:tblPr>
+        <w:tblStyle w:val="LightGrid-Accent1"/>
+        <w:tblW w:type="auto" w:w="0"/>
+        <w:tblLook w:firstColumn="1" w:firstRow="1" w:lastColumn="0" w:lastRow="0" w:noHBand="0" w:noVBand="1" w:val="04A0"/>
+      </w:tblPr>
+      <w:tblGrid>
+        <w:gridCol w:w="1108"/>
+        <w:gridCol w:w="1108"/>
+        <w:gridCol w:w="1108"/>
+        <w:gridCol w:w="1108"/>
+        <w:gridCol w:w="1108"/>
+        <w:gridCol w:w="1108"/>
+        <w:gridCol w:w="1108"/>
+        <w:gridCol w:w="1108"/>
+        <w:gridCol w:w="1108"/>
+      </w:tblGrid>
+      <w:tr>
+        <w:tc>
+          <w:tcPr>
+            <w:tcW w:type="dxa" w:w="1108"/>
+          </w:tcPr>
+          <w:p>
+            <w:r>
+              <w:t>Step</w:t>
+            </w:r>
+          </w:p>
+        </w:tc>
+        <w:tc>
+          <w:tcPr>
+            <w:tcW w:type="dxa" w:w="1108"/>
+          </w:tcPr>
+          <w:p>
+            <w:r>
+              <w:t>Description</w:t>
+            </w:r>
+          </w:p>
+        </w:tc>
+        <w:tc>
+          <w:tcPr>
+            <w:tcW w:type="dxa" w:w="1108"/>
+          </w:tcPr>
+          <w:p>
+            <w:r>
+              <w:t>Value</w:t>
+            </w:r>
+          </w:p>
+        </w:tc>
+        <w:tc>
+          <w:tcPr>
+            <w:tcW w:type="dxa" w:w="1108"/>
+          </w:tcPr>
+          <w:p>
+            <w:r>
+              <w:t>Operator</w:t>
+            </w:r>
+          </w:p>
+        </w:tc>
+        <w:tc>
+          <w:tcPr>
+            <w:tcW w:type="dxa" w:w="1108"/>
+          </w:tcPr>
+          <w:p>
+            <w:r>
+              <w:t>Reviewer</w:t>
+            </w:r>
+          </w:p>
+        </w:tc>
+        <w:tc>
+          <w:tcPr>
+            <w:tcW w:type="dxa" w:w="1108"/>
+          </w:tcPr>
+          <w:p>
+            <w:r>
+              <w:t>Scheduled</w:t>
+            </w:r>
+          </w:p>
+        </w:tc>
+        <w:tc>
+          <w:tcPr>
+            <w:tcW w:type="dxa" w:w="1108"/>
+          </w:tcPr>
+          <w:p>
+            <w:r>
+              <w:t>Actual Start</w:t>
+            </w:r>
+          </w:p>
+        </w:tc>
+        <w:tc>
+          <w:tcPr>
+            <w:tcW w:type="dxa" w:w="1108"/>
+          </w:tcPr>
+          <w:p>
+            <w:r>
+              <w:t>Actual End</w:t>
+            </w:r>
+          </w:p>
+        </w:tc>
+        <w:tc>
+          <w:tcPr>
+            <w:tcW w:type="dxa" w:w="1108"/>
+          </w:tcPr>
+          <w:p>
+            <w:r>
+              <w:t>Notes</w:t>
+            </w:r>
+          </w:p>
+        </w:tc>
+      </w:tr>
+      <w:tr>
+        <w:tc>
+          <w:tcPr>
+            <w:tcW w:type="dxa" w:w="1108"/>
           </w:tcPr>
           <w:p>
             <w:r>
@@ -222,140 +374,141 @@
         </w:tc>
         <w:tc>
           <w:tcPr>
-            <w:tcW w:type="dxa" w:w="2016"/>
+            <w:tcW w:type="dxa" w:w="1108"/>
           </w:tcPr>
           <w:p/>
         </w:tc>
         <w:tc>
           <w:tcPr>
-            <w:tcW w:type="dxa" w:w="4032"/>
+            <w:tcW w:type="dxa" w:w="1108"/>
           </w:tcPr>
           <w:p/>
         </w:tc>
         <w:tc>
           <w:tcPr>
-            <w:tcW w:type="dxa" w:w="2016"/>
+            <w:tcW w:type="dxa" w:w="1108"/>
           </w:tcPr>
           <w:p/>
         </w:tc>
         <w:tc>
           <w:tcPr>
-            <w:tcW w:type="dxa" w:w="1512"/>
+            <w:tcW w:type="dxa" w:w="1108"/>
+          </w:tcPr>
+          <w:p/>
+        </w:tc>
+        <w:tc>
+          <w:tcPr>
+            <w:tcW w:type="dxa" w:w="1108"/>
+          </w:tcPr>
+          <w:p/>
+        </w:tc>
+        <w:tc>
+          <w:tcPr>
+            <w:tcW w:type="dxa" w:w="1108"/>
+          </w:tcPr>
+          <w:p/>
+        </w:tc>
+        <w:tc>
+          <w:tcPr>
+            <w:tcW w:type="dxa" w:w="1108"/>
+          </w:tcPr>
+          <w:p/>
+        </w:tc>
+        <w:tc>
+          <w:tcPr>
+            <w:tcW w:type="dxa" w:w="1108"/>
           </w:tcPr>
           <w:p/>
         </w:tc>
       </w:tr>
       <w:tr>
-        <w:trPr>
-          <w:trHeight w:val="680" w:hRule="atLeast"/>
-        </w:trPr>
         <w:tc>
           <w:tcPr>
-            <w:tcW w:type="dxa" w:w="504"/>
+            <w:tcW w:type="dxa" w:w="1108"/>
           </w:tcPr>
           <w:p>
-            <w:pPr>
-              <w:spacing w:before="0" w:after="0"/>
-            </w:pPr>
-            <w:r/>
             <w:r>
-              <w:rPr>
-                <w:color w:val="334155"/>
-                <w:sz w:val="16"/>
-              </w:rPr>
-              <w:t>{{ loop.index }}</w:t>
-            </w:r>
-          </w:p>
-        </w:tc>
-        <w:tc>
-          <w:tcPr>
-            <w:tcW w:type="dxa" w:w="2016"/>
-          </w:tcPr>
-          <w:p>
-            <w:pPr>
-              <w:spacing w:before="0" w:after="0"/>
-            </w:pPr>
-            <w:r/>
-            <w:r>
-              <w:rPr>
-                <w:color w:val="334155"/>
-                <w:sz w:val="16"/>
-              </w:rPr>
               <w:t>{{ step.name }}</w:t>
             </w:r>
           </w:p>
         </w:tc>
         <w:tc>
           <w:tcPr>
-            <w:tcW w:type="dxa" w:w="4032"/>
+            <w:tcW w:type="dxa" w:w="1108"/>
           </w:tcPr>
           <w:p>
-            <w:pPr>
-              <w:spacing w:before="0" w:after="80"/>
-            </w:pPr>
-            <w:r/>
             <w:r>
-              <w:rPr>
-                <w:color w:val="334155"/>
-                <w:sz w:val="16"/>
-              </w:rPr>
               <w:t>{{ step.description }}</w:t>
-            </w:r>
-          </w:p>
-          <w:p>
-            <w:pPr>
-              <w:spacing w:before="40" w:after="0"/>
-            </w:pPr>
-            <w:r>
-              <w:rPr>
-                <w:i/>
-                <w:color w:val="969BA5"/>
-                <w:sz w:val="14"/>
-              </w:rPr>
-              <w:t xml:space="preserve">Notes: </w:t>
-            </w:r>
-            <w:r>
-              <w:rPr>
-                <w:color w:val="334155"/>
-                <w:sz w:val="14"/>
-              </w:rPr>
-              <w:t>{{ step.notes_display }}</w:t>
             </w:r>
           </w:p>
         </w:tc>
         <w:tc>
           <w:tcPr>
-            <w:tcW w:type="dxa" w:w="2016"/>
+            <w:tcW w:type="dxa" w:w="1108"/>
           </w:tcPr>
           <w:p>
-            <w:pPr>
-              <w:spacing w:before="0" w:after="0"/>
-            </w:pPr>
-            <w:r/>
             <w:r>
-              <w:rPr>
-                <w:color w:val="334155"/>
-                <w:sz w:val="16"/>
-              </w:rPr>
               <w:t>{{r step.value_display }}</w:t>
             </w:r>
           </w:p>
         </w:tc>
         <w:tc>
           <w:tcPr>
-            <w:tcW w:type="dxa" w:w="1512"/>
+            <w:tcW w:type="dxa" w:w="1108"/>
           </w:tcPr>
           <w:p>
-            <w:pPr>
-              <w:spacing w:before="0" w:after="0"/>
-            </w:pPr>
-            <w:r/>
             <w:r>
-              <w:rPr>
-                <w:color w:val="334155"/>
-                <w:sz w:val="16"/>
-              </w:rPr>
               <w:t>{{ step.initials }}</w:t>
+            </w:r>
+          </w:p>
+        </w:tc>
+        <w:tc>
+          <w:tcPr>
+            <w:tcW w:type="dxa" w:w="1108"/>
+          </w:tcPr>
+          <w:p>
+            <w:r>
+              <w:t>{{ step.reviewer_initials if reviewer_enabled else '' }}</w:t>
+            </w:r>
+          </w:p>
+        </w:tc>
+        <w:tc>
+          <w:tcPr>
+            <w:tcW w:type="dxa" w:w="1108"/>
+          </w:tcPr>
+          <w:p>
+            <w:r>
+              <w:t>{{ step.scheduled_at if time_enabled else '' }}</w:t>
+            </w:r>
+          </w:p>
+        </w:tc>
+        <w:tc>
+          <w:tcPr>
+            <w:tcW w:type="dxa" w:w="1108"/>
+          </w:tcPr>
+          <w:p>
+            <w:r>
+              <w:t>{{ step.actual_started_at if time_enabled else '' }}</w:t>
+            </w:r>
+          </w:p>
+        </w:tc>
+        <w:tc>
+          <w:tcPr>
+            <w:tcW w:type="dxa" w:w="1108"/>
+          </w:tcPr>
+          <w:p>
+            <w:r>
+              <w:t>{{ step.actual_completed_at if time_enabled else '' }}</w:t>
+            </w:r>
+          </w:p>
+        </w:tc>
+        <w:tc>
+          <w:tcPr>
+            <w:tcW w:type="dxa" w:w="1108"/>
+          </w:tcPr>
+          <w:p>
+            <w:r>
+              <w:t>{{ step.notes_text }}</w:t>
             </w:r>
           </w:p>
         </w:tc>
@@ -363,7 +516,7 @@
       <w:tr>
         <w:tc>
           <w:tcPr>
-            <w:tcW w:type="dxa" w:w="504"/>
+            <w:tcW w:type="dxa" w:w="1108"/>
           </w:tcPr>
           <w:p>
             <w:r>
@@ -373,264 +526,177 @@
         </w:tc>
         <w:tc>
           <w:tcPr>
-            <w:tcW w:type="dxa" w:w="2016"/>
+            <w:tcW w:type="dxa" w:w="1108"/>
           </w:tcPr>
           <w:p/>
         </w:tc>
         <w:tc>
           <w:tcPr>
-            <w:tcW w:type="dxa" w:w="4032"/>
+            <w:tcW w:type="dxa" w:w="1108"/>
           </w:tcPr>
           <w:p/>
         </w:tc>
         <w:tc>
           <w:tcPr>
-            <w:tcW w:type="dxa" w:w="2016"/>
+            <w:tcW w:type="dxa" w:w="1108"/>
           </w:tcPr>
           <w:p/>
         </w:tc>
         <w:tc>
           <w:tcPr>
-            <w:tcW w:type="dxa" w:w="1512"/>
+            <w:tcW w:type="dxa" w:w="1108"/>
+          </w:tcPr>
+          <w:p/>
+        </w:tc>
+        <w:tc>
+          <w:tcPr>
+            <w:tcW w:type="dxa" w:w="1108"/>
+          </w:tcPr>
+          <w:p/>
+        </w:tc>
+        <w:tc>
+          <w:tcPr>
+            <w:tcW w:type="dxa" w:w="1108"/>
+          </w:tcPr>
+          <w:p/>
+        </w:tc>
+        <w:tc>
+          <w:tcPr>
+            <w:tcW w:type="dxa" w:w="1108"/>
+          </w:tcPr>
+          <w:p/>
+        </w:tc>
+        <w:tc>
+          <w:tcPr>
+            <w:tcW w:type="dxa" w:w="1108"/>
           </w:tcPr>
           <w:p/>
         </w:tc>
       </w:tr>
     </w:tbl>
     <w:p>
-      <w:pPr>
-        <w:spacing w:after="0" w:before="0"/>
-      </w:pPr>
       <w:r>
         <w:rPr>
-          <w:color w:val="334155"/>
-          <w:sz w:val="2"/>
+          <w:b w:val="0"/>
+          <w:sz w:val="22"/>
         </w:rPr>
         <w:t>{%p endfor %}</w:t>
       </w:r>
     </w:p>
     <w:p>
-      <w:pPr>
-        <w:spacing w:after="0" w:before="0"/>
-      </w:pPr>
       <w:r>
         <w:rPr>
-          <w:color w:val="334155"/>
-          <w:sz w:val="2"/>
-        </w:rPr>
-        <w:t>{%p if notes %}</w:t>
-      </w:r>
-    </w:p>
-    <w:p>
-      <w:pPr>
-        <w:spacing w:after="0" w:before="0"/>
-      </w:pPr>
-      <w:r>
-        <w:rPr>
-          <w:color w:val="334155"/>
-          <w:sz w:val="2"/>
-        </w:rPr>
-        <w:t>{{r page_break }}</w:t>
-      </w:r>
-    </w:p>
-    <w:p>
-      <w:pPr>
-        <w:spacing w:after="160" w:before="0"/>
-      </w:pPr>
-      <w:r>
-        <w:rPr>
-          <w:b/>
-          <w:color w:val="0F172A"/>
+          <w:b w:val="0"/>
           <w:sz w:val="22"/>
         </w:rPr>
-        <w:t>Notes &amp; Observations</w:t>
-      </w:r>
-    </w:p>
-    <w:p>
-      <w:pPr>
-        <w:spacing w:after="0" w:before="0"/>
-      </w:pPr>
-      <w:r>
-        <w:rPr>
-          <w:color w:val="334155"/>
-          <w:sz w:val="2"/>
-        </w:rPr>
-        <w:t>{%p for note in notes %}</w:t>
-      </w:r>
-    </w:p>
-    <w:p>
-      <w:pPr>
-        <w:spacing w:after="40" w:before="0"/>
-      </w:pPr>
-      <w:r>
-        <w:rPr>
-          <w:b/>
-          <w:color w:val="64748B"/>
-          <w:sz w:val="18"/>
-        </w:rPr>
-        <w:t>{{ note.meta }}</w:t>
-      </w:r>
-    </w:p>
-    <w:p>
-      <w:pPr>
-        <w:spacing w:after="160" w:before="0"/>
-      </w:pPr>
-      <w:r>
-        <w:rPr>
-          <w:color w:val="334155"/>
-          <w:sz w:val="20"/>
-        </w:rPr>
-        <w:t>{{ note.content }}</w:t>
-      </w:r>
-    </w:p>
-    <w:p>
-      <w:pPr>
-        <w:spacing w:after="0" w:before="0"/>
-      </w:pPr>
-      <w:r>
-        <w:rPr>
-          <w:color w:val="334155"/>
-          <w:sz w:val="2"/>
-        </w:rPr>
-        <w:t>{%p endfor %}</w:t>
-      </w:r>
-    </w:p>
-    <w:p>
-      <w:pPr>
-        <w:spacing w:after="0" w:before="0"/>
-      </w:pPr>
-      <w:r>
-        <w:rPr>
-          <w:color w:val="334155"/>
-          <w:sz w:val="2"/>
-        </w:rPr>
-        <w:t>{%p endif %}</w:t>
-      </w:r>
-    </w:p>
-    <w:p>
-      <w:pPr>
-        <w:spacing w:after="0" w:before="0"/>
-      </w:pPr>
-      <w:r>
-        <w:rPr>
-          <w:color w:val="334155"/>
-          <w:sz w:val="2"/>
-        </w:rPr>
-        <w:t>{%p if non_image_attachments %}</w:t>
-      </w:r>
-    </w:p>
-    <w:p>
-      <w:pPr>
-        <w:spacing w:after="160" w:before="0"/>
-      </w:pPr>
-      <w:r>
-        <w:rPr>
-          <w:b/>
-          <w:color w:val="0F172A"/>
-          <w:sz w:val="22"/>
-        </w:rPr>
-        <w:t>Attachments</w:t>
+        <w:t>{%p else %}</w:t>
       </w:r>
     </w:p>
     <w:tbl>
       <w:tblPr>
-        <w:tblStyle w:val="TableGrid"/>
+        <w:tblStyle w:val="LightGrid-Accent1"/>
         <w:tblW w:type="auto" w:w="0"/>
         <w:tblLook w:firstColumn="1" w:firstRow="1" w:lastColumn="0" w:lastRow="0" w:noHBand="0" w:noVBand="1" w:val="04A0"/>
-        <w:tblCellMar>
-          <w:top w:w="56" w:type="dxa"/>
-          <w:bottom w:w="56" w:type="dxa"/>
-          <w:start w:w="56" w:type="dxa"/>
-          <w:end w:w="56" w:type="dxa"/>
-        </w:tblCellMar>
       </w:tblPr>
       <w:tblGrid>
-        <w:gridCol w:w="2520"/>
-        <w:gridCol w:w="2520"/>
-        <w:gridCol w:w="2520"/>
-        <w:gridCol w:w="2520"/>
+        <w:gridCol w:w="1108"/>
+        <w:gridCol w:w="1108"/>
+        <w:gridCol w:w="1108"/>
+        <w:gridCol w:w="1108"/>
+        <w:gridCol w:w="1108"/>
+        <w:gridCol w:w="1108"/>
+        <w:gridCol w:w="1108"/>
+        <w:gridCol w:w="1108"/>
+        <w:gridCol w:w="1108"/>
       </w:tblGrid>
       <w:tr>
-        <w:trPr>
-          <w:trHeight w:val="454" w:hRule="atLeast"/>
-        </w:trPr>
         <w:tc>
           <w:tcPr>
-            <w:tcW w:type="dxa" w:w="2520"/>
-            <w:shd w:val="clear" w:color="auto" w:fill="1E293B"/>
+            <w:tcW w:type="dxa" w:w="1108"/>
           </w:tcPr>
           <w:p>
-            <w:pPr>
-              <w:spacing w:before="0" w:after="0"/>
-            </w:pPr>
-            <w:r/>
             <w:r>
-              <w:rPr>
-                <w:b/>
-                <w:color w:val="FFFFFF"/>
-                <w:sz w:val="16"/>
-              </w:rPr>
-              <w:t>Filename</w:t>
+              <w:t>Step</w:t>
             </w:r>
           </w:p>
         </w:tc>
         <w:tc>
           <w:tcPr>
-            <w:tcW w:type="dxa" w:w="2520"/>
-            <w:shd w:val="clear" w:color="auto" w:fill="1E293B"/>
+            <w:tcW w:type="dxa" w:w="1108"/>
           </w:tcPr>
           <w:p>
-            <w:pPr>
-              <w:spacing w:before="0" w:after="0"/>
-            </w:pPr>
-            <w:r/>
             <w:r>
-              <w:rPr>
-                <w:b/>
-                <w:color w:val="FFFFFF"/>
-                <w:sz w:val="16"/>
-              </w:rPr>
-              <w:t>Type</w:t>
+              <w:t>Description</w:t>
             </w:r>
           </w:p>
         </w:tc>
         <w:tc>
           <w:tcPr>
-            <w:tcW w:type="dxa" w:w="2520"/>
-            <w:shd w:val="clear" w:color="auto" w:fill="1E293B"/>
+            <w:tcW w:type="dxa" w:w="1108"/>
           </w:tcPr>
           <w:p>
-            <w:pPr>
-              <w:spacing w:before="0" w:after="0"/>
-            </w:pPr>
-            <w:r/>
             <w:r>
-              <w:rPr>
-                <w:b/>
-                <w:color w:val="FFFFFF"/>
-                <w:sz w:val="16"/>
-              </w:rPr>
-              <w:t>Scope</w:t>
+              <w:t>Value</w:t>
             </w:r>
           </w:p>
         </w:tc>
         <w:tc>
           <w:tcPr>
-            <w:tcW w:type="dxa" w:w="2520"/>
-            <w:shd w:val="clear" w:color="auto" w:fill="1E293B"/>
+            <w:tcW w:type="dxa" w:w="1108"/>
           </w:tcPr>
           <w:p>
-            <w:pPr>
-              <w:spacing w:before="0" w:after="0"/>
-            </w:pPr>
-            <w:r/>
             <w:r>
-              <w:rPr>
-                <w:b/>
-                <w:color w:val="FFFFFF"/>
-                <w:sz w:val="16"/>
-              </w:rPr>
-              <w:t>Uploaded</w:t>
+              <w:t>Operator</w:t>
+            </w:r>
+          </w:p>
+        </w:tc>
+        <w:tc>
+          <w:tcPr>
+            <w:tcW w:type="dxa" w:w="1108"/>
+          </w:tcPr>
+          <w:p>
+            <w:r>
+              <w:t>Reviewer</w:t>
+            </w:r>
+          </w:p>
+        </w:tc>
+        <w:tc>
+          <w:tcPr>
+            <w:tcW w:type="dxa" w:w="1108"/>
+          </w:tcPr>
+          <w:p>
+            <w:r>
+              <w:t>Scheduled</w:t>
+            </w:r>
+          </w:p>
+        </w:tc>
+        <w:tc>
+          <w:tcPr>
+            <w:tcW w:type="dxa" w:w="1108"/>
+          </w:tcPr>
+          <w:p>
+            <w:r>
+              <w:t>Actual Start</w:t>
+            </w:r>
+          </w:p>
+        </w:tc>
+        <w:tc>
+          <w:tcPr>
+            <w:tcW w:type="dxa" w:w="1108"/>
+          </w:tcPr>
+          <w:p>
+            <w:r>
+              <w:t>Actual End</w:t>
+            </w:r>
+          </w:p>
+        </w:tc>
+        <w:tc>
+          <w:tcPr>
+            <w:tcW w:type="dxa" w:w="1108"/>
+          </w:tcPr>
+          <w:p>
+            <w:r>
+              <w:t>Notes</w:t>
             </w:r>
           </w:p>
         </w:tc>
@@ -638,106 +704,151 @@
       <w:tr>
         <w:tc>
           <w:tcPr>
-            <w:tcW w:type="dxa" w:w="2520"/>
+            <w:tcW w:type="dxa" w:w="1108"/>
           </w:tcPr>
           <w:p>
             <w:r>
-              <w:t>{%tr for att in non_image_attachments %}</w:t>
+              <w:t>{%tr for step in steps %}</w:t>
             </w:r>
           </w:p>
         </w:tc>
         <w:tc>
           <w:tcPr>
-            <w:tcW w:type="dxa" w:w="2520"/>
+            <w:tcW w:type="dxa" w:w="1108"/>
           </w:tcPr>
           <w:p/>
         </w:tc>
         <w:tc>
           <w:tcPr>
-            <w:tcW w:type="dxa" w:w="2520"/>
+            <w:tcW w:type="dxa" w:w="1108"/>
           </w:tcPr>
           <w:p/>
         </w:tc>
         <w:tc>
           <w:tcPr>
-            <w:tcW w:type="dxa" w:w="2520"/>
+            <w:tcW w:type="dxa" w:w="1108"/>
+          </w:tcPr>
+          <w:p/>
+        </w:tc>
+        <w:tc>
+          <w:tcPr>
+            <w:tcW w:type="dxa" w:w="1108"/>
+          </w:tcPr>
+          <w:p/>
+        </w:tc>
+        <w:tc>
+          <w:tcPr>
+            <w:tcW w:type="dxa" w:w="1108"/>
+          </w:tcPr>
+          <w:p/>
+        </w:tc>
+        <w:tc>
+          <w:tcPr>
+            <w:tcW w:type="dxa" w:w="1108"/>
+          </w:tcPr>
+          <w:p/>
+        </w:tc>
+        <w:tc>
+          <w:tcPr>
+            <w:tcW w:type="dxa" w:w="1108"/>
+          </w:tcPr>
+          <w:p/>
+        </w:tc>
+        <w:tc>
+          <w:tcPr>
+            <w:tcW w:type="dxa" w:w="1108"/>
           </w:tcPr>
           <w:p/>
         </w:tc>
       </w:tr>
       <w:tr>
-        <w:trPr>
-          <w:trHeight w:val="454" w:hRule="atLeast"/>
-        </w:trPr>
         <w:tc>
           <w:tcPr>
-            <w:tcW w:type="dxa" w:w="2520"/>
+            <w:tcW w:type="dxa" w:w="1108"/>
           </w:tcPr>
           <w:p>
-            <w:pPr>
-              <w:spacing w:before="0" w:after="0"/>
-            </w:pPr>
-            <w:r/>
             <w:r>
-              <w:rPr>
-                <w:color w:val="334155"/>
-                <w:sz w:val="16"/>
-              </w:rPr>
-              <w:t>{{ att.filename }}</w:t>
+              <w:t>{{ step.name }}</w:t>
             </w:r>
           </w:p>
         </w:tc>
         <w:tc>
           <w:tcPr>
-            <w:tcW w:type="dxa" w:w="2520"/>
+            <w:tcW w:type="dxa" w:w="1108"/>
           </w:tcPr>
           <w:p>
-            <w:pPr>
-              <w:spacing w:before="0" w:after="0"/>
-            </w:pPr>
-            <w:r/>
             <w:r>
-              <w:rPr>
-                <w:color w:val="334155"/>
-                <w:sz w:val="16"/>
-              </w:rPr>
-              <w:t>{{ att.type }}</w:t>
+              <w:t>{{ step.description }}</w:t>
             </w:r>
           </w:p>
         </w:tc>
         <w:tc>
           <w:tcPr>
-            <w:tcW w:type="dxa" w:w="2520"/>
+            <w:tcW w:type="dxa" w:w="1108"/>
           </w:tcPr>
           <w:p>
-            <w:pPr>
-              <w:spacing w:before="0" w:after="0"/>
-            </w:pPr>
-            <w:r/>
             <w:r>
-              <w:rPr>
-                <w:color w:val="334155"/>
-                <w:sz w:val="16"/>
-              </w:rPr>
-              <w:t>{{ att.scope }}</w:t>
+              <w:t>{{r step.value_display }}</w:t>
             </w:r>
           </w:p>
         </w:tc>
         <w:tc>
           <w:tcPr>
-            <w:tcW w:type="dxa" w:w="2520"/>
+            <w:tcW w:type="dxa" w:w="1108"/>
           </w:tcPr>
           <w:p>
-            <w:pPr>
-              <w:spacing w:before="0" w:after="0"/>
-            </w:pPr>
-            <w:r/>
             <w:r>
-              <w:rPr>
-                <w:color w:val="334155"/>
-                <w:sz w:val="16"/>
-              </w:rPr>
-              <w:t>{{ att.uploaded_at }}</w:t>
+              <w:t>{{ step.initials }}</w:t>
+            </w:r>
+          </w:p>
+        </w:tc>
+        <w:tc>
+          <w:tcPr>
+            <w:tcW w:type="dxa" w:w="1108"/>
+          </w:tcPr>
+          <w:p>
+            <w:r>
+              <w:t>{{ step.reviewer_initials if reviewer_enabled else '' }}</w:t>
+            </w:r>
+          </w:p>
+        </w:tc>
+        <w:tc>
+          <w:tcPr>
+            <w:tcW w:type="dxa" w:w="1108"/>
+          </w:tcPr>
+          <w:p>
+            <w:r>
+              <w:t>{{ step.scheduled_at if time_enabled else '' }}</w:t>
+            </w:r>
+          </w:p>
+        </w:tc>
+        <w:tc>
+          <w:tcPr>
+            <w:tcW w:type="dxa" w:w="1108"/>
+          </w:tcPr>
+          <w:p>
+            <w:r>
+              <w:t>{{ step.actual_started_at if time_enabled else '' }}</w:t>
+            </w:r>
+          </w:p>
+        </w:tc>
+        <w:tc>
+          <w:tcPr>
+            <w:tcW w:type="dxa" w:w="1108"/>
+          </w:tcPr>
+          <w:p>
+            <w:r>
+              <w:t>{{ step.actual_completed_at if time_enabled else '' }}</w:t>
+            </w:r>
+          </w:p>
+        </w:tc>
+        <w:tc>
+          <w:tcPr>
+            <w:tcW w:type="dxa" w:w="1108"/>
+          </w:tcPr>
+          <w:p>
+            <w:r>
+              <w:t>{{ step.notes_text }}</w:t>
             </w:r>
           </w:p>
         </w:tc>
@@ -745,7 +856,7 @@
       <w:tr>
         <w:tc>
           <w:tcPr>
-            <w:tcW w:type="dxa" w:w="2520"/>
+            <w:tcW w:type="dxa" w:w="1108"/>
           </w:tcPr>
           <w:p>
             <w:r>
@@ -755,240 +866,209 @@
         </w:tc>
         <w:tc>
           <w:tcPr>
-            <w:tcW w:type="dxa" w:w="2520"/>
+            <w:tcW w:type="dxa" w:w="1108"/>
           </w:tcPr>
           <w:p/>
         </w:tc>
         <w:tc>
           <w:tcPr>
-            <w:tcW w:type="dxa" w:w="2520"/>
+            <w:tcW w:type="dxa" w:w="1108"/>
           </w:tcPr>
           <w:p/>
         </w:tc>
         <w:tc>
           <w:tcPr>
-            <w:tcW w:type="dxa" w:w="2520"/>
+            <w:tcW w:type="dxa" w:w="1108"/>
+          </w:tcPr>
+          <w:p/>
+        </w:tc>
+        <w:tc>
+          <w:tcPr>
+            <w:tcW w:type="dxa" w:w="1108"/>
+          </w:tcPr>
+          <w:p/>
+        </w:tc>
+        <w:tc>
+          <w:tcPr>
+            <w:tcW w:type="dxa" w:w="1108"/>
+          </w:tcPr>
+          <w:p/>
+        </w:tc>
+        <w:tc>
+          <w:tcPr>
+            <w:tcW w:type="dxa" w:w="1108"/>
+          </w:tcPr>
+          <w:p/>
+        </w:tc>
+        <w:tc>
+          <w:tcPr>
+            <w:tcW w:type="dxa" w:w="1108"/>
+          </w:tcPr>
+          <w:p/>
+        </w:tc>
+        <w:tc>
+          <w:tcPr>
+            <w:tcW w:type="dxa" w:w="1108"/>
           </w:tcPr>
           <w:p/>
         </w:tc>
       </w:tr>
     </w:tbl>
     <w:p>
-      <w:pPr>
-        <w:spacing w:after="0" w:before="0"/>
-      </w:pPr>
       <w:r>
         <w:rPr>
-          <w:color w:val="334155"/>
-          <w:sz w:val="2"/>
+          <w:b w:val="0"/>
+          <w:sz w:val="22"/>
         </w:rPr>
         <w:t>{%p endif %}</w:t>
       </w:r>
     </w:p>
     <w:p>
-      <w:pPr>
-        <w:spacing w:after="0" w:before="0"/>
-      </w:pPr>
       <w:r>
         <w:rPr>
-          <w:color w:val="334155"/>
+          <w:b w:val="0"/>
           <w:sz w:val="2"/>
         </w:rPr>
-        <w:t>{%p if figures %}</w:t>
+        <w:t>{%p if deviations %}</w:t>
       </w:r>
     </w:p>
     <w:p>
-      <w:pPr>
-        <w:spacing w:after="0" w:before="0"/>
-      </w:pPr>
-      <w:r>
-        <w:rPr>
-          <w:color w:val="334155"/>
-          <w:sz w:val="2"/>
-        </w:rPr>
-        <w:t>{{r page_break }}</w:t>
-      </w:r>
-    </w:p>
-    <w:p>
-      <w:pPr>
-        <w:spacing w:after="160" w:before="0"/>
-      </w:pPr>
       <w:r>
         <w:rPr>
           <w:b/>
-          <w:color w:val="0F172A"/>
           <w:sz w:val="28"/>
         </w:rPr>
-        <w:t>Figures</w:t>
+        <w:t>Deviations</w:t>
       </w:r>
     </w:p>
+    <w:tbl>
+      <w:tblPr>
+        <w:tblStyle w:val="LightGrid-Accent1"/>
+        <w:tblW w:type="auto" w:w="0"/>
+        <w:tblLook w:firstColumn="1" w:firstRow="1" w:lastColumn="0" w:lastRow="0" w:noHBand="0" w:noVBand="1" w:val="04A0"/>
+      </w:tblPr>
+      <w:tblGrid>
+        <w:gridCol w:w="3324"/>
+        <w:gridCol w:w="3324"/>
+        <w:gridCol w:w="3324"/>
+      </w:tblGrid>
+      <w:tr>
+        <w:tc>
+          <w:tcPr>
+            <w:tcW w:type="dxa" w:w="3324"/>
+          </w:tcPr>
+          <w:p>
+            <w:r>
+              <w:t>When</w:t>
+            </w:r>
+          </w:p>
+        </w:tc>
+        <w:tc>
+          <w:tcPr>
+            <w:tcW w:type="dxa" w:w="3324"/>
+          </w:tcPr>
+          <w:p>
+            <w:r>
+              <w:t>Author</w:t>
+            </w:r>
+          </w:p>
+        </w:tc>
+        <w:tc>
+          <w:tcPr>
+            <w:tcW w:type="dxa" w:w="3324"/>
+          </w:tcPr>
+          <w:p>
+            <w:r>
+              <w:t>Note</w:t>
+            </w:r>
+          </w:p>
+        </w:tc>
+      </w:tr>
+      <w:tr>
+        <w:tc>
+          <w:tcPr>
+            <w:tcW w:type="dxa" w:w="3324"/>
+          </w:tcPr>
+          <w:p>
+            <w:r>
+              <w:t>{%tr for d in deviations %}</w:t>
+            </w:r>
+          </w:p>
+        </w:tc>
+        <w:tc>
+          <w:tcPr>
+            <w:tcW w:type="dxa" w:w="3324"/>
+          </w:tcPr>
+          <w:p/>
+        </w:tc>
+        <w:tc>
+          <w:tcPr>
+            <w:tcW w:type="dxa" w:w="3324"/>
+          </w:tcPr>
+          <w:p/>
+        </w:tc>
+      </w:tr>
+      <w:tr>
+        <w:tc>
+          <w:tcPr>
+            <w:tcW w:type="dxa" w:w="3324"/>
+          </w:tcPr>
+          <w:p>
+            <w:r>
+              <w:t>{{ d.created_at }}</w:t>
+            </w:r>
+          </w:p>
+        </w:tc>
+        <w:tc>
+          <w:tcPr>
+            <w:tcW w:type="dxa" w:w="3324"/>
+          </w:tcPr>
+          <w:p>
+            <w:r>
+              <w:t>{{ d.author_name }}</w:t>
+            </w:r>
+          </w:p>
+        </w:tc>
+        <w:tc>
+          <w:tcPr>
+            <w:tcW w:type="dxa" w:w="3324"/>
+          </w:tcPr>
+          <w:p>
+            <w:r>
+              <w:t>{{ d.content }}</w:t>
+            </w:r>
+          </w:p>
+        </w:tc>
+      </w:tr>
+      <w:tr>
+        <w:tc>
+          <w:tcPr>
+            <w:tcW w:type="dxa" w:w="3324"/>
+          </w:tcPr>
+          <w:p>
+            <w:r>
+              <w:t>{%tr endfor %}</w:t>
+            </w:r>
+          </w:p>
+        </w:tc>
+        <w:tc>
+          <w:tcPr>
+            <w:tcW w:type="dxa" w:w="3324"/>
+          </w:tcPr>
+          <w:p/>
+        </w:tc>
+        <w:tc>
+          <w:tcPr>
+            <w:tcW w:type="dxa" w:w="3324"/>
+          </w:tcPr>
+          <w:p/>
+        </w:tc>
+      </w:tr>
+    </w:tbl>
     <w:p>
-      <w:pPr>
-        <w:spacing w:after="0" w:before="0"/>
-      </w:pPr>
       <w:r>
         <w:rPr>
-          <w:color w:val="334155"/>
-          <w:sz w:val="2"/>
-        </w:rPr>
-        <w:t>{%p for fig in figures %}</w:t>
-      </w:r>
-    </w:p>
-    <w:p>
-      <w:pPr>
-        <w:spacing w:after="80" w:before="0"/>
-      </w:pPr>
-      <w:r>
-        <w:rPr>
-          <w:color w:val="334155"/>
-          <w:sz w:val="20"/>
-        </w:rPr>
-        <w:t>{{ fig.image }}</w:t>
-      </w:r>
-    </w:p>
-    <w:p>
-      <w:pPr>
-        <w:spacing w:after="240" w:before="0"/>
-        <w:jc w:val="center"/>
-      </w:pPr>
-      <w:r>
-        <w:rPr>
-          <w:i/>
-          <w:color w:val="64748B"/>
-          <w:sz w:val="18"/>
-        </w:rPr>
-        <w:t>Figure {{ fig.number }}: {{ fig.filename }}</w:t>
-      </w:r>
-    </w:p>
-    <w:p>
-      <w:pPr>
-        <w:spacing w:after="0" w:before="0"/>
-      </w:pPr>
-      <w:r>
-        <w:rPr>
-          <w:color w:val="334155"/>
-          <w:sz w:val="2"/>
-        </w:rPr>
-        <w:t>{%p endfor %}</w:t>
-      </w:r>
-    </w:p>
-    <w:p>
-      <w:pPr>
-        <w:spacing w:after="0" w:before="0"/>
-      </w:pPr>
-      <w:r>
-        <w:rPr>
-          <w:color w:val="334155"/>
-          <w:sz w:val="2"/>
-        </w:rPr>
-        <w:t>{%p endif %}</w:t>
-      </w:r>
-    </w:p>
-    <w:p>
-      <w:pPr>
-        <w:spacing w:after="0" w:before="0"/>
-      </w:pPr>
-      <w:r>
-        <w:rPr>
-          <w:color w:val="334155"/>
-          <w:sz w:val="2"/>
-        </w:rPr>
-        <w:t>{%p if roles %}</w:t>
-      </w:r>
-    </w:p>
-    <w:p>
-      <w:pPr>
-        <w:spacing w:after="0" w:before="0"/>
-      </w:pPr>
-      <w:r>
-        <w:rPr>
-          <w:color w:val="334155"/>
-          <w:sz w:val="2"/>
-        </w:rPr>
-        <w:t>{{r page_break }}</w:t>
-      </w:r>
-    </w:p>
-    <w:p>
-      <w:pPr>
-        <w:spacing w:after="160" w:before="0"/>
-      </w:pPr>
-      <w:r>
-        <w:rPr>
-          <w:b/>
-          <w:color w:val="0F172A"/>
-          <w:sz w:val="22"/>
-        </w:rPr>
-        <w:t>Role Sign-Off</w:t>
-      </w:r>
-    </w:p>
-    <w:p>
-      <w:pPr>
-        <w:spacing w:after="0" w:before="0"/>
-      </w:pPr>
-      <w:r>
-        <w:rPr>
-          <w:color w:val="334155"/>
-          <w:sz w:val="2"/>
-        </w:rPr>
-        <w:t>{%p for role in roles %}</w:t>
-      </w:r>
-    </w:p>
-    <w:p>
-      <w:pPr>
-        <w:spacing w:after="240" w:before="0"/>
-      </w:pPr>
-      <w:r>
-        <w:rPr>
-          <w:b/>
-          <w:color w:val="334155"/>
-          <w:sz w:val="18"/>
-        </w:rPr>
-        <w:t>{{r role.br_header }}</w:t>
-      </w:r>
-    </w:p>
-    <w:p>
-      <w:pPr>
-        <w:spacing w:after="40"/>
-      </w:pPr>
-      <w:r>
-        <w:rPr>
-          <w:color w:val="787878"/>
-          <w:sz w:val="18"/>
-        </w:rPr>
-        <w:t>____________________________</w:t>
-      </w:r>
-    </w:p>
-    <w:p>
-      <w:pPr>
-        <w:spacing w:after="240"/>
-      </w:pPr>
-      <w:r>
-        <w:rPr>
-          <w:color w:val="787878"/>
-          <w:sz w:val="14"/>
-        </w:rPr>
-        <w:t>Signature / Date</w:t>
-      </w:r>
-    </w:p>
-    <w:p>
-      <w:pPr>
-        <w:spacing w:after="0" w:before="0"/>
-      </w:pPr>
-      <w:r>
-        <w:rPr>
-          <w:color w:val="334155"/>
-          <w:sz w:val="2"/>
-        </w:rPr>
-        <w:t>{%p endfor %}</w:t>
-      </w:r>
-    </w:p>
-    <w:p>
-      <w:pPr>
-        <w:spacing w:after="0" w:before="0"/>
-      </w:pPr>
-      <w:r>
-        <w:rPr>
-          <w:color w:val="334155"/>
+          <w:b w:val="0"/>
           <w:sz w:val="2"/>
         </w:rPr>
         <w:t>{%p endif %}</w:t>
@@ -996,99 +1076,287 @@
     </w:p>
     <w:p>
       <w:r>
-        <w:t>{# BR-APPROVAL-BLOCK #}</w:t>
+        <w:rPr>
+          <w:b w:val="0"/>
+          <w:sz w:val="2"/>
+        </w:rPr>
+        <w:t>{%p if notes %}</w:t>
       </w:r>
     </w:p>
     <w:p>
       <w:r>
+        <w:rPr>
+          <w:b/>
+          <w:sz w:val="28"/>
+        </w:rPr>
+        <w:t>Notes</w:t>
+      </w:r>
+    </w:p>
+    <w:p>
+      <w:r>
+        <w:rPr>
+          <w:b w:val="0"/>
+          <w:sz w:val="2"/>
+        </w:rPr>
+        <w:t>{%p for note in notes %}</w:t>
+      </w:r>
+    </w:p>
+    <w:p>
+      <w:r>
+        <w:rPr>
+          <w:b w:val="0"/>
+          <w:sz w:val="22"/>
+        </w:rPr>
+        <w:t>[{{ note.created_at }}] {{ note.author_name }}: {{ note.content }}</w:t>
+      </w:r>
+    </w:p>
+    <w:p>
+      <w:r>
+        <w:rPr>
+          <w:b w:val="0"/>
+          <w:sz w:val="2"/>
+        </w:rPr>
+        <w:t>{%p endfor %}</w:t>
+      </w:r>
+    </w:p>
+    <w:p>
+      <w:r>
+        <w:rPr>
+          <w:b w:val="0"/>
+          <w:sz w:val="2"/>
+        </w:rPr>
+        <w:t>{%p endif %}</w:t>
+      </w:r>
+    </w:p>
+    <w:p>
+      <w:r>
+        <w:rPr>
+          <w:b w:val="0"/>
+          <w:sz w:val="2"/>
+        </w:rPr>
+        <w:t>{%p if figures %}</w:t>
+      </w:r>
+    </w:p>
+    <w:p>
+      <w:r>
+        <w:rPr>
+          <w:b/>
+          <w:sz w:val="28"/>
+        </w:rPr>
+        <w:t>Figures</w:t>
+      </w:r>
+    </w:p>
+    <w:p>
+      <w:r>
+        <w:rPr>
+          <w:b w:val="0"/>
+          <w:sz w:val="2"/>
+        </w:rPr>
+        <w:t>{%p for fig in figures %}</w:t>
+      </w:r>
+    </w:p>
+    <w:p>
+      <w:r>
+        <w:rPr>
+          <w:b w:val="0"/>
+          <w:sz w:val="22"/>
+        </w:rPr>
+        <w:t>Figure {{ fig.number }}: {{ fig.filename }}</w:t>
+      </w:r>
+    </w:p>
+    <w:p>
+      <w:r>
+        <w:rPr>
+          <w:b w:val="0"/>
+          <w:sz w:val="22"/>
+        </w:rPr>
+        <w:t>{{ fig.image }}</w:t>
+      </w:r>
+    </w:p>
+    <w:p>
+      <w:r>
+        <w:rPr>
+          <w:b w:val="0"/>
+          <w:sz w:val="2"/>
+        </w:rPr>
+        <w:t>{%p endfor %}</w:t>
+      </w:r>
+    </w:p>
+    <w:p>
+      <w:r>
+        <w:rPr>
+          <w:b w:val="0"/>
+          <w:sz w:val="2"/>
+        </w:rPr>
+        <w:t>{%p endif %}</w:t>
+      </w:r>
+    </w:p>
+    <w:p>
+      <w:r>
+        <w:rPr>
+          <w:b w:val="0"/>
+          <w:sz w:val="2"/>
+        </w:rPr>
+        <w:t>{%p if non_image_attachments %}</w:t>
+      </w:r>
+    </w:p>
+    <w:p>
+      <w:r>
+        <w:rPr>
+          <w:b/>
+          <w:sz w:val="28"/>
+        </w:rPr>
+        <w:t>Attachments</w:t>
+      </w:r>
+    </w:p>
+    <w:p>
+      <w:r>
+        <w:rPr>
+          <w:b w:val="0"/>
+          <w:sz w:val="2"/>
+        </w:rPr>
+        <w:t>{%p for att in non_image_attachments %}</w:t>
+      </w:r>
+    </w:p>
+    <w:p>
+      <w:r>
+        <w:rPr>
+          <w:b w:val="0"/>
+          <w:sz w:val="22"/>
+        </w:rPr>
+        <w:t>{{ att.filename }} ({{ att.uploaded_at }})</w:t>
+      </w:r>
+    </w:p>
+    <w:p>
+      <w:r>
+        <w:rPr>
+          <w:b w:val="0"/>
+          <w:sz w:val="2"/>
+        </w:rPr>
+        <w:t>{%p endfor %}</w:t>
+      </w:r>
+    </w:p>
+    <w:p>
+      <w:r>
+        <w:rPr>
+          <w:b w:val="0"/>
+          <w:sz w:val="2"/>
+        </w:rPr>
+        <w:t>{%p endif %}</w:t>
+      </w:r>
+    </w:p>
+    <w:p>
+      <w:r>
+        <w:rPr>
+          <w:b/>
+          <w:sz w:val="28"/>
+        </w:rPr>
+        <w:t>Approval</w:t>
+      </w:r>
+    </w:p>
+    <w:p>
+      <w:r>
+        <w:rPr>
+          <w:b w:val="0"/>
+          <w:sz w:val="2"/>
+        </w:rPr>
         <w:t>{%p if approval %}</w:t>
       </w:r>
     </w:p>
     <w:p>
       <w:r>
-        <w:t>Approval &amp; Signatures</w:t>
+        <w:rPr>
+          <w:b w:val="0"/>
+          <w:sz w:val="22"/>
+        </w:rPr>
+        <w:t>Approved by: {{ approval.actor_name }} ({{ approval.actor_role }}) on {{ approval.approved_at }}</w:t>
       </w:r>
     </w:p>
     <w:p>
       <w:r>
-        <w:t>Approver: {{ approval.approver_name }} &lt;{{ approval.approver_email }}&gt;</w:t>
+        <w:rPr>
+          <w:b w:val="0"/>
+          <w:sz w:val="2"/>
+        </w:rPr>
+        <w:t>{%p else %}</w:t>
       </w:r>
     </w:p>
     <w:p>
       <w:r>
-        <w:t>Approved at: {{ approval.approved_at }}    Protocol version: {{ approval.protocol_version }}</w:t>
+        <w:rPr>
+          <w:b w:val="0"/>
+          <w:sz w:val="22"/>
+        </w:rPr>
+        <w:t>{{ unapproved_warning }}</w:t>
       </w:r>
     </w:p>
     <w:p>
       <w:r>
-        <w:t>{%p if approval.signature_statement %}</w:t>
-      </w:r>
-    </w:p>
-    <w:p>
-      <w:r>
-        <w:t>Statement: {{ approval.signature_statement }}</w:t>
-      </w:r>
-    </w:p>
-    <w:p>
-      <w:r>
+        <w:rPr>
+          <w:b w:val="0"/>
+          <w:sz w:val="2"/>
+        </w:rPr>
         <w:t>{%p endif %}</w:t>
       </w:r>
     </w:p>
     <w:p>
       <w:r>
-        <w:t>{%p if approval.signature_image %}</w:t>
+        <w:rPr>
+          <w:b w:val="0"/>
+          <w:sz w:val="2"/>
+        </w:rPr>
+        <w:t>{%p if approval_history and approval_history|length &gt; 1 %}</w:t>
       </w:r>
     </w:p>
     <w:p>
       <w:r>
-        <w:t>Signature: {{ approval.signature_image }}</w:t>
+        <w:rPr>
+          <w:b w:val="0"/>
+          <w:sz w:val="22"/>
+        </w:rPr>
+        <w:t>Approval history:</w:t>
       </w:r>
     </w:p>
     <w:p>
       <w:r>
-        <w:t>{%p endif %}</w:t>
+        <w:rPr>
+          <w:b w:val="0"/>
+          <w:sz w:val="2"/>
+        </w:rPr>
+        <w:t>{%p for event in approval_history %}</w:t>
       </w:r>
     </w:p>
     <w:p>
       <w:r>
-        <w:t>{%p endif %}</w:t>
+        <w:rPr>
+          <w:b w:val="0"/>
+          <w:sz w:val="22"/>
+        </w:rPr>
+        <w:t>{{ event.action }} by {{ event.actor_name }} on {{ event.created_at }}</w:t>
       </w:r>
     </w:p>
     <w:p>
       <w:r>
-        <w:t>{%p if approval_history %}</w:t>
-      </w:r>
-    </w:p>
-    <w:p>
-      <w:r>
-        <w:t>Approval History</w:t>
-      </w:r>
-    </w:p>
-    <w:p>
-      <w:r>
-        <w:t>{%p for ev in approval_history %}</w:t>
-      </w:r>
-    </w:p>
-    <w:p>
-      <w:r>
-        <w:t>{{ ev.created_at }} — {{ ev.action }} by {{ ev.actor_name }}</w:t>
-      </w:r>
-    </w:p>
-    <w:p>
-      <w:r>
+        <w:rPr>
+          <w:b w:val="0"/>
+          <w:sz w:val="2"/>
+        </w:rPr>
         <w:t>{%p endfor %}</w:t>
       </w:r>
     </w:p>
     <w:p>
       <w:r>
+        <w:rPr>
+          <w:b w:val="0"/>
+          <w:sz w:val="2"/>
+        </w:rPr>
         <w:t>{%p endif %}</w:t>
       </w:r>
     </w:p>
     <w:sectPr>
       <w:headerReference w:type="default" r:id="rId9"/>
-      <w:footerReference w:type="default" r:id="rId10"/>
       <w:pgSz w:w="12240" w:h="15840"/>
-      <w:pgMar w:top="1440" w:right="1080" w:bottom="1440" w:left="1080" w:header="720" w:footer="720" w:gutter="0"/>
+      <w:pgMar w:top="1134" w:right="1134" w:bottom="1134" w:left="1134" w:header="720" w:footer="720" w:gutter="0"/>
       <w:cols w:space="720"/>
       <w:docGrid w:linePitch="360"/>
     </w:sectPr>
@@ -1096,63 +1364,14 @@
 </w:document>
 </file>
 
-<file path=word/footer1.xml><?xml version="1.0" encoding="utf-8"?>
-<w:ftr xmlns:m="http://schemas.openxmlformats.org/officeDocument/2006/math" xmlns:mc="http://schemas.openxmlformats.org/markup-compatibility/2006" xmlns:mo="http://schemas.microsoft.com/office/mac/office/2008/main" xmlns:mv="urn:schemas-microsoft-com:mac:vml" xmlns:o="urn:schemas-microsoft-com:office:office" xmlns:r="http://schemas.openxmlformats.org/officeDocument/2006/relationships" xmlns:v="urn:schemas-microsoft-com:vml" xmlns:w10="urn:schemas-microsoft-com:office:word" xmlns:w14="http://schemas.microsoft.com/office/word/2010/wordml" xmlns:w="http://schemas.openxmlformats.org/wordprocessingml/2006/main" xmlns:wne="http://schemas.microsoft.com/office/word/2006/wordml" xmlns:wp14="http://schemas.microsoft.com/office/word/2010/wordprocessingDrawing" xmlns:wp="http://schemas.openxmlformats.org/drawingml/2006/wordprocessingDrawing" xmlns:wpc="http://schemas.microsoft.com/office/word/2010/wordprocessingCanvas" xmlns:wpg="http://schemas.microsoft.com/office/word/2010/wordprocessingGroup" xmlns:wpi="http://schemas.microsoft.com/office/word/2010/wordprocessingInk" xmlns:wps="http://schemas.microsoft.com/office/word/2010/wordprocessingShape" mc:Ignorable="w14 wp14">
-  <w:p>
-    <w:pPr>
-      <w:pStyle w:val="Footer"/>
-      <w:jc w:val="center"/>
-    </w:pPr>
-    <w:r>
-      <w:rPr>
-        <w:color w:val="969696"/>
-        <w:sz w:val="16"/>
-      </w:rPr>
-      <w:t xml:space="preserve">Page </w:t>
-      <w:fldChar w:fldCharType="begin"/>
-      <w:instrText> PAGE </w:instrText>
-      <w:fldChar w:fldCharType="end"/>
-    </w:r>
-    <w:r>
-      <w:rPr>
-        <w:color w:val="969696"/>
-        <w:sz w:val="16"/>
-      </w:rPr>
-      <w:t xml:space="preserve"> / </w:t>
-      <w:fldChar w:fldCharType="begin"/>
-      <w:instrText> NUMPAGES </w:instrText>
-      <w:fldChar w:fldCharType="end"/>
-    </w:r>
-  </w:p>
-</w:ftr>
-</file>
-
 <file path=word/header1.xml><?xml version="1.0" encoding="utf-8"?>
 <w:hdr xmlns:m="http://schemas.openxmlformats.org/officeDocument/2006/math" xmlns:mc="http://schemas.openxmlformats.org/markup-compatibility/2006" xmlns:mo="http://schemas.microsoft.com/office/mac/office/2008/main" xmlns:mv="urn:schemas-microsoft-com:mac:vml" xmlns:o="urn:schemas-microsoft-com:office:office" xmlns:r="http://schemas.openxmlformats.org/officeDocument/2006/relationships" xmlns:v="urn:schemas-microsoft-com:vml" xmlns:w10="urn:schemas-microsoft-com:office:word" xmlns:w14="http://schemas.microsoft.com/office/word/2010/wordml" xmlns:w="http://schemas.openxmlformats.org/wordprocessingml/2006/main" xmlns:wne="http://schemas.microsoft.com/office/word/2006/wordml" xmlns:wp14="http://schemas.microsoft.com/office/word/2010/wordprocessingDrawing" xmlns:wp="http://schemas.openxmlformats.org/drawingml/2006/wordprocessingDrawing" xmlns:wpc="http://schemas.microsoft.com/office/word/2010/wordprocessingCanvas" xmlns:wpg="http://schemas.microsoft.com/office/word/2010/wordprocessingGroup" xmlns:wpi="http://schemas.microsoft.com/office/word/2010/wordprocessingInk" xmlns:wps="http://schemas.microsoft.com/office/word/2010/wordprocessingShape" mc:Ignorable="w14 wp14">
   <w:p>
     <w:pPr>
       <w:pStyle w:val="Header"/>
-      <w:tabs>
-        <w:tab w:pos="10080" w:val="right"/>
-      </w:tabs>
-      <w:jc w:val="left"/>
     </w:pPr>
     <w:r>
-      <w:rPr>
-        <w:i/>
-        <w:color w:val="787878"/>
-        <w:sz w:val="18"/>
-      </w:rPr>
-      <w:t>BATCH RECORD: {{ protocol_name }}</w:t>
-      <w:tab/>
-    </w:r>
-    <w:r>
-      <w:rPr>
-        <w:i/>
-        <w:color w:val="787878"/>
-        <w:sz w:val="18"/>
-      </w:rPr>
-      <w:t>{% if version_number %}v{{ version_number }}{% endif %}{% if version_number and created_at %}  |  {% endif %}{{ created_at }}</w:t>
+      <w:t>{{ organization_name }}    {% if doc_number %}{{ doc_number }}{% endif %}    Run: {{ run_name }}    {% if lot_number %}Lot: {{ lot_number }}{% endif %}</w:t>
     </w:r>
   </w:p>
 </w:hdr>

</xml_diff>

<commit_message>
style(batch_record): match GLP example styling — gray headers + Arial
- Header fill switched from dark slate (1F2937/white) to GLP light gray
  (E8EAED) with black text; KV labels use F1F3F4
- Arial font applied via w:rFonts ascii/hAnsi/cs triple (168 runs) plus
  Normal style default
- Fixed Appendix A blank-page issue by switching from form-feed page break
  in standalone paragraphs to WD_BREAK.PAGE on the heading itself
- Generic subtitle "Batch Manufacturing Record" replaces GLP-specific
  "Toxicology Study Material Manufacturing Record"; removed Informal
  Designation line and GLP-specific purpose copy
- Added {{ target_yield }} variable and wired materials/equipment/
  target_yield kwargs into build_context with empty defaults
- Test artifacts regenerated; all 15 template_engine tests pass

Co-Authored-By: Claude Opus 4.7 <noreply@anthropic.com>
</commit_message>
<xml_diff>
--- a/backend/app/services/documents/templates/batch_record_default.docx
+++ b/backend/app/services/documents/templates/batch_record_default.docx
@@ -3,8 +3,15 @@
 <w:document xmlns:wpc="http://schemas.microsoft.com/office/word/2010/wordprocessingCanvas" xmlns:mo="http://schemas.microsoft.com/office/mac/office/2008/main" xmlns:mc="http://schemas.openxmlformats.org/markup-compatibility/2006" xmlns:mv="urn:schemas-microsoft-com:mac:vml" xmlns:o="urn:schemas-microsoft-com:office:office" xmlns:r="http://schemas.openxmlformats.org/officeDocument/2006/relationships" xmlns:m="http://schemas.openxmlformats.org/officeDocument/2006/math" xmlns:v="urn:schemas-microsoft-com:vml" xmlns:wp14="http://schemas.microsoft.com/office/word/2010/wordprocessingDrawing" xmlns:wp="http://schemas.openxmlformats.org/drawingml/2006/wordprocessingDrawing" xmlns:w10="urn:schemas-microsoft-com:office:word" xmlns:w="http://schemas.openxmlformats.org/wordprocessingml/2006/main" xmlns:w14="http://schemas.microsoft.com/office/word/2010/wordml" xmlns:wpg="http://schemas.microsoft.com/office/word/2010/wordprocessingGroup" xmlns:wpi="http://schemas.microsoft.com/office/word/2010/wordprocessingInk" xmlns:wne="http://schemas.microsoft.com/office/word/2006/wordml" xmlns:wps="http://schemas.microsoft.com/office/word/2010/wordprocessingShape" mc:Ignorable="w14 wp14">
   <w:body>
     <w:p>
+      <w:pPr>
+        <w:spacing w:before="0" w:after="0"/>
+      </w:pPr>
       <w:r>
         <w:rPr>
+          <w:rFonts w:ascii="Arial" w:hAnsi="Arial" w:cs="Arial"/>
+          <w:b w:val="0"/>
+          <w:i w:val="0"/>
+          <w:color w:val="5F6368"/>
           <w:sz w:val="16"/>
         </w:rPr>
         <w:t>{%p if unapproved_warning %}</w:t>
@@ -16,19 +23,91 @@
       </w:pPr>
       <w:r>
         <w:rPr>
+          <w:rFonts w:ascii="Arial" w:hAnsi="Arial" w:cs="Arial"/>
           <w:b/>
+          <w:i w:val="0"/>
           <w:color w:val="B91C1C"/>
-          <w:sz w:val="24"/>
+          <w:sz w:val="22"/>
         </w:rPr>
         <w:t>⚠ UNAPPROVED — DRAFT ONLY</w:t>
       </w:r>
     </w:p>
     <w:p>
+      <w:pPr>
+        <w:spacing w:before="0" w:after="0"/>
+      </w:pPr>
       <w:r>
         <w:rPr>
+          <w:rFonts w:ascii="Arial" w:hAnsi="Arial" w:cs="Arial"/>
+          <w:b w:val="0"/>
+          <w:i w:val="0"/>
+          <w:color w:val="5F6368"/>
           <w:sz w:val="16"/>
         </w:rPr>
         <w:t>{%p endif %}</w:t>
+      </w:r>
+    </w:p>
+    <w:p>
+      <w:pPr>
+        <w:spacing w:after="40"/>
+        <w:jc w:val="center"/>
+      </w:pPr>
+      <w:r>
+        <w:rPr>
+          <w:rFonts w:ascii="Arial" w:hAnsi="Arial" w:cs="Arial"/>
+          <w:b/>
+          <w:i w:val="0"/>
+          <w:color w:val="000000"/>
+          <w:sz w:val="36"/>
+        </w:rPr>
+        <w:t>{{ protocol_name }}</w:t>
+      </w:r>
+    </w:p>
+    <w:p>
+      <w:pPr>
+        <w:spacing w:after="40"/>
+        <w:jc w:val="center"/>
+      </w:pPr>
+      <w:r>
+        <w:rPr>
+          <w:rFonts w:ascii="Arial" w:hAnsi="Arial" w:cs="Arial"/>
+          <w:b w:val="0"/>
+          <w:i/>
+          <w:color w:val="5F6368"/>
+          <w:sz w:val="22"/>
+        </w:rPr>
+        <w:t>Batch Manufacturing Record</w:t>
+      </w:r>
+    </w:p>
+    <w:p>
+      <w:pPr>
+        <w:spacing w:after="160"/>
+        <w:jc w:val="center"/>
+      </w:pPr>
+      <w:r>
+        <w:rPr>
+          <w:rFonts w:ascii="Arial" w:hAnsi="Arial" w:cs="Arial"/>
+          <w:b w:val="0"/>
+          <w:i w:val="0"/>
+          <w:color w:val="5F6368"/>
+          <w:sz w:val="20"/>
+        </w:rPr>
+        <w:t>{{ organization_name }}</w:t>
+      </w:r>
+    </w:p>
+    <w:p>
+      <w:pPr>
+        <w:spacing w:before="0" w:after="0"/>
+      </w:pPr>
+      <w:r>
+        <w:rPr>
+          <w:rFonts w:ascii="Arial" w:hAnsi="Arial" w:cs="Arial"/>
+          <w:b w:val="0"/>
+          <w:i w:val="0"/>
+          <w:color w:val="5F6368"/>
+          <w:sz w:val="16"/>
+        </w:rPr>
+        <w:t>{%p if run_name %}</w:t>
       </w:r>
     </w:p>
     <w:p>
@@ -37,96 +116,58 @@
       </w:pPr>
       <w:r>
         <w:rPr>
-          <w:b/>
-          <w:color w:val="0F172A"/>
-          <w:sz w:val="36"/>
-        </w:rPr>
-        <w:t>{{ protocol_name }}</w:t>
-      </w:r>
-    </w:p>
-    <w:p>
-      <w:pPr>
-        <w:jc w:val="center"/>
-      </w:pPr>
-      <w:r>
-        <w:rPr>
-          <w:i/>
-          <w:color w:val="475569"/>
-          <w:sz w:val="22"/>
-        </w:rPr>
-        <w:t>Toxicology Study Material Manufacturing Record</w:t>
-      </w:r>
-    </w:p>
-    <w:p>
-      <w:pPr>
-        <w:jc w:val="center"/>
-      </w:pPr>
-      <w:r>
-        <w:rPr>
-          <w:color w:val="64748B"/>
-          <w:sz w:val="18"/>
-        </w:rPr>
-        <w:t>Informal Designation: "GLP Level Batch Record"</w:t>
-      </w:r>
-    </w:p>
-    <w:p>
-      <w:r>
-        <w:rPr>
+          <w:rFonts w:ascii="Arial" w:hAnsi="Arial" w:cs="Arial"/>
           <w:b w:val="0"/>
           <w:i w:val="0"/>
-          <w:color w:val="334155"/>
-          <w:sz w:val="20"/>
-        </w:rPr>
-        <w:t>Purpose: To document the manufacturing process for non-clinical test articles intended for use in Good Laboratory Practice (GLP) studies. This record provides a complete history of material production, including all raw materials, equipment, process steps, and deviations.</w:t>
-      </w:r>
-    </w:p>
-    <w:p>
-      <w:r>
-        <w:rPr>
-          <w:sz w:val="16"/>
-        </w:rPr>
-        <w:t>{%p if run_name %}</w:t>
-      </w:r>
-    </w:p>
-    <w:p>
-      <w:r>
-        <w:rPr>
-          <w:b w:val="0"/>
-          <w:i w:val="0"/>
-          <w:color w:val="475569"/>
+          <w:color w:val="5F6368"/>
           <w:sz w:val="18"/>
         </w:rPr>
         <w:t>Run: {{ run_name }}    Status: {{ run_status }}    Started: {{ started_at }}    Completed: {{ completed_at }}</w:t>
       </w:r>
     </w:p>
     <w:p>
+      <w:pPr>
+        <w:spacing w:before="0" w:after="0"/>
+      </w:pPr>
       <w:r>
         <w:rPr>
+          <w:rFonts w:ascii="Arial" w:hAnsi="Arial" w:cs="Arial"/>
+          <w:b w:val="0"/>
+          <w:i w:val="0"/>
+          <w:color w:val="5F6368"/>
           <w:sz w:val="16"/>
         </w:rPr>
         <w:t>{%p endif %}</w:t>
       </w:r>
     </w:p>
     <w:p>
+      <w:pPr>
+        <w:spacing w:after="120"/>
+        <w:jc w:val="center"/>
+      </w:pPr>
       <w:r>
         <w:rPr>
+          <w:rFonts w:ascii="Arial" w:hAnsi="Arial" w:cs="Arial"/>
           <w:b w:val="0"/>
           <w:i w:val="0"/>
-          <w:color w:val="475569"/>
+          <w:color w:val="5F6368"/>
           <w:sz w:val="18"/>
         </w:rPr>
-        <w:t>Project: {{ project_name }}    Organization: {{ organization_name }}    Protocol Version: v{{ version_number }}    Generated: {{ created_at }}</w:t>
+        <w:t>Project: {{ project_name }}    Protocol Version: v{{ version_number }}    Generated: {{ created_at }}</w:t>
       </w:r>
     </w:p>
     <w:p>
       <w:pPr>
-        <w:spacing w:before="240" w:after="80"/>
+        <w:keepNext/>
+        <w:spacing w:before="280" w:after="80"/>
       </w:pPr>
       <w:r>
         <w:rPr>
+          <w:rFonts w:ascii="Arial" w:hAnsi="Arial" w:cs="Arial"/>
           <w:b/>
-          <w:color w:val="1F2937"/>
-          <w:sz w:val="28"/>
+          <w:i w:val="0"/>
+          <w:color w:val="000000"/>
+          <w:sz w:val="26"/>
         </w:rPr>
         <w:t>1. General Information</w:t>
       </w:r>
@@ -134,8 +175,8 @@
     <w:tbl>
       <w:tblPr>
         <w:tblW w:type="auto" w:w="0"/>
-        <w:tblLayout w:type="autofit"/>
         <w:tblLook w:firstColumn="1" w:firstRow="1" w:lastColumn="0" w:lastRow="0" w:noHBand="0" w:noVBand="1" w:val="04A0"/>
+        <w:tblLayout w:type="fixed"/>
       </w:tblPr>
       <w:tblGrid>
         <w:gridCol w:w="5040"/>
@@ -144,8 +185,8 @@
       <w:tr>
         <w:tc>
           <w:tcPr>
-            <w:tcW w:type="dxa" w:w="3600"/>
-            <w:shd w:val="clear" w:color="auto" w:fill="1F2937"/>
+            <w:tcW w:type="dxa" w:w="3400"/>
+            <w:shd w:val="clear" w:color="auto" w:fill="F1F3F4"/>
             <w:tcBorders>
               <w:top w:val="single" w:sz="4" w:color="BFBFBF"/>
               <w:left w:val="single" w:sz="4" w:color="BFBFBF"/>
@@ -158,8 +199,10 @@
             <w:r/>
             <w:r>
               <w:rPr>
+                <w:rFonts w:ascii="Arial" w:hAnsi="Arial" w:cs="Arial"/>
                 <w:b/>
-                <w:color w:val="FFFFFF"/>
+                <w:i w:val="0"/>
+                <w:color w:val="000000"/>
                 <w:sz w:val="20"/>
               </w:rPr>
               <w:t>Product Name / Candidate</w:t>
@@ -168,7 +211,7 @@
         </w:tc>
         <w:tc>
           <w:tcPr>
-            <w:tcW w:type="dxa" w:w="5040"/>
+            <w:tcW w:type="dxa" w:w="6400"/>
             <w:tcBorders>
               <w:top w:val="single" w:sz="4" w:color="BFBFBF"/>
               <w:left w:val="single" w:sz="4" w:color="BFBFBF"/>
@@ -181,7 +224,10 @@
             <w:r/>
             <w:r>
               <w:rPr>
+                <w:rFonts w:ascii="Arial" w:hAnsi="Arial" w:cs="Arial"/>
                 <w:b w:val="0"/>
+                <w:i w:val="0"/>
+                <w:color w:val="000000"/>
                 <w:sz w:val="20"/>
               </w:rPr>
               <w:t>{{ protocol_name }}</w:t>
@@ -192,8 +238,8 @@
       <w:tr>
         <w:tc>
           <w:tcPr>
-            <w:tcW w:type="dxa" w:w="3600"/>
-            <w:shd w:val="clear" w:color="auto" w:fill="1F2937"/>
+            <w:tcW w:type="dxa" w:w="3400"/>
+            <w:shd w:val="clear" w:color="auto" w:fill="F1F3F4"/>
             <w:tcBorders>
               <w:top w:val="single" w:sz="4" w:color="BFBFBF"/>
               <w:left w:val="single" w:sz="4" w:color="BFBFBF"/>
@@ -206,8 +252,10 @@
             <w:r/>
             <w:r>
               <w:rPr>
+                <w:rFonts w:ascii="Arial" w:hAnsi="Arial" w:cs="Arial"/>
                 <w:b/>
-                <w:color w:val="FFFFFF"/>
+                <w:i w:val="0"/>
+                <w:color w:val="000000"/>
                 <w:sz w:val="20"/>
               </w:rPr>
               <w:t>Batch / Lot Number</w:t>
@@ -216,7 +264,7 @@
         </w:tc>
         <w:tc>
           <w:tcPr>
-            <w:tcW w:type="dxa" w:w="5040"/>
+            <w:tcW w:type="dxa" w:w="6400"/>
             <w:tcBorders>
               <w:top w:val="single" w:sz="4" w:color="BFBFBF"/>
               <w:left w:val="single" w:sz="4" w:color="BFBFBF"/>
@@ -229,7 +277,10 @@
             <w:r/>
             <w:r>
               <w:rPr>
+                <w:rFonts w:ascii="Arial" w:hAnsi="Arial" w:cs="Arial"/>
                 <w:b w:val="0"/>
+                <w:i w:val="0"/>
+                <w:color w:val="000000"/>
                 <w:sz w:val="20"/>
               </w:rPr>
               <w:t>{{ run_name }}</w:t>
@@ -240,8 +291,8 @@
       <w:tr>
         <w:tc>
           <w:tcPr>
-            <w:tcW w:type="dxa" w:w="3600"/>
-            <w:shd w:val="clear" w:color="auto" w:fill="1F2937"/>
+            <w:tcW w:type="dxa" w:w="3400"/>
+            <w:shd w:val="clear" w:color="auto" w:fill="F1F3F4"/>
             <w:tcBorders>
               <w:top w:val="single" w:sz="4" w:color="BFBFBF"/>
               <w:left w:val="single" w:sz="4" w:color="BFBFBF"/>
@@ -254,8 +305,10 @@
             <w:r/>
             <w:r>
               <w:rPr>
+                <w:rFonts w:ascii="Arial" w:hAnsi="Arial" w:cs="Arial"/>
                 <w:b/>
-                <w:color w:val="FFFFFF"/>
+                <w:i w:val="0"/>
+                <w:color w:val="000000"/>
                 <w:sz w:val="20"/>
               </w:rPr>
               <w:t>Target Yield / Scale</w:t>
@@ -264,7 +317,7 @@
         </w:tc>
         <w:tc>
           <w:tcPr>
-            <w:tcW w:type="dxa" w:w="5040"/>
+            <w:tcW w:type="dxa" w:w="6400"/>
             <w:tcBorders>
               <w:top w:val="single" w:sz="4" w:color="BFBFBF"/>
               <w:left w:val="single" w:sz="4" w:color="BFBFBF"/>
@@ -277,9 +330,13 @@
             <w:r/>
             <w:r>
               <w:rPr>
+                <w:rFonts w:ascii="Arial" w:hAnsi="Arial" w:cs="Arial"/>
                 <w:b w:val="0"/>
+                <w:i w:val="0"/>
+                <w:color w:val="000000"/>
                 <w:sz w:val="20"/>
               </w:rPr>
+              <w:t>{{ target_yield }}</w:t>
             </w:r>
           </w:p>
         </w:tc>
@@ -287,8 +344,8 @@
       <w:tr>
         <w:tc>
           <w:tcPr>
-            <w:tcW w:type="dxa" w:w="3600"/>
-            <w:shd w:val="clear" w:color="auto" w:fill="1F2937"/>
+            <w:tcW w:type="dxa" w:w="3400"/>
+            <w:shd w:val="clear" w:color="auto" w:fill="F1F3F4"/>
             <w:tcBorders>
               <w:top w:val="single" w:sz="4" w:color="BFBFBF"/>
               <w:left w:val="single" w:sz="4" w:color="BFBFBF"/>
@@ -301,8 +358,10 @@
             <w:r/>
             <w:r>
               <w:rPr>
+                <w:rFonts w:ascii="Arial" w:hAnsi="Arial" w:cs="Arial"/>
                 <w:b/>
-                <w:color w:val="FFFFFF"/>
+                <w:i w:val="0"/>
+                <w:color w:val="000000"/>
                 <w:sz w:val="20"/>
               </w:rPr>
               <w:t>Process SOP / Protocol Reference</w:t>
@@ -311,7 +370,7 @@
         </w:tc>
         <w:tc>
           <w:tcPr>
-            <w:tcW w:type="dxa" w:w="5040"/>
+            <w:tcW w:type="dxa" w:w="6400"/>
             <w:tcBorders>
               <w:top w:val="single" w:sz="4" w:color="BFBFBF"/>
               <w:left w:val="single" w:sz="4" w:color="BFBFBF"/>
@@ -324,7 +383,10 @@
             <w:r/>
             <w:r>
               <w:rPr>
+                <w:rFonts w:ascii="Arial" w:hAnsi="Arial" w:cs="Arial"/>
                 <w:b w:val="0"/>
+                <w:i w:val="0"/>
+                <w:color w:val="000000"/>
                 <w:sz w:val="20"/>
               </w:rPr>
               <w:t>{{ protocol_name }} (v{{ version_number }})</w:t>
@@ -335,32 +397,40 @@
     </w:tbl>
     <w:p>
       <w:pPr>
-        <w:spacing w:before="240" w:after="80"/>
+        <w:keepNext/>
+        <w:spacing w:before="280" w:after="80"/>
       </w:pPr>
       <w:r>
         <w:rPr>
+          <w:rFonts w:ascii="Arial" w:hAnsi="Arial" w:cs="Arial"/>
           <w:b/>
-          <w:color w:val="1F2937"/>
-          <w:sz w:val="28"/>
+          <w:i w:val="0"/>
+          <w:color w:val="000000"/>
+          <w:sz w:val="26"/>
         </w:rPr>
         <w:t>2. Bill of Materials (BOM)</w:t>
       </w:r>
     </w:p>
     <w:p>
+      <w:pPr>
+        <w:spacing w:after="80"/>
+      </w:pPr>
       <w:r>
         <w:rPr>
+          <w:rFonts w:ascii="Arial" w:hAnsi="Arial" w:cs="Arial"/>
           <w:b w:val="0"/>
           <w:i/>
-          <w:color w:val="64748B"/>
+          <w:color w:val="5F6368"/>
           <w:sz w:val="18"/>
         </w:rPr>
-        <w:t>Record all raw materials, media, and buffers utilized in this run. If material data is captured by the system, rows are populated automatically; otherwise complete manually.</w:t>
+        <w:t>Record all raw materials, media, and buffers utilized in this run.</w:t>
       </w:r>
     </w:p>
     <w:tbl>
       <w:tblPr>
         <w:tblW w:type="auto" w:w="0"/>
         <w:tblLook w:firstColumn="1" w:firstRow="1" w:lastColumn="0" w:lastRow="0" w:noHBand="0" w:noVBand="1" w:val="04A0"/>
+        <w:tblLayout w:type="fixed"/>
       </w:tblPr>
       <w:tblGrid>
         <w:gridCol w:w="2016"/>
@@ -372,8 +442,8 @@
       <w:tr>
         <w:tc>
           <w:tcPr>
-            <w:tcW w:type="dxa" w:w="2016"/>
-            <w:shd w:val="clear" w:color="auto" w:fill="1F2937"/>
+            <w:tcW w:type="dxa" w:w="3000"/>
+            <w:shd w:val="clear" w:color="auto" w:fill="E8EAED"/>
             <w:tcBorders>
               <w:top w:val="single" w:sz="4" w:color="BFBFBF"/>
               <w:left w:val="single" w:sz="4" w:color="BFBFBF"/>
@@ -386,8 +456,10 @@
             <w:r/>
             <w:r>
               <w:rPr>
+                <w:rFonts w:ascii="Arial" w:hAnsi="Arial" w:cs="Arial"/>
                 <w:b/>
-                <w:color w:val="FFFFFF"/>
+                <w:i w:val="0"/>
+                <w:color w:val="000000"/>
                 <w:sz w:val="20"/>
               </w:rPr>
               <w:t>Material Description</w:t>
@@ -396,8 +468,8 @@
         </w:tc>
         <w:tc>
           <w:tcPr>
-            <w:tcW w:type="dxa" w:w="2016"/>
-            <w:shd w:val="clear" w:color="auto" w:fill="1F2937"/>
+            <w:tcW w:type="dxa" w:w="2000"/>
+            <w:shd w:val="clear" w:color="auto" w:fill="E8EAED"/>
             <w:tcBorders>
               <w:top w:val="single" w:sz="4" w:color="BFBFBF"/>
               <w:left w:val="single" w:sz="4" w:color="BFBFBF"/>
@@ -410,8 +482,10 @@
             <w:r/>
             <w:r>
               <w:rPr>
+                <w:rFonts w:ascii="Arial" w:hAnsi="Arial" w:cs="Arial"/>
                 <w:b/>
-                <w:color w:val="FFFFFF"/>
+                <w:i w:val="0"/>
+                <w:color w:val="000000"/>
                 <w:sz w:val="20"/>
               </w:rPr>
               <w:t>Part / Lot Number</w:t>
@@ -420,8 +494,8 @@
         </w:tc>
         <w:tc>
           <w:tcPr>
-            <w:tcW w:type="dxa" w:w="2016"/>
-            <w:shd w:val="clear" w:color="auto" w:fill="1F2937"/>
+            <w:tcW w:type="dxa" w:w="1600"/>
+            <w:shd w:val="clear" w:color="auto" w:fill="E8EAED"/>
             <w:tcBorders>
               <w:top w:val="single" w:sz="4" w:color="BFBFBF"/>
               <w:left w:val="single" w:sz="4" w:color="BFBFBF"/>
@@ -434,8 +508,10 @@
             <w:r/>
             <w:r>
               <w:rPr>
+                <w:rFonts w:ascii="Arial" w:hAnsi="Arial" w:cs="Arial"/>
                 <w:b/>
-                <w:color w:val="FFFFFF"/>
+                <w:i w:val="0"/>
+                <w:color w:val="000000"/>
                 <w:sz w:val="20"/>
               </w:rPr>
               <w:t>Required Quantity</w:t>
@@ -444,8 +520,8 @@
         </w:tc>
         <w:tc>
           <w:tcPr>
-            <w:tcW w:type="dxa" w:w="2016"/>
-            <w:shd w:val="clear" w:color="auto" w:fill="1F2937"/>
+            <w:tcW w:type="dxa" w:w="1600"/>
+            <w:shd w:val="clear" w:color="auto" w:fill="E8EAED"/>
             <w:tcBorders>
               <w:top w:val="single" w:sz="4" w:color="BFBFBF"/>
               <w:left w:val="single" w:sz="4" w:color="BFBFBF"/>
@@ -458,8 +534,10 @@
             <w:r/>
             <w:r>
               <w:rPr>
+                <w:rFonts w:ascii="Arial" w:hAnsi="Arial" w:cs="Arial"/>
                 <w:b/>
-                <w:color w:val="FFFFFF"/>
+                <w:i w:val="0"/>
+                <w:color w:val="000000"/>
                 <w:sz w:val="20"/>
               </w:rPr>
               <w:t>Actual Quantity Added</w:t>
@@ -468,8 +546,8 @@
         </w:tc>
         <w:tc>
           <w:tcPr>
-            <w:tcW w:type="dxa" w:w="2016"/>
-            <w:shd w:val="clear" w:color="auto" w:fill="1F2937"/>
+            <w:tcW w:type="dxa" w:w="1800"/>
+            <w:shd w:val="clear" w:color="auto" w:fill="E8EAED"/>
             <w:tcBorders>
               <w:top w:val="single" w:sz="4" w:color="BFBFBF"/>
               <w:left w:val="single" w:sz="4" w:color="BFBFBF"/>
@@ -482,8 +560,10 @@
             <w:r/>
             <w:r>
               <w:rPr>
+                <w:rFonts w:ascii="Arial" w:hAnsi="Arial" w:cs="Arial"/>
                 <w:b/>
-                <w:color w:val="FFFFFF"/>
+                <w:i w:val="0"/>
+                <w:color w:val="000000"/>
                 <w:sz w:val="20"/>
               </w:rPr>
               <w:t>Operator Initials &amp; Date</w:t>
@@ -494,7 +574,7 @@
       <w:tr>
         <w:tc>
           <w:tcPr>
-            <w:tcW w:type="dxa" w:w="2016"/>
+            <w:tcW w:type="dxa" w:w="3000"/>
             <w:tcBorders>
               <w:top w:val="single" w:sz="4" w:color="BFBFBF"/>
               <w:left w:val="single" w:sz="4" w:color="BFBFBF"/>
@@ -507,7 +587,10 @@
             <w:r/>
             <w:r>
               <w:rPr>
+                <w:rFonts w:ascii="Arial" w:hAnsi="Arial" w:cs="Arial"/>
                 <w:b w:val="0"/>
+                <w:i w:val="0"/>
+                <w:color w:val="5F6368"/>
                 <w:sz w:val="16"/>
               </w:rPr>
               <w:t>{%tr for material in materials %}</w:t>
@@ -516,25 +599,25 @@
         </w:tc>
         <w:tc>
           <w:tcPr>
-            <w:tcW w:type="dxa" w:w="2016"/>
+            <w:tcW w:type="dxa" w:w="2000"/>
           </w:tcPr>
           <w:p/>
         </w:tc>
         <w:tc>
           <w:tcPr>
-            <w:tcW w:type="dxa" w:w="2016"/>
+            <w:tcW w:type="dxa" w:w="1600"/>
           </w:tcPr>
           <w:p/>
         </w:tc>
         <w:tc>
           <w:tcPr>
-            <w:tcW w:type="dxa" w:w="2016"/>
+            <w:tcW w:type="dxa" w:w="1600"/>
           </w:tcPr>
           <w:p/>
         </w:tc>
         <w:tc>
           <w:tcPr>
-            <w:tcW w:type="dxa" w:w="2016"/>
+            <w:tcW w:type="dxa" w:w="1800"/>
           </w:tcPr>
           <w:p/>
         </w:tc>
@@ -542,7 +625,7 @@
       <w:tr>
         <w:tc>
           <w:tcPr>
-            <w:tcW w:type="dxa" w:w="2016"/>
+            <w:tcW w:type="dxa" w:w="3000"/>
             <w:tcBorders>
               <w:top w:val="single" w:sz="4" w:color="BFBFBF"/>
               <w:left w:val="single" w:sz="4" w:color="BFBFBF"/>
@@ -555,7 +638,10 @@
             <w:r/>
             <w:r>
               <w:rPr>
+                <w:rFonts w:ascii="Arial" w:hAnsi="Arial" w:cs="Arial"/>
                 <w:b w:val="0"/>
+                <w:i w:val="0"/>
+                <w:color w:val="000000"/>
                 <w:sz w:val="20"/>
               </w:rPr>
               <w:t>{{ material.description }}</w:t>
@@ -564,7 +650,7 @@
         </w:tc>
         <w:tc>
           <w:tcPr>
-            <w:tcW w:type="dxa" w:w="2016"/>
+            <w:tcW w:type="dxa" w:w="2000"/>
             <w:tcBorders>
               <w:top w:val="single" w:sz="4" w:color="BFBFBF"/>
               <w:left w:val="single" w:sz="4" w:color="BFBFBF"/>
@@ -577,7 +663,10 @@
             <w:r/>
             <w:r>
               <w:rPr>
+                <w:rFonts w:ascii="Arial" w:hAnsi="Arial" w:cs="Arial"/>
                 <w:b w:val="0"/>
+                <w:i w:val="0"/>
+                <w:color w:val="000000"/>
                 <w:sz w:val="20"/>
               </w:rPr>
               <w:t>{{ material.lot_number }}</w:t>
@@ -586,7 +675,7 @@
         </w:tc>
         <w:tc>
           <w:tcPr>
-            <w:tcW w:type="dxa" w:w="2016"/>
+            <w:tcW w:type="dxa" w:w="1600"/>
             <w:tcBorders>
               <w:top w:val="single" w:sz="4" w:color="BFBFBF"/>
               <w:left w:val="single" w:sz="4" w:color="BFBFBF"/>
@@ -599,7 +688,10 @@
             <w:r/>
             <w:r>
               <w:rPr>
+                <w:rFonts w:ascii="Arial" w:hAnsi="Arial" w:cs="Arial"/>
                 <w:b w:val="0"/>
+                <w:i w:val="0"/>
+                <w:color w:val="000000"/>
                 <w:sz w:val="20"/>
               </w:rPr>
               <w:t>{{ material.required_qty }}</w:t>
@@ -608,7 +700,7 @@
         </w:tc>
         <w:tc>
           <w:tcPr>
-            <w:tcW w:type="dxa" w:w="2016"/>
+            <w:tcW w:type="dxa" w:w="1600"/>
             <w:tcBorders>
               <w:top w:val="single" w:sz="4" w:color="BFBFBF"/>
               <w:left w:val="single" w:sz="4" w:color="BFBFBF"/>
@@ -621,7 +713,10 @@
             <w:r/>
             <w:r>
               <w:rPr>
+                <w:rFonts w:ascii="Arial" w:hAnsi="Arial" w:cs="Arial"/>
                 <w:b w:val="0"/>
+                <w:i w:val="0"/>
+                <w:color w:val="000000"/>
                 <w:sz w:val="20"/>
               </w:rPr>
               <w:t>{{ material.actual_qty }}</w:t>
@@ -630,7 +725,7 @@
         </w:tc>
         <w:tc>
           <w:tcPr>
-            <w:tcW w:type="dxa" w:w="2016"/>
+            <w:tcW w:type="dxa" w:w="1800"/>
             <w:tcBorders>
               <w:top w:val="single" w:sz="4" w:color="BFBFBF"/>
               <w:left w:val="single" w:sz="4" w:color="BFBFBF"/>
@@ -643,7 +738,10 @@
             <w:r/>
             <w:r>
               <w:rPr>
+                <w:rFonts w:ascii="Arial" w:hAnsi="Arial" w:cs="Arial"/>
                 <w:b w:val="0"/>
+                <w:i w:val="0"/>
+                <w:color w:val="000000"/>
                 <w:sz w:val="20"/>
               </w:rPr>
               <w:t>{{ material.operator }}</w:t>
@@ -654,7 +752,7 @@
       <w:tr>
         <w:tc>
           <w:tcPr>
-            <w:tcW w:type="dxa" w:w="2016"/>
+            <w:tcW w:type="dxa" w:w="3000"/>
             <w:tcBorders>
               <w:top w:val="single" w:sz="4" w:color="BFBFBF"/>
               <w:left w:val="single" w:sz="4" w:color="BFBFBF"/>
@@ -667,7 +765,10 @@
             <w:r/>
             <w:r>
               <w:rPr>
+                <w:rFonts w:ascii="Arial" w:hAnsi="Arial" w:cs="Arial"/>
                 <w:b w:val="0"/>
+                <w:i w:val="0"/>
+                <w:color w:val="5F6368"/>
                 <w:sz w:val="16"/>
               </w:rPr>
               <w:t>{%tr endfor %}</w:t>
@@ -676,25 +777,25 @@
         </w:tc>
         <w:tc>
           <w:tcPr>
-            <w:tcW w:type="dxa" w:w="2016"/>
+            <w:tcW w:type="dxa" w:w="2000"/>
           </w:tcPr>
           <w:p/>
         </w:tc>
         <w:tc>
           <w:tcPr>
-            <w:tcW w:type="dxa" w:w="2016"/>
+            <w:tcW w:type="dxa" w:w="1600"/>
           </w:tcPr>
           <w:p/>
         </w:tc>
         <w:tc>
           <w:tcPr>
-            <w:tcW w:type="dxa" w:w="2016"/>
+            <w:tcW w:type="dxa" w:w="1600"/>
           </w:tcPr>
           <w:p/>
         </w:tc>
         <w:tc>
           <w:tcPr>
-            <w:tcW w:type="dxa" w:w="2016"/>
+            <w:tcW w:type="dxa" w:w="1800"/>
           </w:tcPr>
           <w:p/>
         </w:tc>
@@ -702,7 +803,7 @@
       <w:tr>
         <w:tc>
           <w:tcPr>
-            <w:tcW w:type="dxa" w:w="2016"/>
+            <w:tcW w:type="dxa" w:w="3000"/>
             <w:tcBorders>
               <w:top w:val="single" w:sz="4" w:color="BFBFBF"/>
               <w:left w:val="single" w:sz="4" w:color="BFBFBF"/>
@@ -715,7 +816,10 @@
             <w:r/>
             <w:r>
               <w:rPr>
+                <w:rFonts w:ascii="Arial" w:hAnsi="Arial" w:cs="Arial"/>
                 <w:b w:val="0"/>
+                <w:i w:val="0"/>
+                <w:color w:val="000000"/>
                 <w:sz w:val="20"/>
               </w:rPr>
             </w:r>
@@ -723,7 +827,7 @@
         </w:tc>
         <w:tc>
           <w:tcPr>
-            <w:tcW w:type="dxa" w:w="2016"/>
+            <w:tcW w:type="dxa" w:w="2000"/>
             <w:tcBorders>
               <w:top w:val="single" w:sz="4" w:color="BFBFBF"/>
               <w:left w:val="single" w:sz="4" w:color="BFBFBF"/>
@@ -736,7 +840,10 @@
             <w:r/>
             <w:r>
               <w:rPr>
+                <w:rFonts w:ascii="Arial" w:hAnsi="Arial" w:cs="Arial"/>
                 <w:b w:val="0"/>
+                <w:i w:val="0"/>
+                <w:color w:val="000000"/>
                 <w:sz w:val="20"/>
               </w:rPr>
             </w:r>
@@ -744,7 +851,7 @@
         </w:tc>
         <w:tc>
           <w:tcPr>
-            <w:tcW w:type="dxa" w:w="2016"/>
+            <w:tcW w:type="dxa" w:w="1600"/>
             <w:tcBorders>
               <w:top w:val="single" w:sz="4" w:color="BFBFBF"/>
               <w:left w:val="single" w:sz="4" w:color="BFBFBF"/>
@@ -757,7 +864,10 @@
             <w:r/>
             <w:r>
               <w:rPr>
+                <w:rFonts w:ascii="Arial" w:hAnsi="Arial" w:cs="Arial"/>
                 <w:b w:val="0"/>
+                <w:i w:val="0"/>
+                <w:color w:val="000000"/>
                 <w:sz w:val="20"/>
               </w:rPr>
             </w:r>
@@ -765,7 +875,7 @@
         </w:tc>
         <w:tc>
           <w:tcPr>
-            <w:tcW w:type="dxa" w:w="2016"/>
+            <w:tcW w:type="dxa" w:w="1600"/>
             <w:tcBorders>
               <w:top w:val="single" w:sz="4" w:color="BFBFBF"/>
               <w:left w:val="single" w:sz="4" w:color="BFBFBF"/>
@@ -778,7 +888,10 @@
             <w:r/>
             <w:r>
               <w:rPr>
+                <w:rFonts w:ascii="Arial" w:hAnsi="Arial" w:cs="Arial"/>
                 <w:b w:val="0"/>
+                <w:i w:val="0"/>
+                <w:color w:val="000000"/>
                 <w:sz w:val="20"/>
               </w:rPr>
             </w:r>
@@ -786,7 +899,7 @@
         </w:tc>
         <w:tc>
           <w:tcPr>
-            <w:tcW w:type="dxa" w:w="2016"/>
+            <w:tcW w:type="dxa" w:w="1800"/>
             <w:tcBorders>
               <w:top w:val="single" w:sz="4" w:color="BFBFBF"/>
               <w:left w:val="single" w:sz="4" w:color="BFBFBF"/>
@@ -799,7 +912,10 @@
             <w:r/>
             <w:r>
               <w:rPr>
+                <w:rFonts w:ascii="Arial" w:hAnsi="Arial" w:cs="Arial"/>
                 <w:b w:val="0"/>
+                <w:i w:val="0"/>
+                <w:color w:val="000000"/>
                 <w:sz w:val="20"/>
               </w:rPr>
             </w:r>
@@ -809,32 +925,40 @@
     </w:tbl>
     <w:p>
       <w:pPr>
-        <w:spacing w:before="240" w:after="80"/>
+        <w:keepNext/>
+        <w:spacing w:before="280" w:after="80"/>
       </w:pPr>
       <w:r>
         <w:rPr>
+          <w:rFonts w:ascii="Arial" w:hAnsi="Arial" w:cs="Arial"/>
           <w:b/>
-          <w:color w:val="1F2937"/>
-          <w:sz w:val="28"/>
+          <w:i w:val="0"/>
+          <w:color w:val="000000"/>
+          <w:sz w:val="26"/>
         </w:rPr>
         <w:t>3. Equipment Log</w:t>
       </w:r>
     </w:p>
     <w:p>
+      <w:pPr>
+        <w:spacing w:after="80"/>
+      </w:pPr>
       <w:r>
         <w:rPr>
+          <w:rFonts w:ascii="Arial" w:hAnsi="Arial" w:cs="Arial"/>
           <w:b w:val="0"/>
           <w:i/>
-          <w:color w:val="64748B"/>
+          <w:color w:val="5F6368"/>
           <w:sz w:val="18"/>
         </w:rPr>
-        <w:t>Record primary equipment used to ensure traceability in the event of equipment failure or contamination.</w:t>
+        <w:t>Record primary equipment used to ensure traceability.</w:t>
       </w:r>
     </w:p>
     <w:tbl>
       <w:tblPr>
         <w:tblW w:type="auto" w:w="0"/>
         <w:tblLook w:firstColumn="1" w:firstRow="1" w:lastColumn="0" w:lastRow="0" w:noHBand="0" w:noVBand="1" w:val="04A0"/>
+        <w:tblLayout w:type="fixed"/>
       </w:tblPr>
       <w:tblGrid>
         <w:gridCol w:w="2520"/>
@@ -845,8 +969,8 @@
       <w:tr>
         <w:tc>
           <w:tcPr>
-            <w:tcW w:type="dxa" w:w="2520"/>
-            <w:shd w:val="clear" w:color="auto" w:fill="1F2937"/>
+            <w:tcW w:type="dxa" w:w="3200"/>
+            <w:shd w:val="clear" w:color="auto" w:fill="E8EAED"/>
             <w:tcBorders>
               <w:top w:val="single" w:sz="4" w:color="BFBFBF"/>
               <w:left w:val="single" w:sz="4" w:color="BFBFBF"/>
@@ -859,8 +983,10 @@
             <w:r/>
             <w:r>
               <w:rPr>
+                <w:rFonts w:ascii="Arial" w:hAnsi="Arial" w:cs="Arial"/>
                 <w:b/>
-                <w:color w:val="FFFFFF"/>
+                <w:i w:val="0"/>
+                <w:color w:val="000000"/>
                 <w:sz w:val="20"/>
               </w:rPr>
               <w:t>Equipment Name / Type</w:t>
@@ -869,8 +995,8 @@
         </w:tc>
         <w:tc>
           <w:tcPr>
-            <w:tcW w:type="dxa" w:w="2520"/>
-            <w:shd w:val="clear" w:color="auto" w:fill="1F2937"/>
+            <w:tcW w:type="dxa" w:w="2200"/>
+            <w:shd w:val="clear" w:color="auto" w:fill="E8EAED"/>
             <w:tcBorders>
               <w:top w:val="single" w:sz="4" w:color="BFBFBF"/>
               <w:left w:val="single" w:sz="4" w:color="BFBFBF"/>
@@ -883,8 +1009,10 @@
             <w:r/>
             <w:r>
               <w:rPr>
+                <w:rFonts w:ascii="Arial" w:hAnsi="Arial" w:cs="Arial"/>
                 <w:b/>
-                <w:color w:val="FFFFFF"/>
+                <w:i w:val="0"/>
+                <w:color w:val="000000"/>
                 <w:sz w:val="20"/>
               </w:rPr>
               <w:t>Equipment ID (Asset Tag)</w:t>
@@ -893,8 +1021,8 @@
         </w:tc>
         <w:tc>
           <w:tcPr>
-            <w:tcW w:type="dxa" w:w="2520"/>
-            <w:shd w:val="clear" w:color="auto" w:fill="1F2937"/>
+            <w:tcW w:type="dxa" w:w="2600"/>
+            <w:shd w:val="clear" w:color="auto" w:fill="E8EAED"/>
             <w:tcBorders>
               <w:top w:val="single" w:sz="4" w:color="BFBFBF"/>
               <w:left w:val="single" w:sz="4" w:color="BFBFBF"/>
@@ -907,8 +1035,10 @@
             <w:r/>
             <w:r>
               <w:rPr>
+                <w:rFonts w:ascii="Arial" w:hAnsi="Arial" w:cs="Arial"/>
                 <w:b/>
-                <w:color w:val="FFFFFF"/>
+                <w:i w:val="0"/>
+                <w:color w:val="000000"/>
                 <w:sz w:val="20"/>
               </w:rPr>
               <w:t>Calibration Status (Valid Until)</w:t>
@@ -917,8 +1047,8 @@
         </w:tc>
         <w:tc>
           <w:tcPr>
-            <w:tcW w:type="dxa" w:w="2520"/>
-            <w:shd w:val="clear" w:color="auto" w:fill="1F2937"/>
+            <w:tcW w:type="dxa" w:w="2000"/>
+            <w:shd w:val="clear" w:color="auto" w:fill="E8EAED"/>
             <w:tcBorders>
               <w:top w:val="single" w:sz="4" w:color="BFBFBF"/>
               <w:left w:val="single" w:sz="4" w:color="BFBFBF"/>
@@ -931,8 +1061,10 @@
             <w:r/>
             <w:r>
               <w:rPr>
+                <w:rFonts w:ascii="Arial" w:hAnsi="Arial" w:cs="Arial"/>
                 <w:b/>
-                <w:color w:val="FFFFFF"/>
+                <w:i w:val="0"/>
+                <w:color w:val="000000"/>
                 <w:sz w:val="20"/>
               </w:rPr>
               <w:t>Operator Initials &amp; Date</w:t>
@@ -943,7 +1075,7 @@
       <w:tr>
         <w:tc>
           <w:tcPr>
-            <w:tcW w:type="dxa" w:w="2520"/>
+            <w:tcW w:type="dxa" w:w="3200"/>
             <w:tcBorders>
               <w:top w:val="single" w:sz="4" w:color="BFBFBF"/>
               <w:left w:val="single" w:sz="4" w:color="BFBFBF"/>
@@ -956,7 +1088,10 @@
             <w:r/>
             <w:r>
               <w:rPr>
+                <w:rFonts w:ascii="Arial" w:hAnsi="Arial" w:cs="Arial"/>
                 <w:b w:val="0"/>
+                <w:i w:val="0"/>
+                <w:color w:val="5F6368"/>
                 <w:sz w:val="16"/>
               </w:rPr>
               <w:t>{%tr for eq in equipment %}</w:t>
@@ -965,19 +1100,19 @@
         </w:tc>
         <w:tc>
           <w:tcPr>
-            <w:tcW w:type="dxa" w:w="2520"/>
+            <w:tcW w:type="dxa" w:w="2200"/>
           </w:tcPr>
           <w:p/>
         </w:tc>
         <w:tc>
           <w:tcPr>
-            <w:tcW w:type="dxa" w:w="2520"/>
+            <w:tcW w:type="dxa" w:w="2600"/>
           </w:tcPr>
           <w:p/>
         </w:tc>
         <w:tc>
           <w:tcPr>
-            <w:tcW w:type="dxa" w:w="2520"/>
+            <w:tcW w:type="dxa" w:w="2000"/>
           </w:tcPr>
           <w:p/>
         </w:tc>
@@ -985,7 +1120,7 @@
       <w:tr>
         <w:tc>
           <w:tcPr>
-            <w:tcW w:type="dxa" w:w="2520"/>
+            <w:tcW w:type="dxa" w:w="3200"/>
             <w:tcBorders>
               <w:top w:val="single" w:sz="4" w:color="BFBFBF"/>
               <w:left w:val="single" w:sz="4" w:color="BFBFBF"/>
@@ -998,7 +1133,10 @@
             <w:r/>
             <w:r>
               <w:rPr>
+                <w:rFonts w:ascii="Arial" w:hAnsi="Arial" w:cs="Arial"/>
                 <w:b w:val="0"/>
+                <w:i w:val="0"/>
+                <w:color w:val="000000"/>
                 <w:sz w:val="20"/>
               </w:rPr>
               <w:t>{{ eq.name }}</w:t>
@@ -1007,7 +1145,7 @@
         </w:tc>
         <w:tc>
           <w:tcPr>
-            <w:tcW w:type="dxa" w:w="2520"/>
+            <w:tcW w:type="dxa" w:w="2200"/>
             <w:tcBorders>
               <w:top w:val="single" w:sz="4" w:color="BFBFBF"/>
               <w:left w:val="single" w:sz="4" w:color="BFBFBF"/>
@@ -1020,7 +1158,10 @@
             <w:r/>
             <w:r>
               <w:rPr>
+                <w:rFonts w:ascii="Arial" w:hAnsi="Arial" w:cs="Arial"/>
                 <w:b w:val="0"/>
+                <w:i w:val="0"/>
+                <w:color w:val="000000"/>
                 <w:sz w:val="20"/>
               </w:rPr>
               <w:t>{{ eq.asset_id }}</w:t>
@@ -1029,7 +1170,7 @@
         </w:tc>
         <w:tc>
           <w:tcPr>
-            <w:tcW w:type="dxa" w:w="2520"/>
+            <w:tcW w:type="dxa" w:w="2600"/>
             <w:tcBorders>
               <w:top w:val="single" w:sz="4" w:color="BFBFBF"/>
               <w:left w:val="single" w:sz="4" w:color="BFBFBF"/>
@@ -1042,7 +1183,10 @@
             <w:r/>
             <w:r>
               <w:rPr>
+                <w:rFonts w:ascii="Arial" w:hAnsi="Arial" w:cs="Arial"/>
                 <w:b w:val="0"/>
+                <w:i w:val="0"/>
+                <w:color w:val="000000"/>
                 <w:sz w:val="20"/>
               </w:rPr>
               <w:t>{{ eq.calibration }}</w:t>
@@ -1051,7 +1195,7 @@
         </w:tc>
         <w:tc>
           <w:tcPr>
-            <w:tcW w:type="dxa" w:w="2520"/>
+            <w:tcW w:type="dxa" w:w="2000"/>
             <w:tcBorders>
               <w:top w:val="single" w:sz="4" w:color="BFBFBF"/>
               <w:left w:val="single" w:sz="4" w:color="BFBFBF"/>
@@ -1064,7 +1208,10 @@
             <w:r/>
             <w:r>
               <w:rPr>
+                <w:rFonts w:ascii="Arial" w:hAnsi="Arial" w:cs="Arial"/>
                 <w:b w:val="0"/>
+                <w:i w:val="0"/>
+                <w:color w:val="000000"/>
                 <w:sz w:val="20"/>
               </w:rPr>
               <w:t>{{ eq.operator }}</w:t>
@@ -1075,7 +1222,7 @@
       <w:tr>
         <w:tc>
           <w:tcPr>
-            <w:tcW w:type="dxa" w:w="2520"/>
+            <w:tcW w:type="dxa" w:w="3200"/>
             <w:tcBorders>
               <w:top w:val="single" w:sz="4" w:color="BFBFBF"/>
               <w:left w:val="single" w:sz="4" w:color="BFBFBF"/>
@@ -1088,7 +1235,10 @@
             <w:r/>
             <w:r>
               <w:rPr>
+                <w:rFonts w:ascii="Arial" w:hAnsi="Arial" w:cs="Arial"/>
                 <w:b w:val="0"/>
+                <w:i w:val="0"/>
+                <w:color w:val="5F6368"/>
                 <w:sz w:val="16"/>
               </w:rPr>
               <w:t>{%tr endfor %}</w:t>
@@ -1097,19 +1247,19 @@
         </w:tc>
         <w:tc>
           <w:tcPr>
-            <w:tcW w:type="dxa" w:w="2520"/>
+            <w:tcW w:type="dxa" w:w="2200"/>
           </w:tcPr>
           <w:p/>
         </w:tc>
         <w:tc>
           <w:tcPr>
-            <w:tcW w:type="dxa" w:w="2520"/>
+            <w:tcW w:type="dxa" w:w="2600"/>
           </w:tcPr>
           <w:p/>
         </w:tc>
         <w:tc>
           <w:tcPr>
-            <w:tcW w:type="dxa" w:w="2520"/>
+            <w:tcW w:type="dxa" w:w="2000"/>
           </w:tcPr>
           <w:p/>
         </w:tc>
@@ -1117,7 +1267,7 @@
       <w:tr>
         <w:tc>
           <w:tcPr>
-            <w:tcW w:type="dxa" w:w="2520"/>
+            <w:tcW w:type="dxa" w:w="3200"/>
             <w:tcBorders>
               <w:top w:val="single" w:sz="4" w:color="BFBFBF"/>
               <w:left w:val="single" w:sz="4" w:color="BFBFBF"/>
@@ -1130,7 +1280,10 @@
             <w:r/>
             <w:r>
               <w:rPr>
+                <w:rFonts w:ascii="Arial" w:hAnsi="Arial" w:cs="Arial"/>
                 <w:b w:val="0"/>
+                <w:i w:val="0"/>
+                <w:color w:val="000000"/>
                 <w:sz w:val="20"/>
               </w:rPr>
             </w:r>
@@ -1138,7 +1291,7 @@
         </w:tc>
         <w:tc>
           <w:tcPr>
-            <w:tcW w:type="dxa" w:w="2520"/>
+            <w:tcW w:type="dxa" w:w="2200"/>
             <w:tcBorders>
               <w:top w:val="single" w:sz="4" w:color="BFBFBF"/>
               <w:left w:val="single" w:sz="4" w:color="BFBFBF"/>
@@ -1151,7 +1304,10 @@
             <w:r/>
             <w:r>
               <w:rPr>
+                <w:rFonts w:ascii="Arial" w:hAnsi="Arial" w:cs="Arial"/>
                 <w:b w:val="0"/>
+                <w:i w:val="0"/>
+                <w:color w:val="000000"/>
                 <w:sz w:val="20"/>
               </w:rPr>
             </w:r>
@@ -1159,7 +1315,7 @@
         </w:tc>
         <w:tc>
           <w:tcPr>
-            <w:tcW w:type="dxa" w:w="2520"/>
+            <w:tcW w:type="dxa" w:w="2600"/>
             <w:tcBorders>
               <w:top w:val="single" w:sz="4" w:color="BFBFBF"/>
               <w:left w:val="single" w:sz="4" w:color="BFBFBF"/>
@@ -1172,7 +1328,10 @@
             <w:r/>
             <w:r>
               <w:rPr>
+                <w:rFonts w:ascii="Arial" w:hAnsi="Arial" w:cs="Arial"/>
                 <w:b w:val="0"/>
+                <w:i w:val="0"/>
+                <w:color w:val="000000"/>
                 <w:sz w:val="20"/>
               </w:rPr>
             </w:r>
@@ -1180,7 +1339,7 @@
         </w:tc>
         <w:tc>
           <w:tcPr>
-            <w:tcW w:type="dxa" w:w="2520"/>
+            <w:tcW w:type="dxa" w:w="2000"/>
             <w:tcBorders>
               <w:top w:val="single" w:sz="4" w:color="BFBFBF"/>
               <w:left w:val="single" w:sz="4" w:color="BFBFBF"/>
@@ -1193,7 +1352,10 @@
             <w:r/>
             <w:r>
               <w:rPr>
+                <w:rFonts w:ascii="Arial" w:hAnsi="Arial" w:cs="Arial"/>
                 <w:b w:val="0"/>
+                <w:i w:val="0"/>
+                <w:color w:val="000000"/>
                 <w:sz w:val="20"/>
               </w:rPr>
             </w:r>
@@ -1203,39 +1365,60 @@
     </w:tbl>
     <w:p>
       <w:pPr>
-        <w:spacing w:before="240" w:after="80"/>
+        <w:keepNext/>
+        <w:spacing w:before="280" w:after="80"/>
       </w:pPr>
       <w:r>
         <w:rPr>
+          <w:rFonts w:ascii="Arial" w:hAnsi="Arial" w:cs="Arial"/>
           <w:b/>
-          <w:color w:val="1F2937"/>
-          <w:sz w:val="28"/>
+          <w:i w:val="0"/>
+          <w:color w:val="000000"/>
+          <w:sz w:val="26"/>
         </w:rPr>
         <w:t>4. Execution: Unit Operations</w:t>
       </w:r>
     </w:p>
     <w:p>
+      <w:pPr>
+        <w:spacing w:after="80"/>
+      </w:pPr>
       <w:r>
         <w:rPr>
+          <w:rFonts w:ascii="Arial" w:hAnsi="Arial" w:cs="Arial"/>
           <w:b w:val="0"/>
           <w:i/>
-          <w:color w:val="64748B"/>
+          <w:color w:val="5F6368"/>
           <w:sz w:val="18"/>
         </w:rPr>
-        <w:t>Execute process steps. Unlike GMP, second-person verification (Verifier) is not always strictly mandated for all steps in development/tox manufacturing — apply per your SOP.</w:t>
+        <w:t>Execute process steps. Record actual values, operator, and verifier (if required by SOP) for each step.</w:t>
       </w:r>
     </w:p>
     <w:p>
+      <w:pPr>
+        <w:spacing w:before="0" w:after="0"/>
+      </w:pPr>
       <w:r>
         <w:rPr>
+          <w:rFonts w:ascii="Arial" w:hAnsi="Arial" w:cs="Arial"/>
+          <w:b w:val="0"/>
+          <w:i w:val="0"/>
+          <w:color w:val="5F6368"/>
           <w:sz w:val="16"/>
         </w:rPr>
         <w:t>{%p if is_role_based and roles|length &gt; 1 %}</w:t>
       </w:r>
     </w:p>
     <w:p>
+      <w:pPr>
+        <w:spacing w:before="0" w:after="0"/>
+      </w:pPr>
       <w:r>
         <w:rPr>
+          <w:rFonts w:ascii="Arial" w:hAnsi="Arial" w:cs="Arial"/>
+          <w:b w:val="0"/>
+          <w:i w:val="0"/>
+          <w:color w:val="5F6368"/>
           <w:sz w:val="16"/>
         </w:rPr>
         <w:t>{%p for role in roles %}</w:t>
@@ -1243,13 +1426,16 @@
     </w:p>
     <w:p>
       <w:pPr>
-        <w:spacing w:before="200" w:after="80"/>
+        <w:keepNext/>
+        <w:spacing w:before="160" w:after="80"/>
       </w:pPr>
       <w:r>
         <w:rPr>
+          <w:rFonts w:ascii="Arial" w:hAnsi="Arial" w:cs="Arial"/>
           <w:b/>
-          <w:color w:val="1F2937"/>
-          <w:sz w:val="24"/>
+          <w:i w:val="0"/>
+          <w:color w:val="000000"/>
+          <w:sz w:val="22"/>
         </w:rPr>
         <w:t>4.{{ loop.index }}  {{ role.process_name or role.name }}</w:t>
       </w:r>
@@ -1258,6 +1444,7 @@
       <w:tblPr>
         <w:tblW w:type="auto" w:w="0"/>
         <w:tblLook w:firstColumn="1" w:firstRow="1" w:lastColumn="0" w:lastRow="0" w:noHBand="0" w:noVBand="1" w:val="04A0"/>
+        <w:tblLayout w:type="fixed"/>
       </w:tblPr>
       <w:tblGrid>
         <w:gridCol w:w="1680"/>
@@ -1270,8 +1457,8 @@
       <w:tr>
         <w:tc>
           <w:tcPr>
-            <w:tcW w:type="dxa" w:w="1680"/>
-            <w:shd w:val="clear" w:color="auto" w:fill="1F2937"/>
+            <w:tcW w:type="dxa" w:w="800"/>
+            <w:shd w:val="clear" w:color="auto" w:fill="E8EAED"/>
             <w:tcBorders>
               <w:top w:val="single" w:sz="4" w:color="BFBFBF"/>
               <w:left w:val="single" w:sz="4" w:color="BFBFBF"/>
@@ -1284,8 +1471,10 @@
             <w:r/>
             <w:r>
               <w:rPr>
+                <w:rFonts w:ascii="Arial" w:hAnsi="Arial" w:cs="Arial"/>
                 <w:b/>
-                <w:color w:val="FFFFFF"/>
+                <w:i w:val="0"/>
+                <w:color w:val="000000"/>
                 <w:sz w:val="20"/>
               </w:rPr>
               <w:t>Step</w:t>
@@ -1294,8 +1483,8 @@
         </w:tc>
         <w:tc>
           <w:tcPr>
-            <w:tcW w:type="dxa" w:w="1680"/>
-            <w:shd w:val="clear" w:color="auto" w:fill="1F2937"/>
+            <w:tcW w:type="dxa" w:w="2600"/>
+            <w:shd w:val="clear" w:color="auto" w:fill="E8EAED"/>
             <w:tcBorders>
               <w:top w:val="single" w:sz="4" w:color="BFBFBF"/>
               <w:left w:val="single" w:sz="4" w:color="BFBFBF"/>
@@ -1308,8 +1497,10 @@
             <w:r/>
             <w:r>
               <w:rPr>
+                <w:rFonts w:ascii="Arial" w:hAnsi="Arial" w:cs="Arial"/>
                 <w:b/>
-                <w:color w:val="FFFFFF"/>
+                <w:i w:val="0"/>
+                <w:color w:val="000000"/>
                 <w:sz w:val="20"/>
               </w:rPr>
               <w:t>Instruction</w:t>
@@ -1318,8 +1509,8 @@
         </w:tc>
         <w:tc>
           <w:tcPr>
-            <w:tcW w:type="dxa" w:w="1680"/>
-            <w:shd w:val="clear" w:color="auto" w:fill="1F2937"/>
+            <w:tcW w:type="dxa" w:w="2600"/>
+            <w:shd w:val="clear" w:color="auto" w:fill="E8EAED"/>
             <w:tcBorders>
               <w:top w:val="single" w:sz="4" w:color="BFBFBF"/>
               <w:left w:val="single" w:sz="4" w:color="BFBFBF"/>
@@ -1332,8 +1523,10 @@
             <w:r/>
             <w:r>
               <w:rPr>
+                <w:rFonts w:ascii="Arial" w:hAnsi="Arial" w:cs="Arial"/>
                 <w:b/>
-                <w:color w:val="FFFFFF"/>
+                <w:i w:val="0"/>
+                <w:color w:val="000000"/>
                 <w:sz w:val="20"/>
               </w:rPr>
               <w:t>Target Parameter</w:t>
@@ -1342,8 +1535,8 @@
         </w:tc>
         <w:tc>
           <w:tcPr>
-            <w:tcW w:type="dxa" w:w="1680"/>
-            <w:shd w:val="clear" w:color="auto" w:fill="1F2937"/>
+            <w:tcW w:type="dxa" w:w="1600"/>
+            <w:shd w:val="clear" w:color="auto" w:fill="E8EAED"/>
             <w:tcBorders>
               <w:top w:val="single" w:sz="4" w:color="BFBFBF"/>
               <w:left w:val="single" w:sz="4" w:color="BFBFBF"/>
@@ -1356,8 +1549,10 @@
             <w:r/>
             <w:r>
               <w:rPr>
+                <w:rFonts w:ascii="Arial" w:hAnsi="Arial" w:cs="Arial"/>
                 <w:b/>
-                <w:color w:val="FFFFFF"/>
+                <w:i w:val="0"/>
+                <w:color w:val="000000"/>
                 <w:sz w:val="20"/>
               </w:rPr>
               <w:t>Actual Value</w:t>
@@ -1366,8 +1561,8 @@
         </w:tc>
         <w:tc>
           <w:tcPr>
-            <w:tcW w:type="dxa" w:w="1680"/>
-            <w:shd w:val="clear" w:color="auto" w:fill="1F2937"/>
+            <w:tcW w:type="dxa" w:w="1000"/>
+            <w:shd w:val="clear" w:color="auto" w:fill="E8EAED"/>
             <w:tcBorders>
               <w:top w:val="single" w:sz="4" w:color="BFBFBF"/>
               <w:left w:val="single" w:sz="4" w:color="BFBFBF"/>
@@ -1380,8 +1575,10 @@
             <w:r/>
             <w:r>
               <w:rPr>
+                <w:rFonts w:ascii="Arial" w:hAnsi="Arial" w:cs="Arial"/>
                 <w:b/>
-                <w:color w:val="FFFFFF"/>
+                <w:i w:val="0"/>
+                <w:color w:val="000000"/>
                 <w:sz w:val="20"/>
               </w:rPr>
               <w:t>Operator</w:t>
@@ -1390,8 +1587,8 @@
         </w:tc>
         <w:tc>
           <w:tcPr>
-            <w:tcW w:type="dxa" w:w="1680"/>
-            <w:shd w:val="clear" w:color="auto" w:fill="1F2937"/>
+            <w:tcW w:type="dxa" w:w="1000"/>
+            <w:shd w:val="clear" w:color="auto" w:fill="E8EAED"/>
             <w:tcBorders>
               <w:top w:val="single" w:sz="4" w:color="BFBFBF"/>
               <w:left w:val="single" w:sz="4" w:color="BFBFBF"/>
@@ -1404,8 +1601,10 @@
             <w:r/>
             <w:r>
               <w:rPr>
+                <w:rFonts w:ascii="Arial" w:hAnsi="Arial" w:cs="Arial"/>
                 <w:b/>
-                <w:color w:val="FFFFFF"/>
+                <w:i w:val="0"/>
+                <w:color w:val="000000"/>
                 <w:sz w:val="20"/>
               </w:rPr>
               <w:t>Verifier</w:t>
@@ -1416,7 +1615,7 @@
       <w:tr>
         <w:tc>
           <w:tcPr>
-            <w:tcW w:type="dxa" w:w="1680"/>
+            <w:tcW w:type="dxa" w:w="800"/>
             <w:tcBorders>
               <w:top w:val="single" w:sz="4" w:color="BFBFBF"/>
               <w:left w:val="single" w:sz="4" w:color="BFBFBF"/>
@@ -1429,7 +1628,10 @@
             <w:r/>
             <w:r>
               <w:rPr>
+                <w:rFonts w:ascii="Arial" w:hAnsi="Arial" w:cs="Arial"/>
                 <w:b w:val="0"/>
+                <w:i w:val="0"/>
+                <w:color w:val="5F6368"/>
                 <w:sz w:val="16"/>
               </w:rPr>
               <w:t>{%tr for step in role.steps %}</w:t>
@@ -1438,31 +1640,31 @@
         </w:tc>
         <w:tc>
           <w:tcPr>
-            <w:tcW w:type="dxa" w:w="1680"/>
+            <w:tcW w:type="dxa" w:w="2600"/>
           </w:tcPr>
           <w:p/>
         </w:tc>
         <w:tc>
           <w:tcPr>
-            <w:tcW w:type="dxa" w:w="1680"/>
+            <w:tcW w:type="dxa" w:w="2600"/>
           </w:tcPr>
           <w:p/>
         </w:tc>
         <w:tc>
           <w:tcPr>
-            <w:tcW w:type="dxa" w:w="1680"/>
+            <w:tcW w:type="dxa" w:w="1600"/>
           </w:tcPr>
           <w:p/>
         </w:tc>
         <w:tc>
           <w:tcPr>
-            <w:tcW w:type="dxa" w:w="1680"/>
+            <w:tcW w:type="dxa" w:w="1000"/>
           </w:tcPr>
           <w:p/>
         </w:tc>
         <w:tc>
           <w:tcPr>
-            <w:tcW w:type="dxa" w:w="1680"/>
+            <w:tcW w:type="dxa" w:w="1000"/>
           </w:tcPr>
           <w:p/>
         </w:tc>
@@ -1470,7 +1672,7 @@
       <w:tr>
         <w:tc>
           <w:tcPr>
-            <w:tcW w:type="dxa" w:w="1680"/>
+            <w:tcW w:type="dxa" w:w="800"/>
             <w:tcBorders>
               <w:top w:val="single" w:sz="4" w:color="BFBFBF"/>
               <w:left w:val="single" w:sz="4" w:color="BFBFBF"/>
@@ -1486,7 +1688,10 @@
             <w:r/>
             <w:r>
               <w:rPr>
+                <w:rFonts w:ascii="Arial" w:hAnsi="Arial" w:cs="Arial"/>
                 <w:b w:val="0"/>
+                <w:i w:val="0"/>
+                <w:color w:val="000000"/>
                 <w:sz w:val="20"/>
               </w:rPr>
               <w:t>{{ loop.index }}</w:t>
@@ -1495,7 +1700,7 @@
         </w:tc>
         <w:tc>
           <w:tcPr>
-            <w:tcW w:type="dxa" w:w="1680"/>
+            <w:tcW w:type="dxa" w:w="2600"/>
             <w:tcBorders>
               <w:top w:val="single" w:sz="4" w:color="BFBFBF"/>
               <w:left w:val="single" w:sz="4" w:color="BFBFBF"/>
@@ -1508,7 +1713,10 @@
             <w:r/>
             <w:r>
               <w:rPr>
+                <w:rFonts w:ascii="Arial" w:hAnsi="Arial" w:cs="Arial"/>
                 <w:b w:val="0"/>
+                <w:i w:val="0"/>
+                <w:color w:val="000000"/>
                 <w:sz w:val="20"/>
               </w:rPr>
               <w:t>{{ step.name }}</w:t>
@@ -1517,7 +1725,7 @@
         </w:tc>
         <w:tc>
           <w:tcPr>
-            <w:tcW w:type="dxa" w:w="1680"/>
+            <w:tcW w:type="dxa" w:w="2600"/>
             <w:tcBorders>
               <w:top w:val="single" w:sz="4" w:color="BFBFBF"/>
               <w:left w:val="single" w:sz="4" w:color="BFBFBF"/>
@@ -1530,7 +1738,10 @@
             <w:r/>
             <w:r>
               <w:rPr>
+                <w:rFonts w:ascii="Arial" w:hAnsi="Arial" w:cs="Arial"/>
                 <w:b w:val="0"/>
+                <w:i w:val="0"/>
+                <w:color w:val="000000"/>
                 <w:sz w:val="18"/>
               </w:rPr>
               <w:t>{{ step.description }}</w:t>
@@ -1539,18 +1750,23 @@
         </w:tc>
         <w:tc>
           <w:tcPr>
-            <w:tcW w:type="dxa" w:w="1680"/>
+            <w:tcW w:type="dxa" w:w="1600"/>
             <w:tcBorders>
               <w:top w:val="single" w:sz="4" w:color="BFBFBF"/>
               <w:left w:val="single" w:sz="4" w:color="BFBFBF"/>
               <w:bottom w:val="single" w:sz="4" w:color="BFBFBF"/>
               <w:right w:val="single" w:sz="4" w:color="BFBFBF"/>
             </w:tcBorders>
+            <w:vAlign w:val="center"/>
           </w:tcPr>
           <w:p>
             <w:r/>
             <w:r>
               <w:rPr>
+                <w:rFonts w:ascii="Arial" w:hAnsi="Arial" w:cs="Arial"/>
+                <w:b w:val="0"/>
+                <w:i w:val="0"/>
+                <w:color w:val="000000"/>
                 <w:sz w:val="20"/>
               </w:rPr>
               <w:t>{{r step.value_display }}</w:t>
@@ -1559,7 +1775,7 @@
         </w:tc>
         <w:tc>
           <w:tcPr>
-            <w:tcW w:type="dxa" w:w="1680"/>
+            <w:tcW w:type="dxa" w:w="1000"/>
             <w:tcBorders>
               <w:top w:val="single" w:sz="4" w:color="BFBFBF"/>
               <w:left w:val="single" w:sz="4" w:color="BFBFBF"/>
@@ -1575,7 +1791,10 @@
             <w:r/>
             <w:r>
               <w:rPr>
+                <w:rFonts w:ascii="Arial" w:hAnsi="Arial" w:cs="Arial"/>
                 <w:b w:val="0"/>
+                <w:i w:val="0"/>
+                <w:color w:val="000000"/>
                 <w:sz w:val="20"/>
               </w:rPr>
               <w:t>{{ step.initials }}</w:t>
@@ -1584,7 +1803,7 @@
         </w:tc>
         <w:tc>
           <w:tcPr>
-            <w:tcW w:type="dxa" w:w="1680"/>
+            <w:tcW w:type="dxa" w:w="1000"/>
             <w:tcBorders>
               <w:top w:val="single" w:sz="4" w:color="BFBFBF"/>
               <w:left w:val="single" w:sz="4" w:color="BFBFBF"/>
@@ -1597,7 +1816,10 @@
             <w:r/>
             <w:r>
               <w:rPr>
+                <w:rFonts w:ascii="Arial" w:hAnsi="Arial" w:cs="Arial"/>
                 <w:b w:val="0"/>
+                <w:i w:val="0"/>
+                <w:color w:val="000000"/>
                 <w:sz w:val="20"/>
               </w:rPr>
             </w:r>
@@ -1607,7 +1829,7 @@
       <w:tr>
         <w:tc>
           <w:tcPr>
-            <w:tcW w:type="dxa" w:w="1680"/>
+            <w:tcW w:type="dxa" w:w="800"/>
             <w:tcBorders>
               <w:top w:val="single" w:sz="4" w:color="BFBFBF"/>
               <w:left w:val="single" w:sz="4" w:color="BFBFBF"/>
@@ -1620,7 +1842,10 @@
             <w:r/>
             <w:r>
               <w:rPr>
+                <w:rFonts w:ascii="Arial" w:hAnsi="Arial" w:cs="Arial"/>
                 <w:b w:val="0"/>
+                <w:i w:val="0"/>
+                <w:color w:val="5F6368"/>
                 <w:sz w:val="16"/>
               </w:rPr>
               <w:t>{%tr endfor %}</w:t>
@@ -1629,47 +1854,61 @@
         </w:tc>
         <w:tc>
           <w:tcPr>
-            <w:tcW w:type="dxa" w:w="1680"/>
+            <w:tcW w:type="dxa" w:w="2600"/>
           </w:tcPr>
           <w:p/>
         </w:tc>
         <w:tc>
           <w:tcPr>
-            <w:tcW w:type="dxa" w:w="1680"/>
+            <w:tcW w:type="dxa" w:w="2600"/>
           </w:tcPr>
           <w:p/>
         </w:tc>
         <w:tc>
           <w:tcPr>
-            <w:tcW w:type="dxa" w:w="1680"/>
+            <w:tcW w:type="dxa" w:w="1600"/>
           </w:tcPr>
           <w:p/>
         </w:tc>
         <w:tc>
           <w:tcPr>
-            <w:tcW w:type="dxa" w:w="1680"/>
+            <w:tcW w:type="dxa" w:w="1000"/>
           </w:tcPr>
           <w:p/>
         </w:tc>
         <w:tc>
           <w:tcPr>
-            <w:tcW w:type="dxa" w:w="1680"/>
+            <w:tcW w:type="dxa" w:w="1000"/>
           </w:tcPr>
           <w:p/>
         </w:tc>
       </w:tr>
     </w:tbl>
     <w:p>
+      <w:pPr>
+        <w:spacing w:before="0" w:after="0"/>
+      </w:pPr>
       <w:r>
         <w:rPr>
+          <w:rFonts w:ascii="Arial" w:hAnsi="Arial" w:cs="Arial"/>
+          <w:b w:val="0"/>
+          <w:i w:val="0"/>
+          <w:color w:val="5F6368"/>
           <w:sz w:val="16"/>
         </w:rPr>
         <w:t>{%p endfor %}</w:t>
       </w:r>
     </w:p>
     <w:p>
+      <w:pPr>
+        <w:spacing w:before="0" w:after="0"/>
+      </w:pPr>
       <w:r>
         <w:rPr>
+          <w:rFonts w:ascii="Arial" w:hAnsi="Arial" w:cs="Arial"/>
+          <w:b w:val="0"/>
+          <w:i w:val="0"/>
+          <w:color w:val="5F6368"/>
           <w:sz w:val="16"/>
         </w:rPr>
         <w:t>{%p else %}</w:t>
@@ -1679,6 +1918,7 @@
       <w:tblPr>
         <w:tblW w:type="auto" w:w="0"/>
         <w:tblLook w:firstColumn="1" w:firstRow="1" w:lastColumn="0" w:lastRow="0" w:noHBand="0" w:noVBand="1" w:val="04A0"/>
+        <w:tblLayout w:type="fixed"/>
       </w:tblPr>
       <w:tblGrid>
         <w:gridCol w:w="1680"/>
@@ -1691,8 +1931,8 @@
       <w:tr>
         <w:tc>
           <w:tcPr>
-            <w:tcW w:type="dxa" w:w="1680"/>
-            <w:shd w:val="clear" w:color="auto" w:fill="1F2937"/>
+            <w:tcW w:type="dxa" w:w="800"/>
+            <w:shd w:val="clear" w:color="auto" w:fill="E8EAED"/>
             <w:tcBorders>
               <w:top w:val="single" w:sz="4" w:color="BFBFBF"/>
               <w:left w:val="single" w:sz="4" w:color="BFBFBF"/>
@@ -1705,8 +1945,10 @@
             <w:r/>
             <w:r>
               <w:rPr>
+                <w:rFonts w:ascii="Arial" w:hAnsi="Arial" w:cs="Arial"/>
                 <w:b/>
-                <w:color w:val="FFFFFF"/>
+                <w:i w:val="0"/>
+                <w:color w:val="000000"/>
                 <w:sz w:val="20"/>
               </w:rPr>
               <w:t>Step</w:t>
@@ -1715,8 +1957,8 @@
         </w:tc>
         <w:tc>
           <w:tcPr>
-            <w:tcW w:type="dxa" w:w="1680"/>
-            <w:shd w:val="clear" w:color="auto" w:fill="1F2937"/>
+            <w:tcW w:type="dxa" w:w="2600"/>
+            <w:shd w:val="clear" w:color="auto" w:fill="E8EAED"/>
             <w:tcBorders>
               <w:top w:val="single" w:sz="4" w:color="BFBFBF"/>
               <w:left w:val="single" w:sz="4" w:color="BFBFBF"/>
@@ -1729,8 +1971,10 @@
             <w:r/>
             <w:r>
               <w:rPr>
+                <w:rFonts w:ascii="Arial" w:hAnsi="Arial" w:cs="Arial"/>
                 <w:b/>
-                <w:color w:val="FFFFFF"/>
+                <w:i w:val="0"/>
+                <w:color w:val="000000"/>
                 <w:sz w:val="20"/>
               </w:rPr>
               <w:t>Instruction</w:t>
@@ -1739,8 +1983,8 @@
         </w:tc>
         <w:tc>
           <w:tcPr>
-            <w:tcW w:type="dxa" w:w="1680"/>
-            <w:shd w:val="clear" w:color="auto" w:fill="1F2937"/>
+            <w:tcW w:type="dxa" w:w="2600"/>
+            <w:shd w:val="clear" w:color="auto" w:fill="E8EAED"/>
             <w:tcBorders>
               <w:top w:val="single" w:sz="4" w:color="BFBFBF"/>
               <w:left w:val="single" w:sz="4" w:color="BFBFBF"/>
@@ -1753,8 +1997,10 @@
             <w:r/>
             <w:r>
               <w:rPr>
+                <w:rFonts w:ascii="Arial" w:hAnsi="Arial" w:cs="Arial"/>
                 <w:b/>
-                <w:color w:val="FFFFFF"/>
+                <w:i w:val="0"/>
+                <w:color w:val="000000"/>
                 <w:sz w:val="20"/>
               </w:rPr>
               <w:t>Target Parameter</w:t>
@@ -1763,8 +2009,8 @@
         </w:tc>
         <w:tc>
           <w:tcPr>
-            <w:tcW w:type="dxa" w:w="1680"/>
-            <w:shd w:val="clear" w:color="auto" w:fill="1F2937"/>
+            <w:tcW w:type="dxa" w:w="1600"/>
+            <w:shd w:val="clear" w:color="auto" w:fill="E8EAED"/>
             <w:tcBorders>
               <w:top w:val="single" w:sz="4" w:color="BFBFBF"/>
               <w:left w:val="single" w:sz="4" w:color="BFBFBF"/>
@@ -1777,8 +2023,10 @@
             <w:r/>
             <w:r>
               <w:rPr>
+                <w:rFonts w:ascii="Arial" w:hAnsi="Arial" w:cs="Arial"/>
                 <w:b/>
-                <w:color w:val="FFFFFF"/>
+                <w:i w:val="0"/>
+                <w:color w:val="000000"/>
                 <w:sz w:val="20"/>
               </w:rPr>
               <w:t>Actual Value</w:t>
@@ -1787,8 +2035,8 @@
         </w:tc>
         <w:tc>
           <w:tcPr>
-            <w:tcW w:type="dxa" w:w="1680"/>
-            <w:shd w:val="clear" w:color="auto" w:fill="1F2937"/>
+            <w:tcW w:type="dxa" w:w="1000"/>
+            <w:shd w:val="clear" w:color="auto" w:fill="E8EAED"/>
             <w:tcBorders>
               <w:top w:val="single" w:sz="4" w:color="BFBFBF"/>
               <w:left w:val="single" w:sz="4" w:color="BFBFBF"/>
@@ -1801,8 +2049,10 @@
             <w:r/>
             <w:r>
               <w:rPr>
+                <w:rFonts w:ascii="Arial" w:hAnsi="Arial" w:cs="Arial"/>
                 <w:b/>
-                <w:color w:val="FFFFFF"/>
+                <w:i w:val="0"/>
+                <w:color w:val="000000"/>
                 <w:sz w:val="20"/>
               </w:rPr>
               <w:t>Operator</w:t>
@@ -1811,8 +2061,8 @@
         </w:tc>
         <w:tc>
           <w:tcPr>
-            <w:tcW w:type="dxa" w:w="1680"/>
-            <w:shd w:val="clear" w:color="auto" w:fill="1F2937"/>
+            <w:tcW w:type="dxa" w:w="1000"/>
+            <w:shd w:val="clear" w:color="auto" w:fill="E8EAED"/>
             <w:tcBorders>
               <w:top w:val="single" w:sz="4" w:color="BFBFBF"/>
               <w:left w:val="single" w:sz="4" w:color="BFBFBF"/>
@@ -1825,8 +2075,10 @@
             <w:r/>
             <w:r>
               <w:rPr>
+                <w:rFonts w:ascii="Arial" w:hAnsi="Arial" w:cs="Arial"/>
                 <w:b/>
-                <w:color w:val="FFFFFF"/>
+                <w:i w:val="0"/>
+                <w:color w:val="000000"/>
                 <w:sz w:val="20"/>
               </w:rPr>
               <w:t>Verifier</w:t>
@@ -1837,7 +2089,7 @@
       <w:tr>
         <w:tc>
           <w:tcPr>
-            <w:tcW w:type="dxa" w:w="1680"/>
+            <w:tcW w:type="dxa" w:w="800"/>
             <w:tcBorders>
               <w:top w:val="single" w:sz="4" w:color="BFBFBF"/>
               <w:left w:val="single" w:sz="4" w:color="BFBFBF"/>
@@ -1850,7 +2102,10 @@
             <w:r/>
             <w:r>
               <w:rPr>
+                <w:rFonts w:ascii="Arial" w:hAnsi="Arial" w:cs="Arial"/>
                 <w:b w:val="0"/>
+                <w:i w:val="0"/>
+                <w:color w:val="5F6368"/>
                 <w:sz w:val="16"/>
               </w:rPr>
               <w:t>{%tr for step in steps %}</w:t>
@@ -1859,31 +2114,31 @@
         </w:tc>
         <w:tc>
           <w:tcPr>
-            <w:tcW w:type="dxa" w:w="1680"/>
+            <w:tcW w:type="dxa" w:w="2600"/>
           </w:tcPr>
           <w:p/>
         </w:tc>
         <w:tc>
           <w:tcPr>
-            <w:tcW w:type="dxa" w:w="1680"/>
+            <w:tcW w:type="dxa" w:w="2600"/>
           </w:tcPr>
           <w:p/>
         </w:tc>
         <w:tc>
           <w:tcPr>
-            <w:tcW w:type="dxa" w:w="1680"/>
+            <w:tcW w:type="dxa" w:w="1600"/>
           </w:tcPr>
           <w:p/>
         </w:tc>
         <w:tc>
           <w:tcPr>
-            <w:tcW w:type="dxa" w:w="1680"/>
+            <w:tcW w:type="dxa" w:w="1000"/>
           </w:tcPr>
           <w:p/>
         </w:tc>
         <w:tc>
           <w:tcPr>
-            <w:tcW w:type="dxa" w:w="1680"/>
+            <w:tcW w:type="dxa" w:w="1000"/>
           </w:tcPr>
           <w:p/>
         </w:tc>
@@ -1891,7 +2146,7 @@
       <w:tr>
         <w:tc>
           <w:tcPr>
-            <w:tcW w:type="dxa" w:w="1680"/>
+            <w:tcW w:type="dxa" w:w="800"/>
             <w:tcBorders>
               <w:top w:val="single" w:sz="4" w:color="BFBFBF"/>
               <w:left w:val="single" w:sz="4" w:color="BFBFBF"/>
@@ -1907,7 +2162,10 @@
             <w:r/>
             <w:r>
               <w:rPr>
+                <w:rFonts w:ascii="Arial" w:hAnsi="Arial" w:cs="Arial"/>
                 <w:b w:val="0"/>
+                <w:i w:val="0"/>
+                <w:color w:val="000000"/>
                 <w:sz w:val="20"/>
               </w:rPr>
               <w:t>{{ loop.index }}</w:t>
@@ -1916,7 +2174,7 @@
         </w:tc>
         <w:tc>
           <w:tcPr>
-            <w:tcW w:type="dxa" w:w="1680"/>
+            <w:tcW w:type="dxa" w:w="2600"/>
             <w:tcBorders>
               <w:top w:val="single" w:sz="4" w:color="BFBFBF"/>
               <w:left w:val="single" w:sz="4" w:color="BFBFBF"/>
@@ -1929,7 +2187,10 @@
             <w:r/>
             <w:r>
               <w:rPr>
+                <w:rFonts w:ascii="Arial" w:hAnsi="Arial" w:cs="Arial"/>
                 <w:b w:val="0"/>
+                <w:i w:val="0"/>
+                <w:color w:val="000000"/>
                 <w:sz w:val="20"/>
               </w:rPr>
               <w:t>{{ step.name }}</w:t>
@@ -1938,7 +2199,7 @@
         </w:tc>
         <w:tc>
           <w:tcPr>
-            <w:tcW w:type="dxa" w:w="1680"/>
+            <w:tcW w:type="dxa" w:w="2600"/>
             <w:tcBorders>
               <w:top w:val="single" w:sz="4" w:color="BFBFBF"/>
               <w:left w:val="single" w:sz="4" w:color="BFBFBF"/>
@@ -1951,7 +2212,10 @@
             <w:r/>
             <w:r>
               <w:rPr>
+                <w:rFonts w:ascii="Arial" w:hAnsi="Arial" w:cs="Arial"/>
                 <w:b w:val="0"/>
+                <w:i w:val="0"/>
+                <w:color w:val="000000"/>
                 <w:sz w:val="18"/>
               </w:rPr>
               <w:t>{{ step.description }}</w:t>
@@ -1960,18 +2224,23 @@
         </w:tc>
         <w:tc>
           <w:tcPr>
-            <w:tcW w:type="dxa" w:w="1680"/>
+            <w:tcW w:type="dxa" w:w="1600"/>
             <w:tcBorders>
               <w:top w:val="single" w:sz="4" w:color="BFBFBF"/>
               <w:left w:val="single" w:sz="4" w:color="BFBFBF"/>
               <w:bottom w:val="single" w:sz="4" w:color="BFBFBF"/>
               <w:right w:val="single" w:sz="4" w:color="BFBFBF"/>
             </w:tcBorders>
+            <w:vAlign w:val="center"/>
           </w:tcPr>
           <w:p>
             <w:r/>
             <w:r>
               <w:rPr>
+                <w:rFonts w:ascii="Arial" w:hAnsi="Arial" w:cs="Arial"/>
+                <w:b w:val="0"/>
+                <w:i w:val="0"/>
+                <w:color w:val="000000"/>
                 <w:sz w:val="20"/>
               </w:rPr>
               <w:t>{{r step.value_display }}</w:t>
@@ -1980,7 +2249,7 @@
         </w:tc>
         <w:tc>
           <w:tcPr>
-            <w:tcW w:type="dxa" w:w="1680"/>
+            <w:tcW w:type="dxa" w:w="1000"/>
             <w:tcBorders>
               <w:top w:val="single" w:sz="4" w:color="BFBFBF"/>
               <w:left w:val="single" w:sz="4" w:color="BFBFBF"/>
@@ -1996,7 +2265,10 @@
             <w:r/>
             <w:r>
               <w:rPr>
+                <w:rFonts w:ascii="Arial" w:hAnsi="Arial" w:cs="Arial"/>
                 <w:b w:val="0"/>
+                <w:i w:val="0"/>
+                <w:color w:val="000000"/>
                 <w:sz w:val="20"/>
               </w:rPr>
               <w:t>{{ step.initials }}</w:t>
@@ -2005,7 +2277,7 @@
         </w:tc>
         <w:tc>
           <w:tcPr>
-            <w:tcW w:type="dxa" w:w="1680"/>
+            <w:tcW w:type="dxa" w:w="1000"/>
             <w:tcBorders>
               <w:top w:val="single" w:sz="4" w:color="BFBFBF"/>
               <w:left w:val="single" w:sz="4" w:color="BFBFBF"/>
@@ -2018,7 +2290,10 @@
             <w:r/>
             <w:r>
               <w:rPr>
+                <w:rFonts w:ascii="Arial" w:hAnsi="Arial" w:cs="Arial"/>
                 <w:b w:val="0"/>
+                <w:i w:val="0"/>
+                <w:color w:val="000000"/>
                 <w:sz w:val="20"/>
               </w:rPr>
             </w:r>
@@ -2028,7 +2303,7 @@
       <w:tr>
         <w:tc>
           <w:tcPr>
-            <w:tcW w:type="dxa" w:w="1680"/>
+            <w:tcW w:type="dxa" w:w="800"/>
             <w:tcBorders>
               <w:top w:val="single" w:sz="4" w:color="BFBFBF"/>
               <w:left w:val="single" w:sz="4" w:color="BFBFBF"/>
@@ -2041,7 +2316,10 @@
             <w:r/>
             <w:r>
               <w:rPr>
+                <w:rFonts w:ascii="Arial" w:hAnsi="Arial" w:cs="Arial"/>
                 <w:b w:val="0"/>
+                <w:i w:val="0"/>
+                <w:color w:val="5F6368"/>
                 <w:sz w:val="16"/>
               </w:rPr>
               <w:t>{%tr endfor %}</w:t>
@@ -2050,39 +2328,46 @@
         </w:tc>
         <w:tc>
           <w:tcPr>
-            <w:tcW w:type="dxa" w:w="1680"/>
+            <w:tcW w:type="dxa" w:w="2600"/>
           </w:tcPr>
           <w:p/>
         </w:tc>
         <w:tc>
           <w:tcPr>
-            <w:tcW w:type="dxa" w:w="1680"/>
+            <w:tcW w:type="dxa" w:w="2600"/>
           </w:tcPr>
           <w:p/>
         </w:tc>
         <w:tc>
           <w:tcPr>
-            <w:tcW w:type="dxa" w:w="1680"/>
+            <w:tcW w:type="dxa" w:w="1600"/>
           </w:tcPr>
           <w:p/>
         </w:tc>
         <w:tc>
           <w:tcPr>
-            <w:tcW w:type="dxa" w:w="1680"/>
+            <w:tcW w:type="dxa" w:w="1000"/>
           </w:tcPr>
           <w:p/>
         </w:tc>
         <w:tc>
           <w:tcPr>
-            <w:tcW w:type="dxa" w:w="1680"/>
+            <w:tcW w:type="dxa" w:w="1000"/>
           </w:tcPr>
           <w:p/>
         </w:tc>
       </w:tr>
     </w:tbl>
     <w:p>
+      <w:pPr>
+        <w:spacing w:before="0" w:after="0"/>
+      </w:pPr>
       <w:r>
         <w:rPr>
+          <w:rFonts w:ascii="Arial" w:hAnsi="Arial" w:cs="Arial"/>
+          <w:b w:val="0"/>
+          <w:i w:val="0"/>
+          <w:color w:val="5F6368"/>
           <w:sz w:val="16"/>
         </w:rPr>
         <w:t>{%p endif %}</w:t>
@@ -2090,32 +2375,40 @@
     </w:p>
     <w:p>
       <w:pPr>
-        <w:spacing w:before="240" w:after="80"/>
+        <w:keepNext/>
+        <w:spacing w:before="280" w:after="80"/>
       </w:pPr>
       <w:r>
         <w:rPr>
+          <w:rFonts w:ascii="Arial" w:hAnsi="Arial" w:cs="Arial"/>
           <w:b/>
-          <w:color w:val="1F2937"/>
-          <w:sz w:val="28"/>
+          <w:i w:val="0"/>
+          <w:color w:val="000000"/>
+          <w:sz w:val="26"/>
         </w:rPr>
         <w:t>5. Deviations and Process Comments</w:t>
       </w:r>
     </w:p>
     <w:p>
+      <w:pPr>
+        <w:spacing w:after="80"/>
+      </w:pPr>
       <w:r>
         <w:rPr>
+          <w:rFonts w:ascii="Arial" w:hAnsi="Arial" w:cs="Arial"/>
           <w:b w:val="0"/>
           <w:i/>
-          <w:color w:val="64748B"/>
+          <w:color w:val="5F6368"/>
           <w:sz w:val="18"/>
         </w:rPr>
-        <w:t>Log any deviations from the target parameters or standard operating procedures. In development/tox runs, deviations are expected; the key is rigorous documentation. Run notes are surfaced here.</w:t>
+        <w:t>Log any deviations from target parameters or SOP. Run notes and anomalies are surfaced here.</w:t>
       </w:r>
     </w:p>
     <w:tbl>
       <w:tblPr>
         <w:tblW w:type="auto" w:w="0"/>
         <w:tblLook w:firstColumn="1" w:firstRow="1" w:lastColumn="0" w:lastRow="0" w:noHBand="0" w:noVBand="1" w:val="04A0"/>
+        <w:tblLayout w:type="fixed"/>
       </w:tblPr>
       <w:tblGrid>
         <w:gridCol w:w="2520"/>
@@ -2126,8 +2419,8 @@
       <w:tr>
         <w:tc>
           <w:tcPr>
-            <w:tcW w:type="dxa" w:w="2520"/>
-            <w:shd w:val="clear" w:color="auto" w:fill="1F2937"/>
+            <w:tcW w:type="dxa" w:w="1800"/>
+            <w:shd w:val="clear" w:color="auto" w:fill="E8EAED"/>
             <w:tcBorders>
               <w:top w:val="single" w:sz="4" w:color="BFBFBF"/>
               <w:left w:val="single" w:sz="4" w:color="BFBFBF"/>
@@ -2140,8 +2433,10 @@
             <w:r/>
             <w:r>
               <w:rPr>
+                <w:rFonts w:ascii="Arial" w:hAnsi="Arial" w:cs="Arial"/>
                 <w:b/>
-                <w:color w:val="FFFFFF"/>
+                <w:i w:val="0"/>
+                <w:color w:val="000000"/>
                 <w:sz w:val="20"/>
               </w:rPr>
               <w:t>Step / Status Ref.</w:t>
@@ -2150,8 +2445,8 @@
         </w:tc>
         <w:tc>
           <w:tcPr>
-            <w:tcW w:type="dxa" w:w="2520"/>
-            <w:shd w:val="clear" w:color="auto" w:fill="1F2937"/>
+            <w:tcW w:type="dxa" w:w="4400"/>
+            <w:shd w:val="clear" w:color="auto" w:fill="E8EAED"/>
             <w:tcBorders>
               <w:top w:val="single" w:sz="4" w:color="BFBFBF"/>
               <w:left w:val="single" w:sz="4" w:color="BFBFBF"/>
@@ -2164,8 +2459,10 @@
             <w:r/>
             <w:r>
               <w:rPr>
+                <w:rFonts w:ascii="Arial" w:hAnsi="Arial" w:cs="Arial"/>
                 <w:b/>
-                <w:color w:val="FFFFFF"/>
+                <w:i w:val="0"/>
+                <w:color w:val="000000"/>
                 <w:sz w:val="20"/>
               </w:rPr>
               <w:t>Description of Deviation / Observation</w:t>
@@ -2174,8 +2471,8 @@
         </w:tc>
         <w:tc>
           <w:tcPr>
-            <w:tcW w:type="dxa" w:w="2520"/>
-            <w:shd w:val="clear" w:color="auto" w:fill="1F2937"/>
+            <w:tcW w:type="dxa" w:w="1800"/>
+            <w:shd w:val="clear" w:color="auto" w:fill="E8EAED"/>
             <w:tcBorders>
               <w:top w:val="single" w:sz="4" w:color="BFBFBF"/>
               <w:left w:val="single" w:sz="4" w:color="BFBFBF"/>
@@ -2188,8 +2485,10 @@
             <w:r/>
             <w:r>
               <w:rPr>
+                <w:rFonts w:ascii="Arial" w:hAnsi="Arial" w:cs="Arial"/>
                 <w:b/>
-                <w:color w:val="FFFFFF"/>
+                <w:i w:val="0"/>
+                <w:color w:val="000000"/>
                 <w:sz w:val="20"/>
               </w:rPr>
               <w:t>Impact Assessment Required? (Y/N)</w:t>
@@ -2198,8 +2497,8 @@
         </w:tc>
         <w:tc>
           <w:tcPr>
-            <w:tcW w:type="dxa" w:w="2520"/>
-            <w:shd w:val="clear" w:color="auto" w:fill="1F2937"/>
+            <w:tcW w:type="dxa" w:w="2000"/>
+            <w:shd w:val="clear" w:color="auto" w:fill="E8EAED"/>
             <w:tcBorders>
               <w:top w:val="single" w:sz="4" w:color="BFBFBF"/>
               <w:left w:val="single" w:sz="4" w:color="BFBFBF"/>
@@ -2212,8 +2511,10 @@
             <w:r/>
             <w:r>
               <w:rPr>
+                <w:rFonts w:ascii="Arial" w:hAnsi="Arial" w:cs="Arial"/>
                 <w:b/>
-                <w:color w:val="FFFFFF"/>
+                <w:i w:val="0"/>
+                <w:color w:val="000000"/>
                 <w:sz w:val="20"/>
               </w:rPr>
               <w:t>Lead Reviewer Sign-off</w:t>
@@ -2224,7 +2525,7 @@
       <w:tr>
         <w:tc>
           <w:tcPr>
-            <w:tcW w:type="dxa" w:w="2520"/>
+            <w:tcW w:type="dxa" w:w="1800"/>
             <w:tcBorders>
               <w:top w:val="single" w:sz="4" w:color="BFBFBF"/>
               <w:left w:val="single" w:sz="4" w:color="BFBFBF"/>
@@ -2237,7 +2538,10 @@
             <w:r/>
             <w:r>
               <w:rPr>
+                <w:rFonts w:ascii="Arial" w:hAnsi="Arial" w:cs="Arial"/>
                 <w:b w:val="0"/>
+                <w:i w:val="0"/>
+                <w:color w:val="5F6368"/>
                 <w:sz w:val="16"/>
               </w:rPr>
               <w:t>{%tr for note in notes %}</w:t>
@@ -2246,19 +2550,19 @@
         </w:tc>
         <w:tc>
           <w:tcPr>
-            <w:tcW w:type="dxa" w:w="2520"/>
+            <w:tcW w:type="dxa" w:w="4400"/>
           </w:tcPr>
           <w:p/>
         </w:tc>
         <w:tc>
           <w:tcPr>
-            <w:tcW w:type="dxa" w:w="2520"/>
+            <w:tcW w:type="dxa" w:w="1800"/>
           </w:tcPr>
           <w:p/>
         </w:tc>
         <w:tc>
           <w:tcPr>
-            <w:tcW w:type="dxa" w:w="2520"/>
+            <w:tcW w:type="dxa" w:w="2000"/>
           </w:tcPr>
           <w:p/>
         </w:tc>
@@ -2266,7 +2570,7 @@
       <w:tr>
         <w:tc>
           <w:tcPr>
-            <w:tcW w:type="dxa" w:w="2520"/>
+            <w:tcW w:type="dxa" w:w="1800"/>
             <w:tcBorders>
               <w:top w:val="single" w:sz="4" w:color="BFBFBF"/>
               <w:left w:val="single" w:sz="4" w:color="BFBFBF"/>
@@ -2279,7 +2583,10 @@
             <w:r/>
             <w:r>
               <w:rPr>
+                <w:rFonts w:ascii="Arial" w:hAnsi="Arial" w:cs="Arial"/>
                 <w:b w:val="0"/>
+                <w:i w:val="0"/>
+                <w:color w:val="000000"/>
                 <w:sz w:val="20"/>
               </w:rPr>
               <w:t>{{ note.run_status }}</w:t>
@@ -2288,7 +2595,7 @@
         </w:tc>
         <w:tc>
           <w:tcPr>
-            <w:tcW w:type="dxa" w:w="2520"/>
+            <w:tcW w:type="dxa" w:w="4400"/>
             <w:tcBorders>
               <w:top w:val="single" w:sz="4" w:color="BFBFBF"/>
               <w:left w:val="single" w:sz="4" w:color="BFBFBF"/>
@@ -2301,7 +2608,10 @@
             <w:r/>
             <w:r>
               <w:rPr>
+                <w:rFonts w:ascii="Arial" w:hAnsi="Arial" w:cs="Arial"/>
                 <w:b w:val="0"/>
+                <w:i w:val="0"/>
+                <w:color w:val="000000"/>
                 <w:sz w:val="20"/>
               </w:rPr>
               <w:t>{{ note.content }}</w:t>
@@ -2310,7 +2620,7 @@
         </w:tc>
         <w:tc>
           <w:tcPr>
-            <w:tcW w:type="dxa" w:w="2520"/>
+            <w:tcW w:type="dxa" w:w="1800"/>
             <w:tcBorders>
               <w:top w:val="single" w:sz="4" w:color="BFBFBF"/>
               <w:left w:val="single" w:sz="4" w:color="BFBFBF"/>
@@ -2323,7 +2633,10 @@
             <w:r/>
             <w:r>
               <w:rPr>
+                <w:rFonts w:ascii="Arial" w:hAnsi="Arial" w:cs="Arial"/>
                 <w:b w:val="0"/>
+                <w:i w:val="0"/>
+                <w:color w:val="000000"/>
                 <w:sz w:val="20"/>
               </w:rPr>
             </w:r>
@@ -2331,7 +2644,7 @@
         </w:tc>
         <w:tc>
           <w:tcPr>
-            <w:tcW w:type="dxa" w:w="2520"/>
+            <w:tcW w:type="dxa" w:w="2000"/>
             <w:tcBorders>
               <w:top w:val="single" w:sz="4" w:color="BFBFBF"/>
               <w:left w:val="single" w:sz="4" w:color="BFBFBF"/>
@@ -2344,7 +2657,10 @@
             <w:r/>
             <w:r>
               <w:rPr>
+                <w:rFonts w:ascii="Arial" w:hAnsi="Arial" w:cs="Arial"/>
                 <w:b w:val="0"/>
+                <w:i w:val="0"/>
+                <w:color w:val="000000"/>
                 <w:sz w:val="18"/>
               </w:rPr>
               <w:t>{{ note.author_name }}</w:t>
@@ -2357,7 +2673,7 @@
       <w:tr>
         <w:tc>
           <w:tcPr>
-            <w:tcW w:type="dxa" w:w="2520"/>
+            <w:tcW w:type="dxa" w:w="1800"/>
             <w:tcBorders>
               <w:top w:val="single" w:sz="4" w:color="BFBFBF"/>
               <w:left w:val="single" w:sz="4" w:color="BFBFBF"/>
@@ -2370,7 +2686,10 @@
             <w:r/>
             <w:r>
               <w:rPr>
+                <w:rFonts w:ascii="Arial" w:hAnsi="Arial" w:cs="Arial"/>
                 <w:b w:val="0"/>
+                <w:i w:val="0"/>
+                <w:color w:val="5F6368"/>
                 <w:sz w:val="16"/>
               </w:rPr>
               <w:t>{%tr endfor %}</w:t>
@@ -2379,19 +2698,19 @@
         </w:tc>
         <w:tc>
           <w:tcPr>
-            <w:tcW w:type="dxa" w:w="2520"/>
+            <w:tcW w:type="dxa" w:w="4400"/>
           </w:tcPr>
           <w:p/>
         </w:tc>
         <w:tc>
           <w:tcPr>
-            <w:tcW w:type="dxa" w:w="2520"/>
+            <w:tcW w:type="dxa" w:w="1800"/>
           </w:tcPr>
           <w:p/>
         </w:tc>
         <w:tc>
           <w:tcPr>
-            <w:tcW w:type="dxa" w:w="2520"/>
+            <w:tcW w:type="dxa" w:w="2000"/>
           </w:tcPr>
           <w:p/>
         </w:tc>
@@ -2399,7 +2718,7 @@
       <w:tr>
         <w:tc>
           <w:tcPr>
-            <w:tcW w:type="dxa" w:w="2520"/>
+            <w:tcW w:type="dxa" w:w="1800"/>
             <w:tcBorders>
               <w:top w:val="single" w:sz="4" w:color="BFBFBF"/>
               <w:left w:val="single" w:sz="4" w:color="BFBFBF"/>
@@ -2412,7 +2731,10 @@
             <w:r/>
             <w:r>
               <w:rPr>
+                <w:rFonts w:ascii="Arial" w:hAnsi="Arial" w:cs="Arial"/>
                 <w:b w:val="0"/>
+                <w:i w:val="0"/>
+                <w:color w:val="000000"/>
                 <w:sz w:val="20"/>
               </w:rPr>
             </w:r>
@@ -2420,7 +2742,7 @@
         </w:tc>
         <w:tc>
           <w:tcPr>
-            <w:tcW w:type="dxa" w:w="2520"/>
+            <w:tcW w:type="dxa" w:w="4400"/>
             <w:tcBorders>
               <w:top w:val="single" w:sz="4" w:color="BFBFBF"/>
               <w:left w:val="single" w:sz="4" w:color="BFBFBF"/>
@@ -2433,7 +2755,10 @@
             <w:r/>
             <w:r>
               <w:rPr>
+                <w:rFonts w:ascii="Arial" w:hAnsi="Arial" w:cs="Arial"/>
                 <w:b w:val="0"/>
+                <w:i w:val="0"/>
+                <w:color w:val="000000"/>
                 <w:sz w:val="20"/>
               </w:rPr>
             </w:r>
@@ -2441,7 +2766,7 @@
         </w:tc>
         <w:tc>
           <w:tcPr>
-            <w:tcW w:type="dxa" w:w="2520"/>
+            <w:tcW w:type="dxa" w:w="1800"/>
             <w:tcBorders>
               <w:top w:val="single" w:sz="4" w:color="BFBFBF"/>
               <w:left w:val="single" w:sz="4" w:color="BFBFBF"/>
@@ -2454,7 +2779,10 @@
             <w:r/>
             <w:r>
               <w:rPr>
+                <w:rFonts w:ascii="Arial" w:hAnsi="Arial" w:cs="Arial"/>
                 <w:b w:val="0"/>
+                <w:i w:val="0"/>
+                <w:color w:val="000000"/>
                 <w:sz w:val="20"/>
               </w:rPr>
             </w:r>
@@ -2462,7 +2790,7 @@
         </w:tc>
         <w:tc>
           <w:tcPr>
-            <w:tcW w:type="dxa" w:w="2520"/>
+            <w:tcW w:type="dxa" w:w="2000"/>
             <w:tcBorders>
               <w:top w:val="single" w:sz="4" w:color="BFBFBF"/>
               <w:left w:val="single" w:sz="4" w:color="BFBFBF"/>
@@ -2475,7 +2803,10 @@
             <w:r/>
             <w:r>
               <w:rPr>
+                <w:rFonts w:ascii="Arial" w:hAnsi="Arial" w:cs="Arial"/>
                 <w:b w:val="0"/>
+                <w:i w:val="0"/>
+                <w:color w:val="000000"/>
                 <w:sz w:val="20"/>
               </w:rPr>
             </w:r>
@@ -2485,31 +2816,45 @@
     </w:tbl>
     <w:p>
       <w:pPr>
-        <w:spacing w:before="240" w:after="80"/>
+        <w:keepNext/>
+        <w:spacing w:before="280" w:after="80"/>
       </w:pPr>
       <w:r>
         <w:rPr>
+          <w:rFonts w:ascii="Arial" w:hAnsi="Arial" w:cs="Arial"/>
           <w:b/>
-          <w:color w:val="1F2937"/>
-          <w:sz w:val="28"/>
+          <w:i w:val="0"/>
+          <w:color w:val="000000"/>
+          <w:sz w:val="26"/>
         </w:rPr>
         <w:t>6. Final Disposition &amp; Signatures</w:t>
       </w:r>
     </w:p>
     <w:p>
+      <w:pPr>
+        <w:spacing w:after="120"/>
+      </w:pPr>
       <w:r>
         <w:rPr>
+          <w:rFonts w:ascii="Arial" w:hAnsi="Arial" w:cs="Arial"/>
           <w:b w:val="0"/>
           <w:i/>
-          <w:color w:val="64748B"/>
+          <w:color w:val="5F6368"/>
           <w:sz w:val="18"/>
         </w:rPr>
-        <w:t>By signing below, I certify that the material described herein was produced according to the specified process instructions and that all deviations have been reviewed and assessed for impact on the suitability of the material for its intended non-clinical use.</w:t>
+        <w:t>By signing below, the responsible parties certify that the material described herein was produced according to the specified process and that all deviations have been reviewed.</w:t>
       </w:r>
     </w:p>
     <w:p>
+      <w:pPr>
+        <w:spacing w:before="0" w:after="0"/>
+      </w:pPr>
       <w:r>
         <w:rPr>
+          <w:rFonts w:ascii="Arial" w:hAnsi="Arial" w:cs="Arial"/>
+          <w:b w:val="0"/>
+          <w:i w:val="0"/>
+          <w:color w:val="5F6368"/>
           <w:sz w:val="16"/>
         </w:rPr>
         <w:t>{%p if approval %}</w:t>
@@ -2518,8 +2863,10 @@
     <w:p>
       <w:r>
         <w:rPr>
+          <w:rFonts w:ascii="Arial" w:hAnsi="Arial" w:cs="Arial"/>
           <w:b/>
           <w:i w:val="0"/>
+          <w:color w:val="000000"/>
           <w:sz w:val="20"/>
         </w:rPr>
         <w:t>Approved by: {{ approval.approver_name }} &lt;{{ approval.approver_email }}&gt;</w:t>
@@ -2528,17 +2875,25 @@
     <w:p>
       <w:r>
         <w:rPr>
+          <w:rFonts w:ascii="Arial" w:hAnsi="Arial" w:cs="Arial"/>
           <w:b w:val="0"/>
           <w:i w:val="0"/>
-          <w:color w:val="475569"/>
+          <w:color w:val="5F6368"/>
           <w:sz w:val="18"/>
         </w:rPr>
         <w:t>Approved at: {{ approval.approved_at }}    Protocol Version: {{ approval.protocol_version }}</w:t>
       </w:r>
     </w:p>
     <w:p>
+      <w:pPr>
+        <w:spacing w:before="0" w:after="0"/>
+      </w:pPr>
       <w:r>
         <w:rPr>
+          <w:rFonts w:ascii="Arial" w:hAnsi="Arial" w:cs="Arial"/>
+          <w:b w:val="0"/>
+          <w:i w:val="0"/>
+          <w:color w:val="5F6368"/>
           <w:sz w:val="16"/>
         </w:rPr>
         <w:t>{%p if approval.signature_statement %}</w:t>
@@ -2547,25 +2902,40 @@
     <w:p>
       <w:r>
         <w:rPr>
+          <w:rFonts w:ascii="Arial" w:hAnsi="Arial" w:cs="Arial"/>
           <w:b w:val="0"/>
           <w:i/>
-          <w:color w:val="334155"/>
+          <w:color w:val="000000"/>
           <w:sz w:val="18"/>
         </w:rPr>
         <w:t>Statement: "{{ approval.signature_statement }}"</w:t>
       </w:r>
     </w:p>
     <w:p>
+      <w:pPr>
+        <w:spacing w:before="0" w:after="0"/>
+      </w:pPr>
       <w:r>
         <w:rPr>
+          <w:rFonts w:ascii="Arial" w:hAnsi="Arial" w:cs="Arial"/>
+          <w:b w:val="0"/>
+          <w:i w:val="0"/>
+          <w:color w:val="5F6368"/>
           <w:sz w:val="16"/>
         </w:rPr>
         <w:t>{%p endif %}</w:t>
       </w:r>
     </w:p>
     <w:p>
+      <w:pPr>
+        <w:spacing w:before="0" w:after="0"/>
+      </w:pPr>
       <w:r>
         <w:rPr>
+          <w:rFonts w:ascii="Arial" w:hAnsi="Arial" w:cs="Arial"/>
+          <w:b w:val="0"/>
+          <w:i w:val="0"/>
+          <w:color w:val="5F6368"/>
           <w:sz w:val="16"/>
         </w:rPr>
         <w:t>{%p if approval.signature_image %}</w:t>
@@ -2574,40 +2944,70 @@
     <w:p>
       <w:r>
         <w:rPr>
+          <w:rFonts w:ascii="Arial" w:hAnsi="Arial" w:cs="Arial"/>
+          <w:b w:val="0"/>
+          <w:i w:val="0"/>
+          <w:color w:val="000000"/>
           <w:sz w:val="20"/>
         </w:rPr>
         <w:t>Signature: {{ approval.signature_image }}</w:t>
       </w:r>
     </w:p>
     <w:p>
+      <w:pPr>
+        <w:spacing w:before="0" w:after="0"/>
+      </w:pPr>
       <w:r>
         <w:rPr>
+          <w:rFonts w:ascii="Arial" w:hAnsi="Arial" w:cs="Arial"/>
+          <w:b w:val="0"/>
+          <w:i w:val="0"/>
+          <w:color w:val="5F6368"/>
           <w:sz w:val="16"/>
         </w:rPr>
         <w:t>{%p endif %}</w:t>
       </w:r>
     </w:p>
     <w:p>
+      <w:pPr>
+        <w:spacing w:before="0" w:after="0"/>
+      </w:pPr>
       <w:r>
         <w:rPr>
+          <w:rFonts w:ascii="Arial" w:hAnsi="Arial" w:cs="Arial"/>
+          <w:b w:val="0"/>
+          <w:i w:val="0"/>
+          <w:color w:val="5F6368"/>
           <w:sz w:val="16"/>
         </w:rPr>
         <w:t>{%p endif %}</w:t>
       </w:r>
     </w:p>
     <w:p>
+      <w:pPr>
+        <w:spacing w:before="0" w:after="0"/>
+      </w:pPr>
       <w:r>
         <w:rPr>
+          <w:rFonts w:ascii="Arial" w:hAnsi="Arial" w:cs="Arial"/>
+          <w:b w:val="0"/>
+          <w:i w:val="0"/>
+          <w:color w:val="5F6368"/>
           <w:sz w:val="16"/>
         </w:rPr>
         <w:t>{%p if approval_history %}</w:t>
       </w:r>
     </w:p>
     <w:p>
+      <w:pPr>
+        <w:spacing w:before="160" w:after="80"/>
+      </w:pPr>
       <w:r>
         <w:rPr>
+          <w:rFonts w:ascii="Arial" w:hAnsi="Arial" w:cs="Arial"/>
           <w:b/>
           <w:i w:val="0"/>
+          <w:color w:val="000000"/>
           <w:sz w:val="22"/>
         </w:rPr>
         <w:t>Approval History</w:t>
@@ -2617,6 +3017,7 @@
       <w:tblPr>
         <w:tblW w:type="auto" w:w="0"/>
         <w:tblLook w:firstColumn="1" w:firstRow="1" w:lastColumn="0" w:lastRow="0" w:noHBand="0" w:noVBand="1" w:val="04A0"/>
+        <w:tblLayout w:type="fixed"/>
       </w:tblPr>
       <w:tblGrid>
         <w:gridCol w:w="2520"/>
@@ -2627,8 +3028,8 @@
       <w:tr>
         <w:tc>
           <w:tcPr>
-            <w:tcW w:type="dxa" w:w="2520"/>
-            <w:shd w:val="clear" w:color="auto" w:fill="1F2937"/>
+            <w:tcW w:type="dxa" w:w="1800"/>
+            <w:shd w:val="clear" w:color="auto" w:fill="E8EAED"/>
             <w:tcBorders>
               <w:top w:val="single" w:sz="4" w:color="BFBFBF"/>
               <w:left w:val="single" w:sz="4" w:color="BFBFBF"/>
@@ -2641,18 +3042,20 @@
             <w:r/>
             <w:r>
               <w:rPr>
+                <w:rFonts w:ascii="Arial" w:hAnsi="Arial" w:cs="Arial"/>
                 <w:b/>
-                <w:color w:val="FFFFFF"/>
+                <w:i w:val="0"/>
+                <w:color w:val="000000"/>
                 <w:sz w:val="20"/>
               </w:rPr>
-              <w:t>Action / Role</w:t>
+              <w:t>Action</w:t>
             </w:r>
           </w:p>
         </w:tc>
         <w:tc>
           <w:tcPr>
-            <w:tcW w:type="dxa" w:w="2520"/>
-            <w:shd w:val="clear" w:color="auto" w:fill="1F2937"/>
+            <w:tcW w:type="dxa" w:w="2600"/>
+            <w:shd w:val="clear" w:color="auto" w:fill="E8EAED"/>
             <w:tcBorders>
               <w:top w:val="single" w:sz="4" w:color="BFBFBF"/>
               <w:left w:val="single" w:sz="4" w:color="BFBFBF"/>
@@ -2665,18 +3068,20 @@
             <w:r/>
             <w:r>
               <w:rPr>
+                <w:rFonts w:ascii="Arial" w:hAnsi="Arial" w:cs="Arial"/>
                 <w:b/>
-                <w:color w:val="FFFFFF"/>
+                <w:i w:val="0"/>
+                <w:color w:val="000000"/>
                 <w:sz w:val="20"/>
               </w:rPr>
-              <w:t>Name (Print)</w:t>
+              <w:t>Name</w:t>
             </w:r>
           </w:p>
         </w:tc>
         <w:tc>
           <w:tcPr>
-            <w:tcW w:type="dxa" w:w="2520"/>
-            <w:shd w:val="clear" w:color="auto" w:fill="1F2937"/>
+            <w:tcW w:type="dxa" w:w="4000"/>
+            <w:shd w:val="clear" w:color="auto" w:fill="E8EAED"/>
             <w:tcBorders>
               <w:top w:val="single" w:sz="4" w:color="BFBFBF"/>
               <w:left w:val="single" w:sz="4" w:color="BFBFBF"/>
@@ -2689,8 +3094,10 @@
             <w:r/>
             <w:r>
               <w:rPr>
+                <w:rFonts w:ascii="Arial" w:hAnsi="Arial" w:cs="Arial"/>
                 <w:b/>
-                <w:color w:val="FFFFFF"/>
+                <w:i w:val="0"/>
+                <w:color w:val="000000"/>
                 <w:sz w:val="20"/>
               </w:rPr>
               <w:t>Signature Statement</w:t>
@@ -2699,8 +3106,8 @@
         </w:tc>
         <w:tc>
           <w:tcPr>
-            <w:tcW w:type="dxa" w:w="2520"/>
-            <w:shd w:val="clear" w:color="auto" w:fill="1F2937"/>
+            <w:tcW w:type="dxa" w:w="1600"/>
+            <w:shd w:val="clear" w:color="auto" w:fill="E8EAED"/>
             <w:tcBorders>
               <w:top w:val="single" w:sz="4" w:color="BFBFBF"/>
               <w:left w:val="single" w:sz="4" w:color="BFBFBF"/>
@@ -2713,8 +3120,10 @@
             <w:r/>
             <w:r>
               <w:rPr>
+                <w:rFonts w:ascii="Arial" w:hAnsi="Arial" w:cs="Arial"/>
                 <w:b/>
-                <w:color w:val="FFFFFF"/>
+                <w:i w:val="0"/>
+                <w:color w:val="000000"/>
                 <w:sz w:val="20"/>
               </w:rPr>
               <w:t>Date</w:t>
@@ -2725,7 +3134,7 @@
       <w:tr>
         <w:tc>
           <w:tcPr>
-            <w:tcW w:type="dxa" w:w="2520"/>
+            <w:tcW w:type="dxa" w:w="1800"/>
             <w:tcBorders>
               <w:top w:val="single" w:sz="4" w:color="BFBFBF"/>
               <w:left w:val="single" w:sz="4" w:color="BFBFBF"/>
@@ -2738,7 +3147,10 @@
             <w:r/>
             <w:r>
               <w:rPr>
+                <w:rFonts w:ascii="Arial" w:hAnsi="Arial" w:cs="Arial"/>
                 <w:b w:val="0"/>
+                <w:i w:val="0"/>
+                <w:color w:val="5F6368"/>
                 <w:sz w:val="16"/>
               </w:rPr>
               <w:t>{%tr for ev in approval_history %}</w:t>
@@ -2747,19 +3159,19 @@
         </w:tc>
         <w:tc>
           <w:tcPr>
-            <w:tcW w:type="dxa" w:w="2520"/>
+            <w:tcW w:type="dxa" w:w="2600"/>
           </w:tcPr>
           <w:p/>
         </w:tc>
         <w:tc>
           <w:tcPr>
-            <w:tcW w:type="dxa" w:w="2520"/>
+            <w:tcW w:type="dxa" w:w="4000"/>
           </w:tcPr>
           <w:p/>
         </w:tc>
         <w:tc>
           <w:tcPr>
-            <w:tcW w:type="dxa" w:w="2520"/>
+            <w:tcW w:type="dxa" w:w="1600"/>
           </w:tcPr>
           <w:p/>
         </w:tc>
@@ -2767,7 +3179,7 @@
       <w:tr>
         <w:tc>
           <w:tcPr>
-            <w:tcW w:type="dxa" w:w="2520"/>
+            <w:tcW w:type="dxa" w:w="1800"/>
             <w:tcBorders>
               <w:top w:val="single" w:sz="4" w:color="BFBFBF"/>
               <w:left w:val="single" w:sz="4" w:color="BFBFBF"/>
@@ -2780,7 +3192,10 @@
             <w:r/>
             <w:r>
               <w:rPr>
+                <w:rFonts w:ascii="Arial" w:hAnsi="Arial" w:cs="Arial"/>
                 <w:b w:val="0"/>
+                <w:i w:val="0"/>
+                <w:color w:val="000000"/>
                 <w:sz w:val="20"/>
               </w:rPr>
               <w:t>{{ ev.action }}</w:t>
@@ -2789,7 +3204,7 @@
         </w:tc>
         <w:tc>
           <w:tcPr>
-            <w:tcW w:type="dxa" w:w="2520"/>
+            <w:tcW w:type="dxa" w:w="2600"/>
             <w:tcBorders>
               <w:top w:val="single" w:sz="4" w:color="BFBFBF"/>
               <w:left w:val="single" w:sz="4" w:color="BFBFBF"/>
@@ -2802,7 +3217,10 @@
             <w:r/>
             <w:r>
               <w:rPr>
+                <w:rFonts w:ascii="Arial" w:hAnsi="Arial" w:cs="Arial"/>
                 <w:b w:val="0"/>
+                <w:i w:val="0"/>
+                <w:color w:val="000000"/>
                 <w:sz w:val="20"/>
               </w:rPr>
               <w:t>{{ ev.actor_name }}</w:t>
@@ -2811,7 +3229,7 @@
         </w:tc>
         <w:tc>
           <w:tcPr>
-            <w:tcW w:type="dxa" w:w="2520"/>
+            <w:tcW w:type="dxa" w:w="4000"/>
             <w:tcBorders>
               <w:top w:val="single" w:sz="4" w:color="BFBFBF"/>
               <w:left w:val="single" w:sz="4" w:color="BFBFBF"/>
@@ -2824,7 +3242,10 @@
             <w:r/>
             <w:r>
               <w:rPr>
+                <w:rFonts w:ascii="Arial" w:hAnsi="Arial" w:cs="Arial"/>
                 <w:b w:val="0"/>
+                <w:i w:val="0"/>
+                <w:color w:val="000000"/>
                 <w:sz w:val="18"/>
               </w:rPr>
               <w:t>{{ ev.signature_statement }}</w:t>
@@ -2833,7 +3254,7 @@
         </w:tc>
         <w:tc>
           <w:tcPr>
-            <w:tcW w:type="dxa" w:w="2520"/>
+            <w:tcW w:type="dxa" w:w="1600"/>
             <w:tcBorders>
               <w:top w:val="single" w:sz="4" w:color="BFBFBF"/>
               <w:left w:val="single" w:sz="4" w:color="BFBFBF"/>
@@ -2846,7 +3267,10 @@
             <w:r/>
             <w:r>
               <w:rPr>
+                <w:rFonts w:ascii="Arial" w:hAnsi="Arial" w:cs="Arial"/>
                 <w:b w:val="0"/>
+                <w:i w:val="0"/>
+                <w:color w:val="000000"/>
                 <w:sz w:val="18"/>
               </w:rPr>
               <w:t>{{ ev.created_at }}</w:t>
@@ -2870,7 +3294,10 @@
             <w:r/>
             <w:r>
               <w:rPr>
+                <w:rFonts w:ascii="Arial" w:hAnsi="Arial" w:cs="Arial"/>
                 <w:b w:val="0"/>
+                <w:i w:val="0"/>
+                <w:color w:val="5F6368"/>
                 <w:sz w:val="16"/>
               </w:rPr>
               <w:t>{%tr endfor %}</w:t>
@@ -2898,18 +3325,30 @@
       </w:tr>
     </w:tbl>
     <w:p>
+      <w:pPr>
+        <w:spacing w:before="0" w:after="0"/>
+      </w:pPr>
       <w:r>
         <w:rPr>
+          <w:rFonts w:ascii="Arial" w:hAnsi="Arial" w:cs="Arial"/>
+          <w:b w:val="0"/>
+          <w:i w:val="0"/>
+          <w:color w:val="5F6368"/>
           <w:sz w:val="16"/>
         </w:rPr>
         <w:t>{%p endif %}</w:t>
       </w:r>
     </w:p>
     <w:p>
+      <w:pPr>
+        <w:spacing w:before="160" w:after="80"/>
+      </w:pPr>
       <w:r>
         <w:rPr>
+          <w:rFonts w:ascii="Arial" w:hAnsi="Arial" w:cs="Arial"/>
           <w:b/>
           <w:i w:val="0"/>
+          <w:color w:val="000000"/>
           <w:sz w:val="22"/>
         </w:rPr>
         <w:t>Wet-Ink Sign-Off</w:t>
@@ -2919,6 +3358,7 @@
       <w:tblPr>
         <w:tblW w:type="auto" w:w="0"/>
         <w:tblLook w:firstColumn="1" w:firstRow="1" w:lastColumn="0" w:lastRow="0" w:noHBand="0" w:noVBand="1" w:val="04A0"/>
+        <w:tblLayout w:type="fixed"/>
       </w:tblPr>
       <w:tblGrid>
         <w:gridCol w:w="2520"/>
@@ -2929,8 +3369,8 @@
       <w:tr>
         <w:tc>
           <w:tcPr>
-            <w:tcW w:type="dxa" w:w="2520"/>
-            <w:shd w:val="clear" w:color="auto" w:fill="1F2937"/>
+            <w:tcW w:type="dxa" w:w="3000"/>
+            <w:shd w:val="clear" w:color="auto" w:fill="E8EAED"/>
             <w:tcBorders>
               <w:top w:val="single" w:sz="4" w:color="BFBFBF"/>
               <w:left w:val="single" w:sz="4" w:color="BFBFBF"/>
@@ -2943,8 +3383,10 @@
             <w:r/>
             <w:r>
               <w:rPr>
+                <w:rFonts w:ascii="Arial" w:hAnsi="Arial" w:cs="Arial"/>
                 <w:b/>
-                <w:color w:val="FFFFFF"/>
+                <w:i w:val="0"/>
+                <w:color w:val="000000"/>
                 <w:sz w:val="20"/>
               </w:rPr>
               <w:t>Role</w:t>
@@ -2953,8 +3395,8 @@
         </w:tc>
         <w:tc>
           <w:tcPr>
-            <w:tcW w:type="dxa" w:w="2520"/>
-            <w:shd w:val="clear" w:color="auto" w:fill="1F2937"/>
+            <w:tcW w:type="dxa" w:w="2600"/>
+            <w:shd w:val="clear" w:color="auto" w:fill="E8EAED"/>
             <w:tcBorders>
               <w:top w:val="single" w:sz="4" w:color="BFBFBF"/>
               <w:left w:val="single" w:sz="4" w:color="BFBFBF"/>
@@ -2967,8 +3409,10 @@
             <w:r/>
             <w:r>
               <w:rPr>
+                <w:rFonts w:ascii="Arial" w:hAnsi="Arial" w:cs="Arial"/>
                 <w:b/>
-                <w:color w:val="FFFFFF"/>
+                <w:i w:val="0"/>
+                <w:color w:val="000000"/>
                 <w:sz w:val="20"/>
               </w:rPr>
               <w:t>Name (Print)</w:t>
@@ -2977,8 +3421,8 @@
         </w:tc>
         <w:tc>
           <w:tcPr>
-            <w:tcW w:type="dxa" w:w="2520"/>
-            <w:shd w:val="clear" w:color="auto" w:fill="1F2937"/>
+            <w:tcW w:type="dxa" w:w="2600"/>
+            <w:shd w:val="clear" w:color="auto" w:fill="E8EAED"/>
             <w:tcBorders>
               <w:top w:val="single" w:sz="4" w:color="BFBFBF"/>
               <w:left w:val="single" w:sz="4" w:color="BFBFBF"/>
@@ -2991,8 +3435,10 @@
             <w:r/>
             <w:r>
               <w:rPr>
+                <w:rFonts w:ascii="Arial" w:hAnsi="Arial" w:cs="Arial"/>
                 <w:b/>
-                <w:color w:val="FFFFFF"/>
+                <w:i w:val="0"/>
+                <w:color w:val="000000"/>
                 <w:sz w:val="20"/>
               </w:rPr>
               <w:t>Signature</w:t>
@@ -3001,8 +3447,8 @@
         </w:tc>
         <w:tc>
           <w:tcPr>
-            <w:tcW w:type="dxa" w:w="2520"/>
-            <w:shd w:val="clear" w:color="auto" w:fill="1F2937"/>
+            <w:tcW w:type="dxa" w:w="1800"/>
+            <w:shd w:val="clear" w:color="auto" w:fill="E8EAED"/>
             <w:tcBorders>
               <w:top w:val="single" w:sz="4" w:color="BFBFBF"/>
               <w:left w:val="single" w:sz="4" w:color="BFBFBF"/>
@@ -3015,8 +3461,10 @@
             <w:r/>
             <w:r>
               <w:rPr>
+                <w:rFonts w:ascii="Arial" w:hAnsi="Arial" w:cs="Arial"/>
                 <w:b/>
-                <w:color w:val="FFFFFF"/>
+                <w:i w:val="0"/>
+                <w:color w:val="000000"/>
                 <w:sz w:val="20"/>
               </w:rPr>
               <w:t>Date</w:t>
@@ -3027,8 +3475,8 @@
       <w:tr>
         <w:tc>
           <w:tcPr>
-            <w:tcW w:type="dxa" w:w="2520"/>
-            <w:shd w:val="clear" w:color="auto" w:fill="F1F5F9"/>
+            <w:tcW w:type="dxa" w:w="3000"/>
+            <w:shd w:val="clear" w:color="auto" w:fill="F1F3F4"/>
             <w:tcBorders>
               <w:top w:val="single" w:sz="4" w:color="BFBFBF"/>
               <w:left w:val="single" w:sz="4" w:color="BFBFBF"/>
@@ -3041,7 +3489,10 @@
             <w:r/>
             <w:r>
               <w:rPr>
+                <w:rFonts w:ascii="Arial" w:hAnsi="Arial" w:cs="Arial"/>
                 <w:b/>
+                <w:i w:val="0"/>
+                <w:color w:val="000000"/>
                 <w:sz w:val="20"/>
               </w:rPr>
               <w:t>Lead Operator / Engineer</w:t>
@@ -3050,7 +3501,7 @@
         </w:tc>
         <w:tc>
           <w:tcPr>
-            <w:tcW w:type="dxa" w:w="2520"/>
+            <w:tcW w:type="dxa" w:w="2600"/>
             <w:tcBorders>
               <w:top w:val="single" w:sz="4" w:color="BFBFBF"/>
               <w:left w:val="single" w:sz="4" w:color="BFBFBF"/>
@@ -3063,7 +3514,10 @@
             <w:r/>
             <w:r>
               <w:rPr>
+                <w:rFonts w:ascii="Arial" w:hAnsi="Arial" w:cs="Arial"/>
                 <w:b w:val="0"/>
+                <w:i w:val="0"/>
+                <w:color w:val="000000"/>
                 <w:sz w:val="20"/>
               </w:rPr>
             </w:r>
@@ -3071,7 +3525,7 @@
         </w:tc>
         <w:tc>
           <w:tcPr>
-            <w:tcW w:type="dxa" w:w="2520"/>
+            <w:tcW w:type="dxa" w:w="2600"/>
             <w:tcBorders>
               <w:top w:val="single" w:sz="4" w:color="BFBFBF"/>
               <w:left w:val="single" w:sz="4" w:color="BFBFBF"/>
@@ -3084,7 +3538,10 @@
             <w:r/>
             <w:r>
               <w:rPr>
+                <w:rFonts w:ascii="Arial" w:hAnsi="Arial" w:cs="Arial"/>
                 <w:b w:val="0"/>
+                <w:i w:val="0"/>
+                <w:color w:val="000000"/>
                 <w:sz w:val="20"/>
               </w:rPr>
             </w:r>
@@ -3092,7 +3549,7 @@
         </w:tc>
         <w:tc>
           <w:tcPr>
-            <w:tcW w:type="dxa" w:w="2520"/>
+            <w:tcW w:type="dxa" w:w="1800"/>
             <w:tcBorders>
               <w:top w:val="single" w:sz="4" w:color="BFBFBF"/>
               <w:left w:val="single" w:sz="4" w:color="BFBFBF"/>
@@ -3105,7 +3562,10 @@
             <w:r/>
             <w:r>
               <w:rPr>
+                <w:rFonts w:ascii="Arial" w:hAnsi="Arial" w:cs="Arial"/>
                 <w:b w:val="0"/>
+                <w:i w:val="0"/>
+                <w:color w:val="000000"/>
                 <w:sz w:val="20"/>
               </w:rPr>
             </w:r>
@@ -3115,8 +3575,8 @@
       <w:tr>
         <w:tc>
           <w:tcPr>
-            <w:tcW w:type="dxa" w:w="2520"/>
-            <w:shd w:val="clear" w:color="auto" w:fill="F1F5F9"/>
+            <w:tcW w:type="dxa" w:w="3000"/>
+            <w:shd w:val="clear" w:color="auto" w:fill="F1F3F4"/>
             <w:tcBorders>
               <w:top w:val="single" w:sz="4" w:color="BFBFBF"/>
               <w:left w:val="single" w:sz="4" w:color="BFBFBF"/>
@@ -3129,7 +3589,10 @@
             <w:r/>
             <w:r>
               <w:rPr>
+                <w:rFonts w:ascii="Arial" w:hAnsi="Arial" w:cs="Arial"/>
                 <w:b/>
+                <w:i w:val="0"/>
+                <w:color w:val="000000"/>
                 <w:sz w:val="20"/>
               </w:rPr>
               <w:t>Process Development Lead</w:t>
@@ -3138,7 +3601,7 @@
         </w:tc>
         <w:tc>
           <w:tcPr>
-            <w:tcW w:type="dxa" w:w="2520"/>
+            <w:tcW w:type="dxa" w:w="2600"/>
             <w:tcBorders>
               <w:top w:val="single" w:sz="4" w:color="BFBFBF"/>
               <w:left w:val="single" w:sz="4" w:color="BFBFBF"/>
@@ -3151,7 +3614,10 @@
             <w:r/>
             <w:r>
               <w:rPr>
+                <w:rFonts w:ascii="Arial" w:hAnsi="Arial" w:cs="Arial"/>
                 <w:b w:val="0"/>
+                <w:i w:val="0"/>
+                <w:color w:val="000000"/>
                 <w:sz w:val="20"/>
               </w:rPr>
             </w:r>
@@ -3159,7 +3625,7 @@
         </w:tc>
         <w:tc>
           <w:tcPr>
-            <w:tcW w:type="dxa" w:w="2520"/>
+            <w:tcW w:type="dxa" w:w="2600"/>
             <w:tcBorders>
               <w:top w:val="single" w:sz="4" w:color="BFBFBF"/>
               <w:left w:val="single" w:sz="4" w:color="BFBFBF"/>
@@ -3172,7 +3638,10 @@
             <w:r/>
             <w:r>
               <w:rPr>
+                <w:rFonts w:ascii="Arial" w:hAnsi="Arial" w:cs="Arial"/>
                 <w:b w:val="0"/>
+                <w:i w:val="0"/>
+                <w:color w:val="000000"/>
                 <w:sz w:val="20"/>
               </w:rPr>
             </w:r>
@@ -3180,7 +3649,7 @@
         </w:tc>
         <w:tc>
           <w:tcPr>
-            <w:tcW w:type="dxa" w:w="2520"/>
+            <w:tcW w:type="dxa" w:w="1800"/>
             <w:tcBorders>
               <w:top w:val="single" w:sz="4" w:color="BFBFBF"/>
               <w:left w:val="single" w:sz="4" w:color="BFBFBF"/>
@@ -3193,7 +3662,10 @@
             <w:r/>
             <w:r>
               <w:rPr>
+                <w:rFonts w:ascii="Arial" w:hAnsi="Arial" w:cs="Arial"/>
                 <w:b w:val="0"/>
+                <w:i w:val="0"/>
+                <w:color w:val="000000"/>
                 <w:sz w:val="20"/>
               </w:rPr>
             </w:r>
@@ -3203,8 +3675,8 @@
       <w:tr>
         <w:tc>
           <w:tcPr>
-            <w:tcW w:type="dxa" w:w="2520"/>
-            <w:shd w:val="clear" w:color="auto" w:fill="F1F5F9"/>
+            <w:tcW w:type="dxa" w:w="3000"/>
+            <w:shd w:val="clear" w:color="auto" w:fill="F1F3F4"/>
             <w:tcBorders>
               <w:top w:val="single" w:sz="4" w:color="BFBFBF"/>
               <w:left w:val="single" w:sz="4" w:color="BFBFBF"/>
@@ -3217,7 +3689,10 @@
             <w:r/>
             <w:r>
               <w:rPr>
+                <w:rFonts w:ascii="Arial" w:hAnsi="Arial" w:cs="Arial"/>
                 <w:b/>
+                <w:i w:val="0"/>
+                <w:color w:val="000000"/>
                 <w:sz w:val="20"/>
               </w:rPr>
               <w:t>Quality / Compliance (if applicable)</w:t>
@@ -3226,7 +3701,7 @@
         </w:tc>
         <w:tc>
           <w:tcPr>
-            <w:tcW w:type="dxa" w:w="2520"/>
+            <w:tcW w:type="dxa" w:w="2600"/>
             <w:tcBorders>
               <w:top w:val="single" w:sz="4" w:color="BFBFBF"/>
               <w:left w:val="single" w:sz="4" w:color="BFBFBF"/>
@@ -3239,7 +3714,10 @@
             <w:r/>
             <w:r>
               <w:rPr>
+                <w:rFonts w:ascii="Arial" w:hAnsi="Arial" w:cs="Arial"/>
                 <w:b w:val="0"/>
+                <w:i w:val="0"/>
+                <w:color w:val="000000"/>
                 <w:sz w:val="20"/>
               </w:rPr>
             </w:r>
@@ -3247,7 +3725,7 @@
         </w:tc>
         <w:tc>
           <w:tcPr>
-            <w:tcW w:type="dxa" w:w="2520"/>
+            <w:tcW w:type="dxa" w:w="2600"/>
             <w:tcBorders>
               <w:top w:val="single" w:sz="4" w:color="BFBFBF"/>
               <w:left w:val="single" w:sz="4" w:color="BFBFBF"/>
@@ -3260,7 +3738,10 @@
             <w:r/>
             <w:r>
               <w:rPr>
+                <w:rFonts w:ascii="Arial" w:hAnsi="Arial" w:cs="Arial"/>
                 <w:b w:val="0"/>
+                <w:i w:val="0"/>
+                <w:color w:val="000000"/>
                 <w:sz w:val="20"/>
               </w:rPr>
             </w:r>
@@ -3268,7 +3749,7 @@
         </w:tc>
         <w:tc>
           <w:tcPr>
-            <w:tcW w:type="dxa" w:w="2520"/>
+            <w:tcW w:type="dxa" w:w="1800"/>
             <w:tcBorders>
               <w:top w:val="single" w:sz="4" w:color="BFBFBF"/>
               <w:left w:val="single" w:sz="4" w:color="BFBFBF"/>
@@ -3281,7 +3762,10 @@
             <w:r/>
             <w:r>
               <w:rPr>
+                <w:rFonts w:ascii="Arial" w:hAnsi="Arial" w:cs="Arial"/>
                 <w:b w:val="0"/>
+                <w:i w:val="0"/>
+                <w:color w:val="000000"/>
                 <w:sz w:val="20"/>
               </w:rPr>
             </w:r>
@@ -3290,82 +3774,127 @@
       </w:tr>
     </w:tbl>
     <w:p>
+      <w:pPr>
+        <w:spacing w:before="0" w:after="0"/>
+      </w:pPr>
       <w:r>
         <w:rPr>
+          <w:rFonts w:ascii="Arial" w:hAnsi="Arial" w:cs="Arial"/>
+          <w:b w:val="0"/>
+          <w:i w:val="0"/>
+          <w:color w:val="5F6368"/>
           <w:sz w:val="16"/>
         </w:rPr>
         <w:t>{%p if figures %}</w:t>
       </w:r>
     </w:p>
     <w:p>
+      <w:pPr>
+        <w:keepNext/>
+        <w:spacing w:before="280" w:after="80"/>
+      </w:pPr>
+      <w:r>
+        <w:br w:type="page"/>
+      </w:r>
       <w:r>
         <w:rPr>
-          <w:b w:val="0"/>
+          <w:rFonts w:ascii="Arial" w:hAnsi="Arial" w:cs="Arial"/>
+          <w:b/>
           <w:i w:val="0"/>
-          <w:sz w:val="20"/>
-        </w:rPr>
-        <w:t>{{r page_break }}</w:t>
-      </w:r>
-    </w:p>
-    <w:p>
-      <w:pPr>
-        <w:spacing w:before="240" w:after="80"/>
-      </w:pPr>
-      <w:r>
-        <w:rPr>
-          <w:b/>
-          <w:color w:val="1F2937"/>
-          <w:sz w:val="28"/>
+          <w:color w:val="000000"/>
+          <w:sz w:val="26"/>
         </w:rPr>
         <w:t>Appendix A: Figures</w:t>
       </w:r>
     </w:p>
     <w:p>
+      <w:pPr>
+        <w:spacing w:before="0" w:after="0"/>
+      </w:pPr>
       <w:r>
         <w:rPr>
+          <w:rFonts w:ascii="Arial" w:hAnsi="Arial" w:cs="Arial"/>
+          <w:b w:val="0"/>
+          <w:i w:val="0"/>
+          <w:color w:val="5F6368"/>
           <w:sz w:val="16"/>
         </w:rPr>
         <w:t>{%p for fig in figures %}</w:t>
       </w:r>
     </w:p>
     <w:p>
+      <w:pPr>
+        <w:keepNext/>
+        <w:spacing w:before="120" w:after="40"/>
+        <w:jc w:val="center"/>
+      </w:pPr>
       <w:r>
         <w:rPr>
+          <w:rFonts w:ascii="Arial" w:hAnsi="Arial" w:cs="Arial"/>
+          <w:b w:val="0"/>
+          <w:i w:val="0"/>
+          <w:color w:val="000000"/>
           <w:sz w:val="20"/>
         </w:rPr>
         <w:t>{{ fig.image }}</w:t>
       </w:r>
     </w:p>
     <w:p>
+      <w:pPr>
+        <w:spacing w:after="160"/>
+        <w:jc w:val="center"/>
+      </w:pPr>
       <w:r>
         <w:rPr>
+          <w:rFonts w:ascii="Arial" w:hAnsi="Arial" w:cs="Arial"/>
           <w:b w:val="0"/>
           <w:i/>
-          <w:color w:val="475569"/>
+          <w:color w:val="5F6368"/>
           <w:sz w:val="18"/>
         </w:rPr>
         <w:t>Figure {{ fig.number }}: {{ fig.filename }}  ({{ fig.step_name }}, uploaded {{ fig.uploaded_at }})</w:t>
       </w:r>
     </w:p>
     <w:p>
+      <w:pPr>
+        <w:spacing w:before="0" w:after="0"/>
+      </w:pPr>
       <w:r>
         <w:rPr>
+          <w:rFonts w:ascii="Arial" w:hAnsi="Arial" w:cs="Arial"/>
+          <w:b w:val="0"/>
+          <w:i w:val="0"/>
+          <w:color w:val="5F6368"/>
           <w:sz w:val="16"/>
         </w:rPr>
         <w:t>{%p endfor %}</w:t>
       </w:r>
     </w:p>
     <w:p>
+      <w:pPr>
+        <w:spacing w:before="0" w:after="0"/>
+      </w:pPr>
       <w:r>
         <w:rPr>
+          <w:rFonts w:ascii="Arial" w:hAnsi="Arial" w:cs="Arial"/>
+          <w:b w:val="0"/>
+          <w:i w:val="0"/>
+          <w:color w:val="5F6368"/>
           <w:sz w:val="16"/>
         </w:rPr>
         <w:t>{%p endif %}</w:t>
       </w:r>
     </w:p>
     <w:p>
+      <w:pPr>
+        <w:spacing w:before="0" w:after="0"/>
+      </w:pPr>
       <w:r>
         <w:rPr>
+          <w:rFonts w:ascii="Arial" w:hAnsi="Arial" w:cs="Arial"/>
+          <w:b w:val="0"/>
+          <w:i w:val="0"/>
+          <w:color w:val="5F6368"/>
           <w:sz w:val="16"/>
         </w:rPr>
         <w:t>{%p if non_image_attachments %}</w:t>
@@ -3373,13 +3902,19 @@
     </w:p>
     <w:p>
       <w:pPr>
-        <w:spacing w:before="240" w:after="80"/>
+        <w:keepNext/>
+        <w:spacing w:before="280" w:after="80"/>
       </w:pPr>
       <w:r>
+        <w:br w:type="page"/>
+      </w:r>
+      <w:r>
         <w:rPr>
+          <w:rFonts w:ascii="Arial" w:hAnsi="Arial" w:cs="Arial"/>
           <w:b/>
-          <w:color w:val="1F2937"/>
-          <w:sz w:val="28"/>
+          <w:i w:val="0"/>
+          <w:color w:val="000000"/>
+          <w:sz w:val="26"/>
         </w:rPr>
         <w:t>Appendix B: Attachments</w:t>
       </w:r>
@@ -3388,6 +3923,7 @@
       <w:tblPr>
         <w:tblW w:type="auto" w:w="0"/>
         <w:tblLook w:firstColumn="1" w:firstRow="1" w:lastColumn="0" w:lastRow="0" w:noHBand="0" w:noVBand="1" w:val="04A0"/>
+        <w:tblLayout w:type="fixed"/>
       </w:tblPr>
       <w:tblGrid>
         <w:gridCol w:w="2520"/>
@@ -3398,8 +3934,8 @@
       <w:tr>
         <w:tc>
           <w:tcPr>
-            <w:tcW w:type="dxa" w:w="2520"/>
-            <w:shd w:val="clear" w:color="auto" w:fill="1F2937"/>
+            <w:tcW w:type="dxa" w:w="3600"/>
+            <w:shd w:val="clear" w:color="auto" w:fill="E8EAED"/>
             <w:tcBorders>
               <w:top w:val="single" w:sz="4" w:color="BFBFBF"/>
               <w:left w:val="single" w:sz="4" w:color="BFBFBF"/>
@@ -3412,8 +3948,10 @@
             <w:r/>
             <w:r>
               <w:rPr>
+                <w:rFonts w:ascii="Arial" w:hAnsi="Arial" w:cs="Arial"/>
                 <w:b/>
-                <w:color w:val="FFFFFF"/>
+                <w:i w:val="0"/>
+                <w:color w:val="000000"/>
                 <w:sz w:val="20"/>
               </w:rPr>
               <w:t>Filename</w:t>
@@ -3422,8 +3960,8 @@
         </w:tc>
         <w:tc>
           <w:tcPr>
-            <w:tcW w:type="dxa" w:w="2520"/>
-            <w:shd w:val="clear" w:color="auto" w:fill="1F2937"/>
+            <w:tcW w:type="dxa" w:w="1800"/>
+            <w:shd w:val="clear" w:color="auto" w:fill="E8EAED"/>
             <w:tcBorders>
               <w:top w:val="single" w:sz="4" w:color="BFBFBF"/>
               <w:left w:val="single" w:sz="4" w:color="BFBFBF"/>
@@ -3436,8 +3974,10 @@
             <w:r/>
             <w:r>
               <w:rPr>
+                <w:rFonts w:ascii="Arial" w:hAnsi="Arial" w:cs="Arial"/>
                 <w:b/>
-                <w:color w:val="FFFFFF"/>
+                <w:i w:val="0"/>
+                <w:color w:val="000000"/>
                 <w:sz w:val="20"/>
               </w:rPr>
               <w:t>Type</w:t>
@@ -3446,8 +3986,8 @@
         </w:tc>
         <w:tc>
           <w:tcPr>
-            <w:tcW w:type="dxa" w:w="2520"/>
-            <w:shd w:val="clear" w:color="auto" w:fill="1F2937"/>
+            <w:tcW w:type="dxa" w:w="2600"/>
+            <w:shd w:val="clear" w:color="auto" w:fill="E8EAED"/>
             <w:tcBorders>
               <w:top w:val="single" w:sz="4" w:color="BFBFBF"/>
               <w:left w:val="single" w:sz="4" w:color="BFBFBF"/>
@@ -3460,8 +4000,10 @@
             <w:r/>
             <w:r>
               <w:rPr>
+                <w:rFonts w:ascii="Arial" w:hAnsi="Arial" w:cs="Arial"/>
                 <w:b/>
-                <w:color w:val="FFFFFF"/>
+                <w:i w:val="0"/>
+                <w:color w:val="000000"/>
                 <w:sz w:val="20"/>
               </w:rPr>
               <w:t>Scope</w:t>
@@ -3470,8 +4012,8 @@
         </w:tc>
         <w:tc>
           <w:tcPr>
-            <w:tcW w:type="dxa" w:w="2520"/>
-            <w:shd w:val="clear" w:color="auto" w:fill="1F2937"/>
+            <w:tcW w:type="dxa" w:w="2000"/>
+            <w:shd w:val="clear" w:color="auto" w:fill="E8EAED"/>
             <w:tcBorders>
               <w:top w:val="single" w:sz="4" w:color="BFBFBF"/>
               <w:left w:val="single" w:sz="4" w:color="BFBFBF"/>
@@ -3484,8 +4026,10 @@
             <w:r/>
             <w:r>
               <w:rPr>
+                <w:rFonts w:ascii="Arial" w:hAnsi="Arial" w:cs="Arial"/>
                 <w:b/>
-                <w:color w:val="FFFFFF"/>
+                <w:i w:val="0"/>
+                <w:color w:val="000000"/>
                 <w:sz w:val="20"/>
               </w:rPr>
               <w:t>Uploaded</w:t>
@@ -3496,7 +4040,7 @@
       <w:tr>
         <w:tc>
           <w:tcPr>
-            <w:tcW w:type="dxa" w:w="2520"/>
+            <w:tcW w:type="dxa" w:w="3600"/>
             <w:tcBorders>
               <w:top w:val="single" w:sz="4" w:color="BFBFBF"/>
               <w:left w:val="single" w:sz="4" w:color="BFBFBF"/>
@@ -3509,7 +4053,10 @@
             <w:r/>
             <w:r>
               <w:rPr>
+                <w:rFonts w:ascii="Arial" w:hAnsi="Arial" w:cs="Arial"/>
                 <w:b w:val="0"/>
+                <w:i w:val="0"/>
+                <w:color w:val="5F6368"/>
                 <w:sz w:val="16"/>
               </w:rPr>
               <w:t>{%tr for att in non_image_attachments %}</w:t>
@@ -3518,19 +4065,19 @@
         </w:tc>
         <w:tc>
           <w:tcPr>
-            <w:tcW w:type="dxa" w:w="2520"/>
+            <w:tcW w:type="dxa" w:w="1800"/>
           </w:tcPr>
           <w:p/>
         </w:tc>
         <w:tc>
           <w:tcPr>
-            <w:tcW w:type="dxa" w:w="2520"/>
+            <w:tcW w:type="dxa" w:w="2600"/>
           </w:tcPr>
           <w:p/>
         </w:tc>
         <w:tc>
           <w:tcPr>
-            <w:tcW w:type="dxa" w:w="2520"/>
+            <w:tcW w:type="dxa" w:w="2000"/>
           </w:tcPr>
           <w:p/>
         </w:tc>
@@ -3538,7 +4085,7 @@
       <w:tr>
         <w:tc>
           <w:tcPr>
-            <w:tcW w:type="dxa" w:w="2520"/>
+            <w:tcW w:type="dxa" w:w="3600"/>
             <w:tcBorders>
               <w:top w:val="single" w:sz="4" w:color="BFBFBF"/>
               <w:left w:val="single" w:sz="4" w:color="BFBFBF"/>
@@ -3551,7 +4098,10 @@
             <w:r/>
             <w:r>
               <w:rPr>
+                <w:rFonts w:ascii="Arial" w:hAnsi="Arial" w:cs="Arial"/>
                 <w:b w:val="0"/>
+                <w:i w:val="0"/>
+                <w:color w:val="000000"/>
                 <w:sz w:val="20"/>
               </w:rPr>
               <w:t>{{ att.filename }}</w:t>
@@ -3560,7 +4110,7 @@
         </w:tc>
         <w:tc>
           <w:tcPr>
-            <w:tcW w:type="dxa" w:w="2520"/>
+            <w:tcW w:type="dxa" w:w="1800"/>
             <w:tcBorders>
               <w:top w:val="single" w:sz="4" w:color="BFBFBF"/>
               <w:left w:val="single" w:sz="4" w:color="BFBFBF"/>
@@ -3573,7 +4123,10 @@
             <w:r/>
             <w:r>
               <w:rPr>
+                <w:rFonts w:ascii="Arial" w:hAnsi="Arial" w:cs="Arial"/>
                 <w:b w:val="0"/>
+                <w:i w:val="0"/>
+                <w:color w:val="000000"/>
                 <w:sz w:val="20"/>
               </w:rPr>
               <w:t>{{ att.type }}</w:t>
@@ -3582,7 +4135,7 @@
         </w:tc>
         <w:tc>
           <w:tcPr>
-            <w:tcW w:type="dxa" w:w="2520"/>
+            <w:tcW w:type="dxa" w:w="2600"/>
             <w:tcBorders>
               <w:top w:val="single" w:sz="4" w:color="BFBFBF"/>
               <w:left w:val="single" w:sz="4" w:color="BFBFBF"/>
@@ -3595,7 +4148,10 @@
             <w:r/>
             <w:r>
               <w:rPr>
+                <w:rFonts w:ascii="Arial" w:hAnsi="Arial" w:cs="Arial"/>
                 <w:b w:val="0"/>
+                <w:i w:val="0"/>
+                <w:color w:val="000000"/>
                 <w:sz w:val="20"/>
               </w:rPr>
               <w:t>{{ att.scope }}</w:t>
@@ -3604,7 +4160,7 @@
         </w:tc>
         <w:tc>
           <w:tcPr>
-            <w:tcW w:type="dxa" w:w="2520"/>
+            <w:tcW w:type="dxa" w:w="2000"/>
             <w:tcBorders>
               <w:top w:val="single" w:sz="4" w:color="BFBFBF"/>
               <w:left w:val="single" w:sz="4" w:color="BFBFBF"/>
@@ -3617,7 +4173,10 @@
             <w:r/>
             <w:r>
               <w:rPr>
+                <w:rFonts w:ascii="Arial" w:hAnsi="Arial" w:cs="Arial"/>
                 <w:b w:val="0"/>
+                <w:i w:val="0"/>
+                <w:color w:val="000000"/>
                 <w:sz w:val="20"/>
               </w:rPr>
               <w:t>{{ att.uploaded_at }}</w:t>
@@ -3641,7 +4200,10 @@
             <w:r/>
             <w:r>
               <w:rPr>
+                <w:rFonts w:ascii="Arial" w:hAnsi="Arial" w:cs="Arial"/>
                 <w:b w:val="0"/>
+                <w:i w:val="0"/>
+                <w:color w:val="5F6368"/>
                 <w:sz w:val="16"/>
               </w:rPr>
               <w:t>{%tr endfor %}</w:t>
@@ -3669,8 +4231,15 @@
       </w:tr>
     </w:tbl>
     <w:p>
+      <w:pPr>
+        <w:spacing w:before="0" w:after="0"/>
+      </w:pPr>
       <w:r>
         <w:rPr>
+          <w:rFonts w:ascii="Arial" w:hAnsi="Arial" w:cs="Arial"/>
+          <w:b w:val="0"/>
+          <w:i w:val="0"/>
+          <w:color w:val="5F6368"/>
           <w:sz w:val="16"/>
         </w:rPr>
         <w:t>{%p endif %}</w:t>
@@ -3678,7 +4247,7 @@
     </w:p>
     <w:sectPr>
       <w:pgSz w:w="12240" w:h="15840"/>
-      <w:pgMar w:top="720" w:right="1080" w:bottom="720" w:left="1080" w:header="720" w:footer="720" w:gutter="0"/>
+      <w:pgMar w:top="1080" w:right="1080" w:bottom="1080" w:left="1080" w:header="720" w:footer="720" w:gutter="0"/>
       <w:cols w:space="720"/>
       <w:docGrid w:linePitch="360"/>
     </w:sectPr>
@@ -4049,6 +4618,11 @@
     <w:name w:val="Normal"/>
     <w:qFormat/>
     <w:rsid w:val="00FC693F"/>
+    <w:rPr>
+      <w:rFonts w:ascii="Arial" w:hAnsi="Arial"/>
+      <w:color w:val="000000"/>
+      <w:sz w:val="20"/>
+    </w:rPr>
   </w:style>
   <w:style w:type="paragraph" w:styleId="Header">
     <w:name w:val="header"/>

</xml_diff>